<commit_message>
Fix file path to correct filename with dashes and percent sign
Updated FILE_PATH to m1-DNA-HACAT1-20ng-AgSiNW_532nm_600gr_BC200_
50XLF_05s_4a_2-5%_5ul_drop-center.l6m and rebuilt Word doc.

https://claude.ai/code/session_01MMZZNNZ37d4FGiNKUpmbH2
</commit_message>
<xml_diff>
--- a/Raman_Analysis_Code_and_Explanation.docx
+++ b/Raman_Analysis_Code_and_Explanation.docx
@@ -25,7 +25,7 @@
           <w:color w:val="404040"/>
           <w:sz w:val="20"/>
         </w:rPr>
-        <w:t>raman_analysis.py  |  Copy the code below and paste into PyCharm</w:t>
+        <w:t>raman_analysis.py  |  Copy Section 2 and paste into PyCharm</w:t>
       </w:r>
     </w:p>
     <w:p/>
@@ -43,7 +43,7 @@
     </w:p>
     <w:p>
       <w:pPr>
-        <w:spacing w:after="80" w:before="40"/>
+        <w:spacing w:after="80"/>
       </w:pPr>
       <w:r>
         <w:rPr>
@@ -54,30 +54,30 @@
     </w:p>
     <w:p>
       <w:pPr>
-        <w:spacing w:after="80" w:before="40"/>
+        <w:spacing w:after="80"/>
       </w:pPr>
       <w:r>
         <w:rPr>
           <w:sz w:val="22"/>
         </w:rPr>
-        <w:t>Step 2 — Copy the entire code block in Section 2 and paste it into that file.</w:t>
-      </w:r>
-    </w:p>
-    <w:p>
-      <w:pPr>
-        <w:spacing w:after="80" w:before="40"/>
+        <w:t>Step 2 — Copy ALL the grey lines in Section 2 and paste into that file.</w:t>
+      </w:r>
+    </w:p>
+    <w:p>
+      <w:pPr>
+        <w:spacing w:after="80"/>
       </w:pPr>
       <w:r>
         <w:rPr>
           <w:sz w:val="22"/>
         </w:rPr>
-        <w:t>Step 3 — Install the required libraries once (paste in the PyCharm terminal):</w:t>
-      </w:r>
-    </w:p>
-    <w:p>
-      <w:pPr>
-        <w:spacing w:before="0" w:after="0"/>
-        <w:ind w:left="283" w:right="283"/>
+        <w:t>Step 3 — Install libraries once (paste in the PyCharm terminal):</w:t>
+      </w:r>
+    </w:p>
+    <w:p>
+      <w:pPr>
+        <w:spacing w:before="0" w:after="0"/>
+        <w:ind w:left="227" w:right="227"/>
         <w:shd w:val="clear" w:color="auto" w:fill="F0F0F0"/>
       </w:pPr>
       <w:r>
@@ -92,13 +92,13 @@
     <w:p/>
     <w:p>
       <w:pPr>
-        <w:spacing w:after="80" w:before="40"/>
+        <w:spacing w:after="80"/>
       </w:pPr>
       <w:r>
         <w:rPr>
           <w:sz w:val="22"/>
         </w:rPr>
-        <w:t>Step 4 — The FILE_PATH variable at the top of the code is already set to your path. Press ▶ Run.</w:t>
+        <w:t>Step 4 — The file path is already set correctly. Press ▶ Run.</w:t>
       </w:r>
     </w:p>
     <w:p/>
@@ -111,25 +111,34 @@
           <w:b/>
           <w:color w:val="1F4E79"/>
         </w:rPr>
-        <w:t>2.  Full Code  (copy everything below this line)</w:t>
-      </w:r>
-    </w:p>
-    <w:p>
-      <w:pPr>
-        <w:spacing w:after="80" w:before="40"/>
-      </w:pPr>
-      <w:r>
-        <w:rPr>
-          <w:sz w:val="22"/>
-        </w:rPr>
-        <w:t>Select all the grey lines below, copy, and paste into PyCharm.</w:t>
+        <w:t>2.  Full Code  ←  Copy everything in grey</w:t>
+      </w:r>
+    </w:p>
+    <w:p>
+      <w:pPr>
+        <w:shd w:val="clear" w:color="auto" w:fill="FFF2CC"/>
+      </w:pPr>
+      <w:r>
+        <w:rPr>
+          <w:b/>
+          <w:sz w:val="20"/>
+        </w:rPr>
+        <w:t xml:space="preserve">File path set to:  </w:t>
+      </w:r>
+      <w:r>
+        <w:rPr>
+          <w:rFonts w:ascii="Courier New" w:hAnsi="Courier New"/>
+          <w:color w:val="7B3606"/>
+          <w:sz w:val="18"/>
+        </w:rPr>
+        <w:t>C:\Users\Hira Aman\Desktop\RAMAN MAP 1\m1-DNA-HACAT1-20ng-AgSiNW_532nm_600gr_BC200_50XLF_05s_4a_2-5%_5ul_drop-center.l6m</w:t>
       </w:r>
     </w:p>
     <w:p/>
     <w:p>
       <w:pPr>
         <w:spacing w:before="0" w:after="0"/>
-        <w:ind w:left="283" w:right="283"/>
+        <w:ind w:left="227" w:right="227"/>
         <w:shd w:val="clear" w:color="auto" w:fill="F0F0F0"/>
       </w:pPr>
       <w:r>
@@ -144,7 +153,7 @@
     <w:p>
       <w:pPr>
         <w:spacing w:before="0" w:after="0"/>
-        <w:ind w:left="283" w:right="283"/>
+        <w:ind w:left="227" w:right="227"/>
         <w:shd w:val="clear" w:color="auto" w:fill="F0F0F0"/>
       </w:pPr>
       <w:r>
@@ -159,7 +168,7 @@
     <w:p>
       <w:pPr>
         <w:spacing w:before="0" w:after="0"/>
-        <w:ind w:left="283" w:right="283"/>
+        <w:ind w:left="227" w:right="227"/>
         <w:shd w:val="clear" w:color="auto" w:fill="F0F0F0"/>
       </w:pPr>
       <w:r>
@@ -174,7 +183,7 @@
     <w:p>
       <w:pPr>
         <w:spacing w:before="0" w:after="0"/>
-        <w:ind w:left="283" w:right="283"/>
+        <w:ind w:left="227" w:right="227"/>
         <w:shd w:val="clear" w:color="auto" w:fill="F0F0F0"/>
       </w:pPr>
       <w:r>
@@ -189,7 +198,7 @@
     <w:p>
       <w:pPr>
         <w:spacing w:before="0" w:after="0"/>
-        <w:ind w:left="283" w:right="283"/>
+        <w:ind w:left="227" w:right="227"/>
         <w:shd w:val="clear" w:color="auto" w:fill="F0F0F0"/>
       </w:pPr>
       <w:r>
@@ -204,7 +213,7 @@
     <w:p>
       <w:pPr>
         <w:spacing w:before="0" w:after="0"/>
-        <w:ind w:left="283" w:right="283"/>
+        <w:ind w:left="227" w:right="227"/>
         <w:shd w:val="clear" w:color="auto" w:fill="F0F0F0"/>
       </w:pPr>
       <w:r>
@@ -219,7 +228,7 @@
     <w:p>
       <w:pPr>
         <w:spacing w:before="0" w:after="0"/>
-        <w:ind w:left="283" w:right="283"/>
+        <w:ind w:left="227" w:right="227"/>
         <w:shd w:val="clear" w:color="auto" w:fill="F0F0F0"/>
       </w:pPr>
       <w:r>
@@ -234,7 +243,7 @@
     <w:p>
       <w:pPr>
         <w:spacing w:before="0" w:after="0"/>
-        <w:ind w:left="283" w:right="283"/>
+        <w:ind w:left="227" w:right="227"/>
         <w:shd w:val="clear" w:color="auto" w:fill="F0F0F0"/>
       </w:pPr>
       <w:r>
@@ -249,7 +258,7 @@
     <w:p>
       <w:pPr>
         <w:spacing w:before="0" w:after="0"/>
-        <w:ind w:left="283" w:right="283"/>
+        <w:ind w:left="227" w:right="227"/>
         <w:shd w:val="clear" w:color="auto" w:fill="F0F0F0"/>
       </w:pPr>
       <w:r>
@@ -264,7 +273,7 @@
     <w:p>
       <w:pPr>
         <w:spacing w:before="0" w:after="0"/>
-        <w:ind w:left="283" w:right="283"/>
+        <w:ind w:left="227" w:right="227"/>
         <w:shd w:val="clear" w:color="auto" w:fill="F0F0F0"/>
       </w:pPr>
       <w:r>
@@ -279,7 +288,7 @@
     <w:p>
       <w:pPr>
         <w:spacing w:before="0" w:after="0"/>
-        <w:ind w:left="283" w:right="283"/>
+        <w:ind w:left="227" w:right="227"/>
         <w:shd w:val="clear" w:color="auto" w:fill="F0F0F0"/>
       </w:pPr>
       <w:r>
@@ -294,7 +303,7 @@
     <w:p>
       <w:pPr>
         <w:spacing w:before="0" w:after="0"/>
-        <w:ind w:left="283" w:right="283"/>
+        <w:ind w:left="227" w:right="227"/>
         <w:shd w:val="clear" w:color="auto" w:fill="F0F0F0"/>
       </w:pPr>
       <w:r>
@@ -309,7 +318,7 @@
     <w:p>
       <w:pPr>
         <w:spacing w:before="0" w:after="0"/>
-        <w:ind w:left="283" w:right="283"/>
+        <w:ind w:left="227" w:right="227"/>
         <w:shd w:val="clear" w:color="auto" w:fill="F0F0F0"/>
       </w:pPr>
       <w:r>
@@ -324,7 +333,7 @@
     <w:p>
       <w:pPr>
         <w:spacing w:before="0" w:after="0"/>
-        <w:ind w:left="283" w:right="283"/>
+        <w:ind w:left="227" w:right="227"/>
         <w:shd w:val="clear" w:color="auto" w:fill="F0F0F0"/>
       </w:pPr>
       <w:r>
@@ -339,7 +348,7 @@
     <w:p>
       <w:pPr>
         <w:spacing w:before="0" w:after="0"/>
-        <w:ind w:left="283" w:right="283"/>
+        <w:ind w:left="227" w:right="227"/>
         <w:shd w:val="clear" w:color="auto" w:fill="F0F0F0"/>
       </w:pPr>
       <w:r>
@@ -354,7 +363,7 @@
     <w:p>
       <w:pPr>
         <w:spacing w:before="0" w:after="0"/>
-        <w:ind w:left="283" w:right="283"/>
+        <w:ind w:left="227" w:right="227"/>
         <w:shd w:val="clear" w:color="auto" w:fill="F0F0F0"/>
       </w:pPr>
       <w:r>
@@ -369,7 +378,7 @@
     <w:p>
       <w:pPr>
         <w:spacing w:before="0" w:after="0"/>
-        <w:ind w:left="283" w:right="283"/>
+        <w:ind w:left="227" w:right="227"/>
         <w:shd w:val="clear" w:color="auto" w:fill="F0F0F0"/>
       </w:pPr>
       <w:r>
@@ -384,7 +393,7 @@
     <w:p>
       <w:pPr>
         <w:spacing w:before="0" w:after="0"/>
-        <w:ind w:left="283" w:right="283"/>
+        <w:ind w:left="227" w:right="227"/>
         <w:shd w:val="clear" w:color="auto" w:fill="F0F0F0"/>
       </w:pPr>
       <w:r>
@@ -399,7 +408,7 @@
     <w:p>
       <w:pPr>
         <w:spacing w:before="0" w:after="0"/>
-        <w:ind w:left="283" w:right="283"/>
+        <w:ind w:left="227" w:right="227"/>
         <w:shd w:val="clear" w:color="auto" w:fill="F0F0F0"/>
       </w:pPr>
       <w:r>
@@ -414,7 +423,7 @@
     <w:p>
       <w:pPr>
         <w:spacing w:before="0" w:after="0"/>
-        <w:ind w:left="283" w:right="283"/>
+        <w:ind w:left="227" w:right="227"/>
         <w:shd w:val="clear" w:color="auto" w:fill="F0F0F0"/>
       </w:pPr>
       <w:r>
@@ -429,7 +438,7 @@
     <w:p>
       <w:pPr>
         <w:spacing w:before="0" w:after="0"/>
-        <w:ind w:left="283" w:right="283"/>
+        <w:ind w:left="227" w:right="227"/>
         <w:shd w:val="clear" w:color="auto" w:fill="F0F0F0"/>
       </w:pPr>
       <w:r>
@@ -444,7 +453,7 @@
     <w:p>
       <w:pPr>
         <w:spacing w:before="0" w:after="0"/>
-        <w:ind w:left="283" w:right="283"/>
+        <w:ind w:left="227" w:right="227"/>
         <w:shd w:val="clear" w:color="auto" w:fill="F0F0F0"/>
       </w:pPr>
       <w:r>
@@ -459,7 +468,7 @@
     <w:p>
       <w:pPr>
         <w:spacing w:before="0" w:after="0"/>
-        <w:ind w:left="283" w:right="283"/>
+        <w:ind w:left="227" w:right="227"/>
         <w:shd w:val="clear" w:color="auto" w:fill="F0F0F0"/>
       </w:pPr>
       <w:r>
@@ -474,7 +483,7 @@
     <w:p>
       <w:pPr>
         <w:spacing w:before="0" w:after="0"/>
-        <w:ind w:left="283" w:right="283"/>
+        <w:ind w:left="227" w:right="227"/>
         <w:shd w:val="clear" w:color="auto" w:fill="F0F0F0"/>
       </w:pPr>
       <w:r>
@@ -489,7 +498,7 @@
     <w:p>
       <w:pPr>
         <w:spacing w:before="0" w:after="0"/>
-        <w:ind w:left="283" w:right="283"/>
+        <w:ind w:left="227" w:right="227"/>
         <w:shd w:val="clear" w:color="auto" w:fill="F0F0F0"/>
       </w:pPr>
       <w:r>
@@ -504,7 +513,7 @@
     <w:p>
       <w:pPr>
         <w:spacing w:before="0" w:after="0"/>
-        <w:ind w:left="283" w:right="283"/>
+        <w:ind w:left="227" w:right="227"/>
         <w:shd w:val="clear" w:color="auto" w:fill="F0F0F0"/>
       </w:pPr>
       <w:r>
@@ -519,7 +528,7 @@
     <w:p>
       <w:pPr>
         <w:spacing w:before="0" w:after="0"/>
-        <w:ind w:left="283" w:right="283"/>
+        <w:ind w:left="227" w:right="227"/>
         <w:shd w:val="clear" w:color="auto" w:fill="F0F0F0"/>
       </w:pPr>
       <w:r>
@@ -534,7 +543,7 @@
     <w:p>
       <w:pPr>
         <w:spacing w:before="0" w:after="0"/>
-        <w:ind w:left="283" w:right="283"/>
+        <w:ind w:left="227" w:right="227"/>
         <w:shd w:val="clear" w:color="auto" w:fill="F0F0F0"/>
       </w:pPr>
       <w:r>
@@ -549,7 +558,7 @@
     <w:p>
       <w:pPr>
         <w:spacing w:before="0" w:after="0"/>
-        <w:ind w:left="283" w:right="283"/>
+        <w:ind w:left="227" w:right="227"/>
         <w:shd w:val="clear" w:color="auto" w:fill="F0F0F0"/>
       </w:pPr>
       <w:r>
@@ -564,22 +573,22 @@
     <w:p>
       <w:pPr>
         <w:spacing w:before="0" w:after="0"/>
-        <w:ind w:left="283" w:right="283"/>
-        <w:shd w:val="clear" w:color="auto" w:fill="F0F0F0"/>
-      </w:pPr>
-      <w:r>
-        <w:rPr>
-          <w:rFonts w:ascii="Courier New" w:hAnsi="Courier New"/>
-          <w:color w:val="1A1A1A"/>
-          <w:sz w:val="17"/>
-        </w:rPr>
-        <w:t xml:space="preserve">    r"\m1DNAHACAT120ngAgSiNW_532nm_600gr_BC200_50XLF_05s_4a_25_5ul_dropcenter.l6m"</w:t>
-      </w:r>
-    </w:p>
-    <w:p>
-      <w:pPr>
-        <w:spacing w:before="0" w:after="0"/>
-        <w:ind w:left="283" w:right="283"/>
+        <w:ind w:left="227" w:right="227"/>
+        <w:shd w:val="clear" w:color="auto" w:fill="F0F0F0"/>
+      </w:pPr>
+      <w:r>
+        <w:rPr>
+          <w:rFonts w:ascii="Courier New" w:hAnsi="Courier New"/>
+          <w:color w:val="1A1A1A"/>
+          <w:sz w:val="17"/>
+        </w:rPr>
+        <w:t xml:space="preserve">    r"\m1-DNA-HACAT1-20ng-AgSiNW_532nm_600gr_BC200_50XLF_05s_4a_2-5%_5ul_drop-center.l6m"</w:t>
+      </w:r>
+    </w:p>
+    <w:p>
+      <w:pPr>
+        <w:spacing w:before="0" w:after="0"/>
+        <w:ind w:left="227" w:right="227"/>
         <w:shd w:val="clear" w:color="auto" w:fill="F0F0F0"/>
       </w:pPr>
       <w:r>
@@ -594,7 +603,7 @@
     <w:p>
       <w:pPr>
         <w:spacing w:before="0" w:after="0"/>
-        <w:ind w:left="283" w:right="283"/>
+        <w:ind w:left="227" w:right="227"/>
         <w:shd w:val="clear" w:color="auto" w:fill="F0F0F0"/>
       </w:pPr>
       <w:r>
@@ -609,7 +618,7 @@
     <w:p>
       <w:pPr>
         <w:spacing w:before="0" w:after="0"/>
-        <w:ind w:left="283" w:right="283"/>
+        <w:ind w:left="227" w:right="227"/>
         <w:shd w:val="clear" w:color="auto" w:fill="F0F0F0"/>
       </w:pPr>
       <w:r>
@@ -624,7 +633,7 @@
     <w:p>
       <w:pPr>
         <w:spacing w:before="0" w:after="0"/>
-        <w:ind w:left="283" w:right="283"/>
+        <w:ind w:left="227" w:right="227"/>
         <w:shd w:val="clear" w:color="auto" w:fill="F0F0F0"/>
       </w:pPr>
       <w:r>
@@ -639,7 +648,7 @@
     <w:p>
       <w:pPr>
         <w:spacing w:before="0" w:after="0"/>
-        <w:ind w:left="283" w:right="283"/>
+        <w:ind w:left="227" w:right="227"/>
         <w:shd w:val="clear" w:color="auto" w:fill="F0F0F0"/>
       </w:pPr>
       <w:r>
@@ -654,7 +663,7 @@
     <w:p>
       <w:pPr>
         <w:spacing w:before="0" w:after="0"/>
-        <w:ind w:left="283" w:right="283"/>
+        <w:ind w:left="227" w:right="227"/>
         <w:shd w:val="clear" w:color="auto" w:fill="F0F0F0"/>
       </w:pPr>
       <w:r>
@@ -669,7 +678,7 @@
     <w:p>
       <w:pPr>
         <w:spacing w:before="0" w:after="0"/>
-        <w:ind w:left="283" w:right="283"/>
+        <w:ind w:left="227" w:right="227"/>
         <w:shd w:val="clear" w:color="auto" w:fill="F0F0F0"/>
       </w:pPr>
       <w:r>
@@ -684,7 +693,7 @@
     <w:p>
       <w:pPr>
         <w:spacing w:before="0" w:after="0"/>
-        <w:ind w:left="283" w:right="283"/>
+        <w:ind w:left="227" w:right="227"/>
         <w:shd w:val="clear" w:color="auto" w:fill="F0F0F0"/>
       </w:pPr>
       <w:r>
@@ -699,7 +708,7 @@
     <w:p>
       <w:pPr>
         <w:spacing w:before="0" w:after="0"/>
-        <w:ind w:left="283" w:right="283"/>
+        <w:ind w:left="227" w:right="227"/>
         <w:shd w:val="clear" w:color="auto" w:fill="F0F0F0"/>
       </w:pPr>
       <w:r>
@@ -714,7 +723,7 @@
     <w:p>
       <w:pPr>
         <w:spacing w:before="0" w:after="0"/>
-        <w:ind w:left="283" w:right="283"/>
+        <w:ind w:left="227" w:right="227"/>
         <w:shd w:val="clear" w:color="auto" w:fill="F0F0F0"/>
       </w:pPr>
       <w:r>
@@ -729,7 +738,7 @@
     <w:p>
       <w:pPr>
         <w:spacing w:before="0" w:after="0"/>
-        <w:ind w:left="283" w:right="283"/>
+        <w:ind w:left="227" w:right="227"/>
         <w:shd w:val="clear" w:color="auto" w:fill="F0F0F0"/>
       </w:pPr>
       <w:r>
@@ -744,7 +753,7 @@
     <w:p>
       <w:pPr>
         <w:spacing w:before="0" w:after="0"/>
-        <w:ind w:left="283" w:right="283"/>
+        <w:ind w:left="227" w:right="227"/>
         <w:shd w:val="clear" w:color="auto" w:fill="F0F0F0"/>
       </w:pPr>
       <w:r>
@@ -759,7 +768,7 @@
     <w:p>
       <w:pPr>
         <w:spacing w:before="0" w:after="0"/>
-        <w:ind w:left="283" w:right="283"/>
+        <w:ind w:left="227" w:right="227"/>
         <w:shd w:val="clear" w:color="auto" w:fill="F0F0F0"/>
       </w:pPr>
       <w:r>
@@ -774,7 +783,7 @@
     <w:p>
       <w:pPr>
         <w:spacing w:before="0" w:after="0"/>
-        <w:ind w:left="283" w:right="283"/>
+        <w:ind w:left="227" w:right="227"/>
         <w:shd w:val="clear" w:color="auto" w:fill="F0F0F0"/>
       </w:pPr>
       <w:r>
@@ -789,7 +798,7 @@
     <w:p>
       <w:pPr>
         <w:spacing w:before="0" w:after="0"/>
-        <w:ind w:left="283" w:right="283"/>
+        <w:ind w:left="227" w:right="227"/>
         <w:shd w:val="clear" w:color="auto" w:fill="F0F0F0"/>
       </w:pPr>
       <w:r>
@@ -804,7 +813,7 @@
     <w:p>
       <w:pPr>
         <w:spacing w:before="0" w:after="0"/>
-        <w:ind w:left="283" w:right="283"/>
+        <w:ind w:left="227" w:right="227"/>
         <w:shd w:val="clear" w:color="auto" w:fill="F0F0F0"/>
       </w:pPr>
       <w:r>
@@ -819,7 +828,7 @@
     <w:p>
       <w:pPr>
         <w:spacing w:before="0" w:after="0"/>
-        <w:ind w:left="283" w:right="283"/>
+        <w:ind w:left="227" w:right="227"/>
         <w:shd w:val="clear" w:color="auto" w:fill="F0F0F0"/>
       </w:pPr>
       <w:r>
@@ -834,7 +843,7 @@
     <w:p>
       <w:pPr>
         <w:spacing w:before="0" w:after="0"/>
-        <w:ind w:left="283" w:right="283"/>
+        <w:ind w:left="227" w:right="227"/>
         <w:shd w:val="clear" w:color="auto" w:fill="F0F0F0"/>
       </w:pPr>
       <w:r>
@@ -849,7 +858,7 @@
     <w:p>
       <w:pPr>
         <w:spacing w:before="0" w:after="0"/>
-        <w:ind w:left="283" w:right="283"/>
+        <w:ind w:left="227" w:right="227"/>
         <w:shd w:val="clear" w:color="auto" w:fill="F0F0F0"/>
       </w:pPr>
       <w:r>
@@ -864,7 +873,7 @@
     <w:p>
       <w:pPr>
         <w:spacing w:before="0" w:after="0"/>
-        <w:ind w:left="283" w:right="283"/>
+        <w:ind w:left="227" w:right="227"/>
         <w:shd w:val="clear" w:color="auto" w:fill="F0F0F0"/>
       </w:pPr>
       <w:r>
@@ -879,7 +888,7 @@
     <w:p>
       <w:pPr>
         <w:spacing w:before="0" w:after="0"/>
-        <w:ind w:left="283" w:right="283"/>
+        <w:ind w:left="227" w:right="227"/>
         <w:shd w:val="clear" w:color="auto" w:fill="F0F0F0"/>
       </w:pPr>
       <w:r>
@@ -894,7 +903,7 @@
     <w:p>
       <w:pPr>
         <w:spacing w:before="0" w:after="0"/>
-        <w:ind w:left="283" w:right="283"/>
+        <w:ind w:left="227" w:right="227"/>
         <w:shd w:val="clear" w:color="auto" w:fill="F0F0F0"/>
       </w:pPr>
       <w:r>
@@ -909,7 +918,7 @@
     <w:p>
       <w:pPr>
         <w:spacing w:before="0" w:after="0"/>
-        <w:ind w:left="283" w:right="283"/>
+        <w:ind w:left="227" w:right="227"/>
         <w:shd w:val="clear" w:color="auto" w:fill="F0F0F0"/>
       </w:pPr>
       <w:r>
@@ -924,7 +933,7 @@
     <w:p>
       <w:pPr>
         <w:spacing w:before="0" w:after="0"/>
-        <w:ind w:left="283" w:right="283"/>
+        <w:ind w:left="227" w:right="227"/>
         <w:shd w:val="clear" w:color="auto" w:fill="F0F0F0"/>
       </w:pPr>
       <w:r>
@@ -939,7 +948,7 @@
     <w:p>
       <w:pPr>
         <w:spacing w:before="0" w:after="0"/>
-        <w:ind w:left="283" w:right="283"/>
+        <w:ind w:left="227" w:right="227"/>
         <w:shd w:val="clear" w:color="auto" w:fill="F0F0F0"/>
       </w:pPr>
       <w:r>
@@ -954,7 +963,7 @@
     <w:p>
       <w:pPr>
         <w:spacing w:before="0" w:after="0"/>
-        <w:ind w:left="283" w:right="283"/>
+        <w:ind w:left="227" w:right="227"/>
         <w:shd w:val="clear" w:color="auto" w:fill="F0F0F0"/>
       </w:pPr>
       <w:r>
@@ -969,7 +978,7 @@
     <w:p>
       <w:pPr>
         <w:spacing w:before="0" w:after="0"/>
-        <w:ind w:left="283" w:right="283"/>
+        <w:ind w:left="227" w:right="227"/>
         <w:shd w:val="clear" w:color="auto" w:fill="F0F0F0"/>
       </w:pPr>
       <w:r>
@@ -984,7 +993,7 @@
     <w:p>
       <w:pPr>
         <w:spacing w:before="0" w:after="0"/>
-        <w:ind w:left="283" w:right="283"/>
+        <w:ind w:left="227" w:right="227"/>
         <w:shd w:val="clear" w:color="auto" w:fill="F0F0F0"/>
       </w:pPr>
       <w:r>
@@ -999,7 +1008,7 @@
     <w:p>
       <w:pPr>
         <w:spacing w:before="0" w:after="0"/>
-        <w:ind w:left="283" w:right="283"/>
+        <w:ind w:left="227" w:right="227"/>
         <w:shd w:val="clear" w:color="auto" w:fill="F0F0F0"/>
       </w:pPr>
       <w:r>
@@ -1014,7 +1023,7 @@
     <w:p>
       <w:pPr>
         <w:spacing w:before="0" w:after="0"/>
-        <w:ind w:left="283" w:right="283"/>
+        <w:ind w:left="227" w:right="227"/>
         <w:shd w:val="clear" w:color="auto" w:fill="F0F0F0"/>
       </w:pPr>
       <w:r>
@@ -1029,7 +1038,7 @@
     <w:p>
       <w:pPr>
         <w:spacing w:before="0" w:after="0"/>
-        <w:ind w:left="283" w:right="283"/>
+        <w:ind w:left="227" w:right="227"/>
         <w:shd w:val="clear" w:color="auto" w:fill="F0F0F0"/>
       </w:pPr>
       <w:r>
@@ -1044,7 +1053,7 @@
     <w:p>
       <w:pPr>
         <w:spacing w:before="0" w:after="0"/>
-        <w:ind w:left="283" w:right="283"/>
+        <w:ind w:left="227" w:right="227"/>
         <w:shd w:val="clear" w:color="auto" w:fill="F0F0F0"/>
       </w:pPr>
       <w:r>
@@ -1059,7 +1068,7 @@
     <w:p>
       <w:pPr>
         <w:spacing w:before="0" w:after="0"/>
-        <w:ind w:left="283" w:right="283"/>
+        <w:ind w:left="227" w:right="227"/>
         <w:shd w:val="clear" w:color="auto" w:fill="F0F0F0"/>
       </w:pPr>
       <w:r>
@@ -1074,7 +1083,7 @@
     <w:p>
       <w:pPr>
         <w:spacing w:before="0" w:after="0"/>
-        <w:ind w:left="283" w:right="283"/>
+        <w:ind w:left="227" w:right="227"/>
         <w:shd w:val="clear" w:color="auto" w:fill="F0F0F0"/>
       </w:pPr>
       <w:r>
@@ -1089,7 +1098,7 @@
     <w:p>
       <w:pPr>
         <w:spacing w:before="0" w:after="0"/>
-        <w:ind w:left="283" w:right="283"/>
+        <w:ind w:left="227" w:right="227"/>
         <w:shd w:val="clear" w:color="auto" w:fill="F0F0F0"/>
       </w:pPr>
       <w:r>
@@ -1104,7 +1113,7 @@
     <w:p>
       <w:pPr>
         <w:spacing w:before="0" w:after="0"/>
-        <w:ind w:left="283" w:right="283"/>
+        <w:ind w:left="227" w:right="227"/>
         <w:shd w:val="clear" w:color="auto" w:fill="F0F0F0"/>
       </w:pPr>
       <w:r>
@@ -1119,7 +1128,7 @@
     <w:p>
       <w:pPr>
         <w:spacing w:before="0" w:after="0"/>
-        <w:ind w:left="283" w:right="283"/>
+        <w:ind w:left="227" w:right="227"/>
         <w:shd w:val="clear" w:color="auto" w:fill="F0F0F0"/>
       </w:pPr>
       <w:r>
@@ -1134,7 +1143,7 @@
     <w:p>
       <w:pPr>
         <w:spacing w:before="0" w:after="0"/>
-        <w:ind w:left="283" w:right="283"/>
+        <w:ind w:left="227" w:right="227"/>
         <w:shd w:val="clear" w:color="auto" w:fill="F0F0F0"/>
       </w:pPr>
       <w:r>
@@ -1149,7 +1158,7 @@
     <w:p>
       <w:pPr>
         <w:spacing w:before="0" w:after="0"/>
-        <w:ind w:left="283" w:right="283"/>
+        <w:ind w:left="227" w:right="227"/>
         <w:shd w:val="clear" w:color="auto" w:fill="F0F0F0"/>
       </w:pPr>
       <w:r>
@@ -1164,7 +1173,7 @@
     <w:p>
       <w:pPr>
         <w:spacing w:before="0" w:after="0"/>
-        <w:ind w:left="283" w:right="283"/>
+        <w:ind w:left="227" w:right="227"/>
         <w:shd w:val="clear" w:color="auto" w:fill="F0F0F0"/>
       </w:pPr>
       <w:r>
@@ -1179,7 +1188,7 @@
     <w:p>
       <w:pPr>
         <w:spacing w:before="0" w:after="0"/>
-        <w:ind w:left="283" w:right="283"/>
+        <w:ind w:left="227" w:right="227"/>
         <w:shd w:val="clear" w:color="auto" w:fill="F0F0F0"/>
       </w:pPr>
       <w:r>
@@ -1194,7 +1203,7 @@
     <w:p>
       <w:pPr>
         <w:spacing w:before="0" w:after="0"/>
-        <w:ind w:left="283" w:right="283"/>
+        <w:ind w:left="227" w:right="227"/>
         <w:shd w:val="clear" w:color="auto" w:fill="F0F0F0"/>
       </w:pPr>
       <w:r>
@@ -1209,7 +1218,7 @@
     <w:p>
       <w:pPr>
         <w:spacing w:before="0" w:after="0"/>
-        <w:ind w:left="283" w:right="283"/>
+        <w:ind w:left="227" w:right="227"/>
         <w:shd w:val="clear" w:color="auto" w:fill="F0F0F0"/>
       </w:pPr>
       <w:r>
@@ -1224,7 +1233,7 @@
     <w:p>
       <w:pPr>
         <w:spacing w:before="0" w:after="0"/>
-        <w:ind w:left="283" w:right="283"/>
+        <w:ind w:left="227" w:right="227"/>
         <w:shd w:val="clear" w:color="auto" w:fill="F0F0F0"/>
       </w:pPr>
       <w:r>
@@ -1239,7 +1248,7 @@
     <w:p>
       <w:pPr>
         <w:spacing w:before="0" w:after="0"/>
-        <w:ind w:left="283" w:right="283"/>
+        <w:ind w:left="227" w:right="227"/>
         <w:shd w:val="clear" w:color="auto" w:fill="F0F0F0"/>
       </w:pPr>
       <w:r>
@@ -1254,7 +1263,7 @@
     <w:p>
       <w:pPr>
         <w:spacing w:before="0" w:after="0"/>
-        <w:ind w:left="283" w:right="283"/>
+        <w:ind w:left="227" w:right="227"/>
         <w:shd w:val="clear" w:color="auto" w:fill="F0F0F0"/>
       </w:pPr>
       <w:r>
@@ -1269,7 +1278,7 @@
     <w:p>
       <w:pPr>
         <w:spacing w:before="0" w:after="0"/>
-        <w:ind w:left="283" w:right="283"/>
+        <w:ind w:left="227" w:right="227"/>
         <w:shd w:val="clear" w:color="auto" w:fill="F0F0F0"/>
       </w:pPr>
       <w:r>
@@ -1284,7 +1293,7 @@
     <w:p>
       <w:pPr>
         <w:spacing w:before="0" w:after="0"/>
-        <w:ind w:left="283" w:right="283"/>
+        <w:ind w:left="227" w:right="227"/>
         <w:shd w:val="clear" w:color="auto" w:fill="F0F0F0"/>
       </w:pPr>
       <w:r>
@@ -1299,7 +1308,7 @@
     <w:p>
       <w:pPr>
         <w:spacing w:before="0" w:after="0"/>
-        <w:ind w:left="283" w:right="283"/>
+        <w:ind w:left="227" w:right="227"/>
         <w:shd w:val="clear" w:color="auto" w:fill="F0F0F0"/>
       </w:pPr>
       <w:r>
@@ -1314,7 +1323,7 @@
     <w:p>
       <w:pPr>
         <w:spacing w:before="0" w:after="0"/>
-        <w:ind w:left="283" w:right="283"/>
+        <w:ind w:left="227" w:right="227"/>
         <w:shd w:val="clear" w:color="auto" w:fill="F0F0F0"/>
       </w:pPr>
       <w:r>
@@ -1329,7 +1338,7 @@
     <w:p>
       <w:pPr>
         <w:spacing w:before="0" w:after="0"/>
-        <w:ind w:left="283" w:right="283"/>
+        <w:ind w:left="227" w:right="227"/>
         <w:shd w:val="clear" w:color="auto" w:fill="F0F0F0"/>
       </w:pPr>
       <w:r>
@@ -1344,7 +1353,7 @@
     <w:p>
       <w:pPr>
         <w:spacing w:before="0" w:after="0"/>
-        <w:ind w:left="283" w:right="283"/>
+        <w:ind w:left="227" w:right="227"/>
         <w:shd w:val="clear" w:color="auto" w:fill="F0F0F0"/>
       </w:pPr>
       <w:r>
@@ -1359,7 +1368,7 @@
     <w:p>
       <w:pPr>
         <w:spacing w:before="0" w:after="0"/>
-        <w:ind w:left="283" w:right="283"/>
+        <w:ind w:left="227" w:right="227"/>
         <w:shd w:val="clear" w:color="auto" w:fill="F0F0F0"/>
       </w:pPr>
       <w:r>
@@ -1374,7 +1383,7 @@
     <w:p>
       <w:pPr>
         <w:spacing w:before="0" w:after="0"/>
-        <w:ind w:left="283" w:right="283"/>
+        <w:ind w:left="227" w:right="227"/>
         <w:shd w:val="clear" w:color="auto" w:fill="F0F0F0"/>
       </w:pPr>
       <w:r>
@@ -1389,7 +1398,7 @@
     <w:p>
       <w:pPr>
         <w:spacing w:before="0" w:after="0"/>
-        <w:ind w:left="283" w:right="283"/>
+        <w:ind w:left="227" w:right="227"/>
         <w:shd w:val="clear" w:color="auto" w:fill="F0F0F0"/>
       </w:pPr>
       <w:r>
@@ -1404,7 +1413,7 @@
     <w:p>
       <w:pPr>
         <w:spacing w:before="0" w:after="0"/>
-        <w:ind w:left="283" w:right="283"/>
+        <w:ind w:left="227" w:right="227"/>
         <w:shd w:val="clear" w:color="auto" w:fill="F0F0F0"/>
       </w:pPr>
       <w:r>
@@ -1419,7 +1428,7 @@
     <w:p>
       <w:pPr>
         <w:spacing w:before="0" w:after="0"/>
-        <w:ind w:left="283" w:right="283"/>
+        <w:ind w:left="227" w:right="227"/>
         <w:shd w:val="clear" w:color="auto" w:fill="F0F0F0"/>
       </w:pPr>
       <w:r>
@@ -1434,7 +1443,7 @@
     <w:p>
       <w:pPr>
         <w:spacing w:before="0" w:after="0"/>
-        <w:ind w:left="283" w:right="283"/>
+        <w:ind w:left="227" w:right="227"/>
         <w:shd w:val="clear" w:color="auto" w:fill="F0F0F0"/>
       </w:pPr>
       <w:r>
@@ -1449,7 +1458,7 @@
     <w:p>
       <w:pPr>
         <w:spacing w:before="0" w:after="0"/>
-        <w:ind w:left="283" w:right="283"/>
+        <w:ind w:left="227" w:right="227"/>
         <w:shd w:val="clear" w:color="auto" w:fill="F0F0F0"/>
       </w:pPr>
       <w:r>
@@ -1464,7 +1473,7 @@
     <w:p>
       <w:pPr>
         <w:spacing w:before="0" w:after="0"/>
-        <w:ind w:left="283" w:right="283"/>
+        <w:ind w:left="227" w:right="227"/>
         <w:shd w:val="clear" w:color="auto" w:fill="F0F0F0"/>
       </w:pPr>
       <w:r>
@@ -1479,7 +1488,7 @@
     <w:p>
       <w:pPr>
         <w:spacing w:before="0" w:after="0"/>
-        <w:ind w:left="283" w:right="283"/>
+        <w:ind w:left="227" w:right="227"/>
         <w:shd w:val="clear" w:color="auto" w:fill="F0F0F0"/>
       </w:pPr>
       <w:r>
@@ -1494,7 +1503,7 @@
     <w:p>
       <w:pPr>
         <w:spacing w:before="0" w:after="0"/>
-        <w:ind w:left="283" w:right="283"/>
+        <w:ind w:left="227" w:right="227"/>
         <w:shd w:val="clear" w:color="auto" w:fill="F0F0F0"/>
       </w:pPr>
       <w:r>
@@ -1509,7 +1518,7 @@
     <w:p>
       <w:pPr>
         <w:spacing w:before="0" w:after="0"/>
-        <w:ind w:left="283" w:right="283"/>
+        <w:ind w:left="227" w:right="227"/>
         <w:shd w:val="clear" w:color="auto" w:fill="F0F0F0"/>
       </w:pPr>
       <w:r>
@@ -1524,7 +1533,7 @@
     <w:p>
       <w:pPr>
         <w:spacing w:before="0" w:after="0"/>
-        <w:ind w:left="283" w:right="283"/>
+        <w:ind w:left="227" w:right="227"/>
         <w:shd w:val="clear" w:color="auto" w:fill="F0F0F0"/>
       </w:pPr>
       <w:r>
@@ -1539,7 +1548,7 @@
     <w:p>
       <w:pPr>
         <w:spacing w:before="0" w:after="0"/>
-        <w:ind w:left="283" w:right="283"/>
+        <w:ind w:left="227" w:right="227"/>
         <w:shd w:val="clear" w:color="auto" w:fill="F0F0F0"/>
       </w:pPr>
       <w:r>
@@ -1554,7 +1563,7 @@
     <w:p>
       <w:pPr>
         <w:spacing w:before="0" w:after="0"/>
-        <w:ind w:left="283" w:right="283"/>
+        <w:ind w:left="227" w:right="227"/>
         <w:shd w:val="clear" w:color="auto" w:fill="F0F0F0"/>
       </w:pPr>
       <w:r>
@@ -1569,7 +1578,7 @@
     <w:p>
       <w:pPr>
         <w:spacing w:before="0" w:after="0"/>
-        <w:ind w:left="283" w:right="283"/>
+        <w:ind w:left="227" w:right="227"/>
         <w:shd w:val="clear" w:color="auto" w:fill="F0F0F0"/>
       </w:pPr>
       <w:r>
@@ -1584,7 +1593,7 @@
     <w:p>
       <w:pPr>
         <w:spacing w:before="0" w:after="0"/>
-        <w:ind w:left="283" w:right="283"/>
+        <w:ind w:left="227" w:right="227"/>
         <w:shd w:val="clear" w:color="auto" w:fill="F0F0F0"/>
       </w:pPr>
       <w:r>
@@ -1599,7 +1608,7 @@
     <w:p>
       <w:pPr>
         <w:spacing w:before="0" w:after="0"/>
-        <w:ind w:left="283" w:right="283"/>
+        <w:ind w:left="227" w:right="227"/>
         <w:shd w:val="clear" w:color="auto" w:fill="F0F0F0"/>
       </w:pPr>
       <w:r>
@@ -1614,7 +1623,7 @@
     <w:p>
       <w:pPr>
         <w:spacing w:before="0" w:after="0"/>
-        <w:ind w:left="283" w:right="283"/>
+        <w:ind w:left="227" w:right="227"/>
         <w:shd w:val="clear" w:color="auto" w:fill="F0F0F0"/>
       </w:pPr>
       <w:r>
@@ -1629,7 +1638,7 @@
     <w:p>
       <w:pPr>
         <w:spacing w:before="0" w:after="0"/>
-        <w:ind w:left="283" w:right="283"/>
+        <w:ind w:left="227" w:right="227"/>
         <w:shd w:val="clear" w:color="auto" w:fill="F0F0F0"/>
       </w:pPr>
       <w:r>
@@ -1644,7 +1653,7 @@
     <w:p>
       <w:pPr>
         <w:spacing w:before="0" w:after="0"/>
-        <w:ind w:left="283" w:right="283"/>
+        <w:ind w:left="227" w:right="227"/>
         <w:shd w:val="clear" w:color="auto" w:fill="F0F0F0"/>
       </w:pPr>
       <w:r>
@@ -1659,7 +1668,7 @@
     <w:p>
       <w:pPr>
         <w:spacing w:before="0" w:after="0"/>
-        <w:ind w:left="283" w:right="283"/>
+        <w:ind w:left="227" w:right="227"/>
         <w:shd w:val="clear" w:color="auto" w:fill="F0F0F0"/>
       </w:pPr>
       <w:r>
@@ -1674,7 +1683,7 @@
     <w:p>
       <w:pPr>
         <w:spacing w:before="0" w:after="0"/>
-        <w:ind w:left="283" w:right="283"/>
+        <w:ind w:left="227" w:right="227"/>
         <w:shd w:val="clear" w:color="auto" w:fill="F0F0F0"/>
       </w:pPr>
       <w:r>
@@ -1689,7 +1698,7 @@
     <w:p>
       <w:pPr>
         <w:spacing w:before="0" w:after="0"/>
-        <w:ind w:left="283" w:right="283"/>
+        <w:ind w:left="227" w:right="227"/>
         <w:shd w:val="clear" w:color="auto" w:fill="F0F0F0"/>
       </w:pPr>
       <w:r>
@@ -1704,7 +1713,7 @@
     <w:p>
       <w:pPr>
         <w:spacing w:before="0" w:after="0"/>
-        <w:ind w:left="283" w:right="283"/>
+        <w:ind w:left="227" w:right="227"/>
         <w:shd w:val="clear" w:color="auto" w:fill="F0F0F0"/>
       </w:pPr>
       <w:r>
@@ -1719,7 +1728,7 @@
     <w:p>
       <w:pPr>
         <w:spacing w:before="0" w:after="0"/>
-        <w:ind w:left="283" w:right="283"/>
+        <w:ind w:left="227" w:right="227"/>
         <w:shd w:val="clear" w:color="auto" w:fill="F0F0F0"/>
       </w:pPr>
       <w:r>
@@ -1734,7 +1743,7 @@
     <w:p>
       <w:pPr>
         <w:spacing w:before="0" w:after="0"/>
-        <w:ind w:left="283" w:right="283"/>
+        <w:ind w:left="227" w:right="227"/>
         <w:shd w:val="clear" w:color="auto" w:fill="F0F0F0"/>
       </w:pPr>
       <w:r>
@@ -1749,7 +1758,7 @@
     <w:p>
       <w:pPr>
         <w:spacing w:before="0" w:after="0"/>
-        <w:ind w:left="283" w:right="283"/>
+        <w:ind w:left="227" w:right="227"/>
         <w:shd w:val="clear" w:color="auto" w:fill="F0F0F0"/>
       </w:pPr>
       <w:r>
@@ -1764,7 +1773,7 @@
     <w:p>
       <w:pPr>
         <w:spacing w:before="0" w:after="0"/>
-        <w:ind w:left="283" w:right="283"/>
+        <w:ind w:left="227" w:right="227"/>
         <w:shd w:val="clear" w:color="auto" w:fill="F0F0F0"/>
       </w:pPr>
       <w:r>
@@ -1779,7 +1788,7 @@
     <w:p>
       <w:pPr>
         <w:spacing w:before="0" w:after="0"/>
-        <w:ind w:left="283" w:right="283"/>
+        <w:ind w:left="227" w:right="227"/>
         <w:shd w:val="clear" w:color="auto" w:fill="F0F0F0"/>
       </w:pPr>
       <w:r>
@@ -1794,7 +1803,7 @@
     <w:p>
       <w:pPr>
         <w:spacing w:before="0" w:after="0"/>
-        <w:ind w:left="283" w:right="283"/>
+        <w:ind w:left="227" w:right="227"/>
         <w:shd w:val="clear" w:color="auto" w:fill="F0F0F0"/>
       </w:pPr>
       <w:r>
@@ -1809,7 +1818,7 @@
     <w:p>
       <w:pPr>
         <w:spacing w:before="0" w:after="0"/>
-        <w:ind w:left="283" w:right="283"/>
+        <w:ind w:left="227" w:right="227"/>
         <w:shd w:val="clear" w:color="auto" w:fill="F0F0F0"/>
       </w:pPr>
       <w:r>
@@ -1824,7 +1833,7 @@
     <w:p>
       <w:pPr>
         <w:spacing w:before="0" w:after="0"/>
-        <w:ind w:left="283" w:right="283"/>
+        <w:ind w:left="227" w:right="227"/>
         <w:shd w:val="clear" w:color="auto" w:fill="F0F0F0"/>
       </w:pPr>
       <w:r>
@@ -1839,7 +1848,7 @@
     <w:p>
       <w:pPr>
         <w:spacing w:before="0" w:after="0"/>
-        <w:ind w:left="283" w:right="283"/>
+        <w:ind w:left="227" w:right="227"/>
         <w:shd w:val="clear" w:color="auto" w:fill="F0F0F0"/>
       </w:pPr>
       <w:r>
@@ -1854,7 +1863,7 @@
     <w:p>
       <w:pPr>
         <w:spacing w:before="0" w:after="0"/>
-        <w:ind w:left="283" w:right="283"/>
+        <w:ind w:left="227" w:right="227"/>
         <w:shd w:val="clear" w:color="auto" w:fill="F0F0F0"/>
       </w:pPr>
       <w:r>
@@ -1869,7 +1878,7 @@
     <w:p>
       <w:pPr>
         <w:spacing w:before="0" w:after="0"/>
-        <w:ind w:left="283" w:right="283"/>
+        <w:ind w:left="227" w:right="227"/>
         <w:shd w:val="clear" w:color="auto" w:fill="F0F0F0"/>
       </w:pPr>
       <w:r>
@@ -1884,7 +1893,7 @@
     <w:p>
       <w:pPr>
         <w:spacing w:before="0" w:after="0"/>
-        <w:ind w:left="283" w:right="283"/>
+        <w:ind w:left="227" w:right="227"/>
         <w:shd w:val="clear" w:color="auto" w:fill="F0F0F0"/>
       </w:pPr>
       <w:r>
@@ -1899,7 +1908,7 @@
     <w:p>
       <w:pPr>
         <w:spacing w:before="0" w:after="0"/>
-        <w:ind w:left="283" w:right="283"/>
+        <w:ind w:left="227" w:right="227"/>
         <w:shd w:val="clear" w:color="auto" w:fill="F0F0F0"/>
       </w:pPr>
       <w:r>
@@ -1914,7 +1923,7 @@
     <w:p>
       <w:pPr>
         <w:spacing w:before="0" w:after="0"/>
-        <w:ind w:left="283" w:right="283"/>
+        <w:ind w:left="227" w:right="227"/>
         <w:shd w:val="clear" w:color="auto" w:fill="F0F0F0"/>
       </w:pPr>
       <w:r>
@@ -1929,7 +1938,7 @@
     <w:p>
       <w:pPr>
         <w:spacing w:before="0" w:after="0"/>
-        <w:ind w:left="283" w:right="283"/>
+        <w:ind w:left="227" w:right="227"/>
         <w:shd w:val="clear" w:color="auto" w:fill="F0F0F0"/>
       </w:pPr>
       <w:r>
@@ -1944,7 +1953,7 @@
     <w:p>
       <w:pPr>
         <w:spacing w:before="0" w:after="0"/>
-        <w:ind w:left="283" w:right="283"/>
+        <w:ind w:left="227" w:right="227"/>
         <w:shd w:val="clear" w:color="auto" w:fill="F0F0F0"/>
       </w:pPr>
       <w:r>
@@ -1959,7 +1968,7 @@
     <w:p>
       <w:pPr>
         <w:spacing w:before="0" w:after="0"/>
-        <w:ind w:left="283" w:right="283"/>
+        <w:ind w:left="227" w:right="227"/>
         <w:shd w:val="clear" w:color="auto" w:fill="F0F0F0"/>
       </w:pPr>
       <w:r>
@@ -1974,7 +1983,7 @@
     <w:p>
       <w:pPr>
         <w:spacing w:before="0" w:after="0"/>
-        <w:ind w:left="283" w:right="283"/>
+        <w:ind w:left="227" w:right="227"/>
         <w:shd w:val="clear" w:color="auto" w:fill="F0F0F0"/>
       </w:pPr>
       <w:r>
@@ -1989,7 +1998,7 @@
     <w:p>
       <w:pPr>
         <w:spacing w:before="0" w:after="0"/>
-        <w:ind w:left="283" w:right="283"/>
+        <w:ind w:left="227" w:right="227"/>
         <w:shd w:val="clear" w:color="auto" w:fill="F0F0F0"/>
       </w:pPr>
       <w:r>
@@ -2004,7 +2013,7 @@
     <w:p>
       <w:pPr>
         <w:spacing w:before="0" w:after="0"/>
-        <w:ind w:left="283" w:right="283"/>
+        <w:ind w:left="227" w:right="227"/>
         <w:shd w:val="clear" w:color="auto" w:fill="F0F0F0"/>
       </w:pPr>
       <w:r>
@@ -2019,7 +2028,7 @@
     <w:p>
       <w:pPr>
         <w:spacing w:before="0" w:after="0"/>
-        <w:ind w:left="283" w:right="283"/>
+        <w:ind w:left="227" w:right="227"/>
         <w:shd w:val="clear" w:color="auto" w:fill="F0F0F0"/>
       </w:pPr>
       <w:r>
@@ -2034,7 +2043,7 @@
     <w:p>
       <w:pPr>
         <w:spacing w:before="0" w:after="0"/>
-        <w:ind w:left="283" w:right="283"/>
+        <w:ind w:left="227" w:right="227"/>
         <w:shd w:val="clear" w:color="auto" w:fill="F0F0F0"/>
       </w:pPr>
       <w:r>
@@ -2049,7 +2058,7 @@
     <w:p>
       <w:pPr>
         <w:spacing w:before="0" w:after="0"/>
-        <w:ind w:left="283" w:right="283"/>
+        <w:ind w:left="227" w:right="227"/>
         <w:shd w:val="clear" w:color="auto" w:fill="F0F0F0"/>
       </w:pPr>
       <w:r>
@@ -2064,7 +2073,7 @@
     <w:p>
       <w:pPr>
         <w:spacing w:before="0" w:after="0"/>
-        <w:ind w:left="283" w:right="283"/>
+        <w:ind w:left="227" w:right="227"/>
         <w:shd w:val="clear" w:color="auto" w:fill="F0F0F0"/>
       </w:pPr>
       <w:r>
@@ -2079,7 +2088,7 @@
     <w:p>
       <w:pPr>
         <w:spacing w:before="0" w:after="0"/>
-        <w:ind w:left="283" w:right="283"/>
+        <w:ind w:left="227" w:right="227"/>
         <w:shd w:val="clear" w:color="auto" w:fill="F0F0F0"/>
       </w:pPr>
       <w:r>
@@ -2094,7 +2103,7 @@
     <w:p>
       <w:pPr>
         <w:spacing w:before="0" w:after="0"/>
-        <w:ind w:left="283" w:right="283"/>
+        <w:ind w:left="227" w:right="227"/>
         <w:shd w:val="clear" w:color="auto" w:fill="F0F0F0"/>
       </w:pPr>
       <w:r>
@@ -2109,7 +2118,7 @@
     <w:p>
       <w:pPr>
         <w:spacing w:before="0" w:after="0"/>
-        <w:ind w:left="283" w:right="283"/>
+        <w:ind w:left="227" w:right="227"/>
         <w:shd w:val="clear" w:color="auto" w:fill="F0F0F0"/>
       </w:pPr>
       <w:r>
@@ -2124,7 +2133,7 @@
     <w:p>
       <w:pPr>
         <w:spacing w:before="0" w:after="0"/>
-        <w:ind w:left="283" w:right="283"/>
+        <w:ind w:left="227" w:right="227"/>
         <w:shd w:val="clear" w:color="auto" w:fill="F0F0F0"/>
       </w:pPr>
       <w:r>
@@ -2139,7 +2148,7 @@
     <w:p>
       <w:pPr>
         <w:spacing w:before="0" w:after="0"/>
-        <w:ind w:left="283" w:right="283"/>
+        <w:ind w:left="227" w:right="227"/>
         <w:shd w:val="clear" w:color="auto" w:fill="F0F0F0"/>
       </w:pPr>
       <w:r>
@@ -2154,7 +2163,7 @@
     <w:p>
       <w:pPr>
         <w:spacing w:before="0" w:after="0"/>
-        <w:ind w:left="283" w:right="283"/>
+        <w:ind w:left="227" w:right="227"/>
         <w:shd w:val="clear" w:color="auto" w:fill="F0F0F0"/>
       </w:pPr>
       <w:r>
@@ -2169,7 +2178,7 @@
     <w:p>
       <w:pPr>
         <w:spacing w:before="0" w:after="0"/>
-        <w:ind w:left="283" w:right="283"/>
+        <w:ind w:left="227" w:right="227"/>
         <w:shd w:val="clear" w:color="auto" w:fill="F0F0F0"/>
       </w:pPr>
       <w:r>
@@ -2184,7 +2193,7 @@
     <w:p>
       <w:pPr>
         <w:spacing w:before="0" w:after="0"/>
-        <w:ind w:left="283" w:right="283"/>
+        <w:ind w:left="227" w:right="227"/>
         <w:shd w:val="clear" w:color="auto" w:fill="F0F0F0"/>
       </w:pPr>
       <w:r>
@@ -2199,7 +2208,7 @@
     <w:p>
       <w:pPr>
         <w:spacing w:before="0" w:after="0"/>
-        <w:ind w:left="283" w:right="283"/>
+        <w:ind w:left="227" w:right="227"/>
         <w:shd w:val="clear" w:color="auto" w:fill="F0F0F0"/>
       </w:pPr>
       <w:r>
@@ -2214,7 +2223,7 @@
     <w:p>
       <w:pPr>
         <w:spacing w:before="0" w:after="0"/>
-        <w:ind w:left="283" w:right="283"/>
+        <w:ind w:left="227" w:right="227"/>
         <w:shd w:val="clear" w:color="auto" w:fill="F0F0F0"/>
       </w:pPr>
       <w:r>
@@ -2229,7 +2238,7 @@
     <w:p>
       <w:pPr>
         <w:spacing w:before="0" w:after="0"/>
-        <w:ind w:left="283" w:right="283"/>
+        <w:ind w:left="227" w:right="227"/>
         <w:shd w:val="clear" w:color="auto" w:fill="F0F0F0"/>
       </w:pPr>
       <w:r>
@@ -2244,7 +2253,7 @@
     <w:p>
       <w:pPr>
         <w:spacing w:before="0" w:after="0"/>
-        <w:ind w:left="283" w:right="283"/>
+        <w:ind w:left="227" w:right="227"/>
         <w:shd w:val="clear" w:color="auto" w:fill="F0F0F0"/>
       </w:pPr>
       <w:r>
@@ -2259,7 +2268,7 @@
     <w:p>
       <w:pPr>
         <w:spacing w:before="0" w:after="0"/>
-        <w:ind w:left="283" w:right="283"/>
+        <w:ind w:left="227" w:right="227"/>
         <w:shd w:val="clear" w:color="auto" w:fill="F0F0F0"/>
       </w:pPr>
       <w:r>
@@ -2274,7 +2283,7 @@
     <w:p>
       <w:pPr>
         <w:spacing w:before="0" w:after="0"/>
-        <w:ind w:left="283" w:right="283"/>
+        <w:ind w:left="227" w:right="227"/>
         <w:shd w:val="clear" w:color="auto" w:fill="F0F0F0"/>
       </w:pPr>
       <w:r>
@@ -2289,7 +2298,7 @@
     <w:p>
       <w:pPr>
         <w:spacing w:before="0" w:after="0"/>
-        <w:ind w:left="283" w:right="283"/>
+        <w:ind w:left="227" w:right="227"/>
         <w:shd w:val="clear" w:color="auto" w:fill="F0F0F0"/>
       </w:pPr>
       <w:r>
@@ -2304,7 +2313,7 @@
     <w:p>
       <w:pPr>
         <w:spacing w:before="0" w:after="0"/>
-        <w:ind w:left="283" w:right="283"/>
+        <w:ind w:left="227" w:right="227"/>
         <w:shd w:val="clear" w:color="auto" w:fill="F0F0F0"/>
       </w:pPr>
       <w:r>
@@ -2319,7 +2328,7 @@
     <w:p>
       <w:pPr>
         <w:spacing w:before="0" w:after="0"/>
-        <w:ind w:left="283" w:right="283"/>
+        <w:ind w:left="227" w:right="227"/>
         <w:shd w:val="clear" w:color="auto" w:fill="F0F0F0"/>
       </w:pPr>
       <w:r>
@@ -2334,7 +2343,7 @@
     <w:p>
       <w:pPr>
         <w:spacing w:before="0" w:after="0"/>
-        <w:ind w:left="283" w:right="283"/>
+        <w:ind w:left="227" w:right="227"/>
         <w:shd w:val="clear" w:color="auto" w:fill="F0F0F0"/>
       </w:pPr>
       <w:r>
@@ -2349,7 +2358,7 @@
     <w:p>
       <w:pPr>
         <w:spacing w:before="0" w:after="0"/>
-        <w:ind w:left="283" w:right="283"/>
+        <w:ind w:left="227" w:right="227"/>
         <w:shd w:val="clear" w:color="auto" w:fill="F0F0F0"/>
       </w:pPr>
       <w:r>
@@ -2364,7 +2373,7 @@
     <w:p>
       <w:pPr>
         <w:spacing w:before="0" w:after="0"/>
-        <w:ind w:left="283" w:right="283"/>
+        <w:ind w:left="227" w:right="227"/>
         <w:shd w:val="clear" w:color="auto" w:fill="F0F0F0"/>
       </w:pPr>
       <w:r>
@@ -2379,7 +2388,7 @@
     <w:p>
       <w:pPr>
         <w:spacing w:before="0" w:after="0"/>
-        <w:ind w:left="283" w:right="283"/>
+        <w:ind w:left="227" w:right="227"/>
         <w:shd w:val="clear" w:color="auto" w:fill="F0F0F0"/>
       </w:pPr>
       <w:r>
@@ -2394,7 +2403,7 @@
     <w:p>
       <w:pPr>
         <w:spacing w:before="0" w:after="0"/>
-        <w:ind w:left="283" w:right="283"/>
+        <w:ind w:left="227" w:right="227"/>
         <w:shd w:val="clear" w:color="auto" w:fill="F0F0F0"/>
       </w:pPr>
       <w:r>
@@ -2409,7 +2418,7 @@
     <w:p>
       <w:pPr>
         <w:spacing w:before="0" w:after="0"/>
-        <w:ind w:left="283" w:right="283"/>
+        <w:ind w:left="227" w:right="227"/>
         <w:shd w:val="clear" w:color="auto" w:fill="F0F0F0"/>
       </w:pPr>
       <w:r>
@@ -2424,7 +2433,7 @@
     <w:p>
       <w:pPr>
         <w:spacing w:before="0" w:after="0"/>
-        <w:ind w:left="283" w:right="283"/>
+        <w:ind w:left="227" w:right="227"/>
         <w:shd w:val="clear" w:color="auto" w:fill="F0F0F0"/>
       </w:pPr>
       <w:r>
@@ -2439,7 +2448,7 @@
     <w:p>
       <w:pPr>
         <w:spacing w:before="0" w:after="0"/>
-        <w:ind w:left="283" w:right="283"/>
+        <w:ind w:left="227" w:right="227"/>
         <w:shd w:val="clear" w:color="auto" w:fill="F0F0F0"/>
       </w:pPr>
       <w:r>
@@ -2454,7 +2463,7 @@
     <w:p>
       <w:pPr>
         <w:spacing w:before="0" w:after="0"/>
-        <w:ind w:left="283" w:right="283"/>
+        <w:ind w:left="227" w:right="227"/>
         <w:shd w:val="clear" w:color="auto" w:fill="F0F0F0"/>
       </w:pPr>
       <w:r>
@@ -2469,7 +2478,7 @@
     <w:p>
       <w:pPr>
         <w:spacing w:before="0" w:after="0"/>
-        <w:ind w:left="283" w:right="283"/>
+        <w:ind w:left="227" w:right="227"/>
         <w:shd w:val="clear" w:color="auto" w:fill="F0F0F0"/>
       </w:pPr>
       <w:r>
@@ -2484,7 +2493,7 @@
     <w:p>
       <w:pPr>
         <w:spacing w:before="0" w:after="0"/>
-        <w:ind w:left="283" w:right="283"/>
+        <w:ind w:left="227" w:right="227"/>
         <w:shd w:val="clear" w:color="auto" w:fill="F0F0F0"/>
       </w:pPr>
       <w:r>
@@ -2499,7 +2508,7 @@
     <w:p>
       <w:pPr>
         <w:spacing w:before="0" w:after="0"/>
-        <w:ind w:left="283" w:right="283"/>
+        <w:ind w:left="227" w:right="227"/>
         <w:shd w:val="clear" w:color="auto" w:fill="F0F0F0"/>
       </w:pPr>
       <w:r>
@@ -2514,7 +2523,7 @@
     <w:p>
       <w:pPr>
         <w:spacing w:before="0" w:after="0"/>
-        <w:ind w:left="283" w:right="283"/>
+        <w:ind w:left="227" w:right="227"/>
         <w:shd w:val="clear" w:color="auto" w:fill="F0F0F0"/>
       </w:pPr>
       <w:r>
@@ -2529,7 +2538,7 @@
     <w:p>
       <w:pPr>
         <w:spacing w:before="0" w:after="0"/>
-        <w:ind w:left="283" w:right="283"/>
+        <w:ind w:left="227" w:right="227"/>
         <w:shd w:val="clear" w:color="auto" w:fill="F0F0F0"/>
       </w:pPr>
       <w:r>
@@ -2544,7 +2553,7 @@
     <w:p>
       <w:pPr>
         <w:spacing w:before="0" w:after="0"/>
-        <w:ind w:left="283" w:right="283"/>
+        <w:ind w:left="227" w:right="227"/>
         <w:shd w:val="clear" w:color="auto" w:fill="F0F0F0"/>
       </w:pPr>
       <w:r>
@@ -2559,7 +2568,7 @@
     <w:p>
       <w:pPr>
         <w:spacing w:before="0" w:after="0"/>
-        <w:ind w:left="283" w:right="283"/>
+        <w:ind w:left="227" w:right="227"/>
         <w:shd w:val="clear" w:color="auto" w:fill="F0F0F0"/>
       </w:pPr>
       <w:r>
@@ -2574,7 +2583,7 @@
     <w:p>
       <w:pPr>
         <w:spacing w:before="0" w:after="0"/>
-        <w:ind w:left="283" w:right="283"/>
+        <w:ind w:left="227" w:right="227"/>
         <w:shd w:val="clear" w:color="auto" w:fill="F0F0F0"/>
       </w:pPr>
       <w:r>
@@ -2589,7 +2598,7 @@
     <w:p>
       <w:pPr>
         <w:spacing w:before="0" w:after="0"/>
-        <w:ind w:left="283" w:right="283"/>
+        <w:ind w:left="227" w:right="227"/>
         <w:shd w:val="clear" w:color="auto" w:fill="F0F0F0"/>
       </w:pPr>
       <w:r>
@@ -2604,7 +2613,7 @@
     <w:p>
       <w:pPr>
         <w:spacing w:before="0" w:after="0"/>
-        <w:ind w:left="283" w:right="283"/>
+        <w:ind w:left="227" w:right="227"/>
         <w:shd w:val="clear" w:color="auto" w:fill="F0F0F0"/>
       </w:pPr>
       <w:r>
@@ -2619,7 +2628,7 @@
     <w:p>
       <w:pPr>
         <w:spacing w:before="0" w:after="0"/>
-        <w:ind w:left="283" w:right="283"/>
+        <w:ind w:left="227" w:right="227"/>
         <w:shd w:val="clear" w:color="auto" w:fill="F0F0F0"/>
       </w:pPr>
       <w:r>
@@ -2634,7 +2643,7 @@
     <w:p>
       <w:pPr>
         <w:spacing w:before="0" w:after="0"/>
-        <w:ind w:left="283" w:right="283"/>
+        <w:ind w:left="227" w:right="227"/>
         <w:shd w:val="clear" w:color="auto" w:fill="F0F0F0"/>
       </w:pPr>
       <w:r>
@@ -2649,7 +2658,7 @@
     <w:p>
       <w:pPr>
         <w:spacing w:before="0" w:after="0"/>
-        <w:ind w:left="283" w:right="283"/>
+        <w:ind w:left="227" w:right="227"/>
         <w:shd w:val="clear" w:color="auto" w:fill="F0F0F0"/>
       </w:pPr>
       <w:r>
@@ -2664,7 +2673,7 @@
     <w:p>
       <w:pPr>
         <w:spacing w:before="0" w:after="0"/>
-        <w:ind w:left="283" w:right="283"/>
+        <w:ind w:left="227" w:right="227"/>
         <w:shd w:val="clear" w:color="auto" w:fill="F0F0F0"/>
       </w:pPr>
       <w:r>
@@ -2679,7 +2688,7 @@
     <w:p>
       <w:pPr>
         <w:spacing w:before="0" w:after="0"/>
-        <w:ind w:left="283" w:right="283"/>
+        <w:ind w:left="227" w:right="227"/>
         <w:shd w:val="clear" w:color="auto" w:fill="F0F0F0"/>
       </w:pPr>
       <w:r>
@@ -2694,7 +2703,7 @@
     <w:p>
       <w:pPr>
         <w:spacing w:before="0" w:after="0"/>
-        <w:ind w:left="283" w:right="283"/>
+        <w:ind w:left="227" w:right="227"/>
         <w:shd w:val="clear" w:color="auto" w:fill="F0F0F0"/>
       </w:pPr>
       <w:r>
@@ -2709,7 +2718,7 @@
     <w:p>
       <w:pPr>
         <w:spacing w:before="0" w:after="0"/>
-        <w:ind w:left="283" w:right="283"/>
+        <w:ind w:left="227" w:right="227"/>
         <w:shd w:val="clear" w:color="auto" w:fill="F0F0F0"/>
       </w:pPr>
       <w:r>
@@ -2724,7 +2733,7 @@
     <w:p>
       <w:pPr>
         <w:spacing w:before="0" w:after="0"/>
-        <w:ind w:left="283" w:right="283"/>
+        <w:ind w:left="227" w:right="227"/>
         <w:shd w:val="clear" w:color="auto" w:fill="F0F0F0"/>
       </w:pPr>
       <w:r>
@@ -2739,7 +2748,7 @@
     <w:p>
       <w:pPr>
         <w:spacing w:before="0" w:after="0"/>
-        <w:ind w:left="283" w:right="283"/>
+        <w:ind w:left="227" w:right="227"/>
         <w:shd w:val="clear" w:color="auto" w:fill="F0F0F0"/>
       </w:pPr>
       <w:r>
@@ -2754,7 +2763,7 @@
     <w:p>
       <w:pPr>
         <w:spacing w:before="0" w:after="0"/>
-        <w:ind w:left="283" w:right="283"/>
+        <w:ind w:left="227" w:right="227"/>
         <w:shd w:val="clear" w:color="auto" w:fill="F0F0F0"/>
       </w:pPr>
       <w:r>
@@ -2769,7 +2778,7 @@
     <w:p>
       <w:pPr>
         <w:spacing w:before="0" w:after="0"/>
-        <w:ind w:left="283" w:right="283"/>
+        <w:ind w:left="227" w:right="227"/>
         <w:shd w:val="clear" w:color="auto" w:fill="F0F0F0"/>
       </w:pPr>
       <w:r>
@@ -2784,7 +2793,7 @@
     <w:p>
       <w:pPr>
         <w:spacing w:before="0" w:after="0"/>
-        <w:ind w:left="283" w:right="283"/>
+        <w:ind w:left="227" w:right="227"/>
         <w:shd w:val="clear" w:color="auto" w:fill="F0F0F0"/>
       </w:pPr>
       <w:r>
@@ -2799,7 +2808,7 @@
     <w:p>
       <w:pPr>
         <w:spacing w:before="0" w:after="0"/>
-        <w:ind w:left="283" w:right="283"/>
+        <w:ind w:left="227" w:right="227"/>
         <w:shd w:val="clear" w:color="auto" w:fill="F0F0F0"/>
       </w:pPr>
       <w:r>
@@ -2814,7 +2823,7 @@
     <w:p>
       <w:pPr>
         <w:spacing w:before="0" w:after="0"/>
-        <w:ind w:left="283" w:right="283"/>
+        <w:ind w:left="227" w:right="227"/>
         <w:shd w:val="clear" w:color="auto" w:fill="F0F0F0"/>
       </w:pPr>
       <w:r>
@@ -2829,7 +2838,7 @@
     <w:p>
       <w:pPr>
         <w:spacing w:before="0" w:after="0"/>
-        <w:ind w:left="283" w:right="283"/>
+        <w:ind w:left="227" w:right="227"/>
         <w:shd w:val="clear" w:color="auto" w:fill="F0F0F0"/>
       </w:pPr>
       <w:r>
@@ -2844,7 +2853,7 @@
     <w:p>
       <w:pPr>
         <w:spacing w:before="0" w:after="0"/>
-        <w:ind w:left="283" w:right="283"/>
+        <w:ind w:left="227" w:right="227"/>
         <w:shd w:val="clear" w:color="auto" w:fill="F0F0F0"/>
       </w:pPr>
       <w:r>
@@ -2859,7 +2868,7 @@
     <w:p>
       <w:pPr>
         <w:spacing w:before="0" w:after="0"/>
-        <w:ind w:left="283" w:right="283"/>
+        <w:ind w:left="227" w:right="227"/>
         <w:shd w:val="clear" w:color="auto" w:fill="F0F0F0"/>
       </w:pPr>
       <w:r>
@@ -2874,7 +2883,7 @@
     <w:p>
       <w:pPr>
         <w:spacing w:before="0" w:after="0"/>
-        <w:ind w:left="283" w:right="283"/>
+        <w:ind w:left="227" w:right="227"/>
         <w:shd w:val="clear" w:color="auto" w:fill="F0F0F0"/>
       </w:pPr>
       <w:r>
@@ -2889,7 +2898,7 @@
     <w:p>
       <w:pPr>
         <w:spacing w:before="0" w:after="0"/>
-        <w:ind w:left="283" w:right="283"/>
+        <w:ind w:left="227" w:right="227"/>
         <w:shd w:val="clear" w:color="auto" w:fill="F0F0F0"/>
       </w:pPr>
       <w:r>
@@ -2904,7 +2913,7 @@
     <w:p>
       <w:pPr>
         <w:spacing w:before="0" w:after="0"/>
-        <w:ind w:left="283" w:right="283"/>
+        <w:ind w:left="227" w:right="227"/>
         <w:shd w:val="clear" w:color="auto" w:fill="F0F0F0"/>
       </w:pPr>
       <w:r>
@@ -2919,7 +2928,7 @@
     <w:p>
       <w:pPr>
         <w:spacing w:before="0" w:after="0"/>
-        <w:ind w:left="283" w:right="283"/>
+        <w:ind w:left="227" w:right="227"/>
         <w:shd w:val="clear" w:color="auto" w:fill="F0F0F0"/>
       </w:pPr>
       <w:r>
@@ -2934,7 +2943,7 @@
     <w:p>
       <w:pPr>
         <w:spacing w:before="0" w:after="0"/>
-        <w:ind w:left="283" w:right="283"/>
+        <w:ind w:left="227" w:right="227"/>
         <w:shd w:val="clear" w:color="auto" w:fill="F0F0F0"/>
       </w:pPr>
       <w:r>
@@ -2949,7 +2958,7 @@
     <w:p>
       <w:pPr>
         <w:spacing w:before="0" w:after="0"/>
-        <w:ind w:left="283" w:right="283"/>
+        <w:ind w:left="227" w:right="227"/>
         <w:shd w:val="clear" w:color="auto" w:fill="F0F0F0"/>
       </w:pPr>
       <w:r>
@@ -2964,7 +2973,7 @@
     <w:p>
       <w:pPr>
         <w:spacing w:before="0" w:after="0"/>
-        <w:ind w:left="283" w:right="283"/>
+        <w:ind w:left="227" w:right="227"/>
         <w:shd w:val="clear" w:color="auto" w:fill="F0F0F0"/>
       </w:pPr>
       <w:r>
@@ -2979,7 +2988,7 @@
     <w:p>
       <w:pPr>
         <w:spacing w:before="0" w:after="0"/>
-        <w:ind w:left="283" w:right="283"/>
+        <w:ind w:left="227" w:right="227"/>
         <w:shd w:val="clear" w:color="auto" w:fill="F0F0F0"/>
       </w:pPr>
       <w:r>
@@ -2994,7 +3003,7 @@
     <w:p>
       <w:pPr>
         <w:spacing w:before="0" w:after="0"/>
-        <w:ind w:left="283" w:right="283"/>
+        <w:ind w:left="227" w:right="227"/>
         <w:shd w:val="clear" w:color="auto" w:fill="F0F0F0"/>
       </w:pPr>
       <w:r>
@@ -3009,7 +3018,7 @@
     <w:p>
       <w:pPr>
         <w:spacing w:before="0" w:after="0"/>
-        <w:ind w:left="283" w:right="283"/>
+        <w:ind w:left="227" w:right="227"/>
         <w:shd w:val="clear" w:color="auto" w:fill="F0F0F0"/>
       </w:pPr>
       <w:r>
@@ -3024,7 +3033,7 @@
     <w:p>
       <w:pPr>
         <w:spacing w:before="0" w:after="0"/>
-        <w:ind w:left="283" w:right="283"/>
+        <w:ind w:left="227" w:right="227"/>
         <w:shd w:val="clear" w:color="auto" w:fill="F0F0F0"/>
       </w:pPr>
       <w:r>
@@ -3039,7 +3048,7 @@
     <w:p>
       <w:pPr>
         <w:spacing w:before="0" w:after="0"/>
-        <w:ind w:left="283" w:right="283"/>
+        <w:ind w:left="227" w:right="227"/>
         <w:shd w:val="clear" w:color="auto" w:fill="F0F0F0"/>
       </w:pPr>
       <w:r>
@@ -3054,7 +3063,7 @@
     <w:p>
       <w:pPr>
         <w:spacing w:before="0" w:after="0"/>
-        <w:ind w:left="283" w:right="283"/>
+        <w:ind w:left="227" w:right="227"/>
         <w:shd w:val="clear" w:color="auto" w:fill="F0F0F0"/>
       </w:pPr>
       <w:r>
@@ -3069,7 +3078,7 @@
     <w:p>
       <w:pPr>
         <w:spacing w:before="0" w:after="0"/>
-        <w:ind w:left="283" w:right="283"/>
+        <w:ind w:left="227" w:right="227"/>
         <w:shd w:val="clear" w:color="auto" w:fill="F0F0F0"/>
       </w:pPr>
       <w:r>
@@ -3084,7 +3093,7 @@
     <w:p>
       <w:pPr>
         <w:spacing w:before="0" w:after="0"/>
-        <w:ind w:left="283" w:right="283"/>
+        <w:ind w:left="227" w:right="227"/>
         <w:shd w:val="clear" w:color="auto" w:fill="F0F0F0"/>
       </w:pPr>
       <w:r>
@@ -3099,7 +3108,7 @@
     <w:p>
       <w:pPr>
         <w:spacing w:before="0" w:after="0"/>
-        <w:ind w:left="283" w:right="283"/>
+        <w:ind w:left="227" w:right="227"/>
         <w:shd w:val="clear" w:color="auto" w:fill="F0F0F0"/>
       </w:pPr>
       <w:r>
@@ -3114,7 +3123,7 @@
     <w:p>
       <w:pPr>
         <w:spacing w:before="0" w:after="0"/>
-        <w:ind w:left="283" w:right="283"/>
+        <w:ind w:left="227" w:right="227"/>
         <w:shd w:val="clear" w:color="auto" w:fill="F0F0F0"/>
       </w:pPr>
       <w:r>
@@ -3129,7 +3138,7 @@
     <w:p>
       <w:pPr>
         <w:spacing w:before="0" w:after="0"/>
-        <w:ind w:left="283" w:right="283"/>
+        <w:ind w:left="227" w:right="227"/>
         <w:shd w:val="clear" w:color="auto" w:fill="F0F0F0"/>
       </w:pPr>
       <w:r>
@@ -3144,7 +3153,7 @@
     <w:p>
       <w:pPr>
         <w:spacing w:before="0" w:after="0"/>
-        <w:ind w:left="283" w:right="283"/>
+        <w:ind w:left="227" w:right="227"/>
         <w:shd w:val="clear" w:color="auto" w:fill="F0F0F0"/>
       </w:pPr>
       <w:r>
@@ -3159,7 +3168,7 @@
     <w:p>
       <w:pPr>
         <w:spacing w:before="0" w:after="0"/>
-        <w:ind w:left="283" w:right="283"/>
+        <w:ind w:left="227" w:right="227"/>
         <w:shd w:val="clear" w:color="auto" w:fill="F0F0F0"/>
       </w:pPr>
       <w:r>
@@ -3174,7 +3183,7 @@
     <w:p>
       <w:pPr>
         <w:spacing w:before="0" w:after="0"/>
-        <w:ind w:left="283" w:right="283"/>
+        <w:ind w:left="227" w:right="227"/>
         <w:shd w:val="clear" w:color="auto" w:fill="F0F0F0"/>
       </w:pPr>
       <w:r>
@@ -3189,7 +3198,7 @@
     <w:p>
       <w:pPr>
         <w:spacing w:before="0" w:after="0"/>
-        <w:ind w:left="283" w:right="283"/>
+        <w:ind w:left="227" w:right="227"/>
         <w:shd w:val="clear" w:color="auto" w:fill="F0F0F0"/>
       </w:pPr>
       <w:r>
@@ -3204,7 +3213,7 @@
     <w:p>
       <w:pPr>
         <w:spacing w:before="0" w:after="0"/>
-        <w:ind w:left="283" w:right="283"/>
+        <w:ind w:left="227" w:right="227"/>
         <w:shd w:val="clear" w:color="auto" w:fill="F0F0F0"/>
       </w:pPr>
       <w:r>
@@ -3219,7 +3228,7 @@
     <w:p>
       <w:pPr>
         <w:spacing w:before="0" w:after="0"/>
-        <w:ind w:left="283" w:right="283"/>
+        <w:ind w:left="227" w:right="227"/>
         <w:shd w:val="clear" w:color="auto" w:fill="F0F0F0"/>
       </w:pPr>
       <w:r>
@@ -3234,7 +3243,7 @@
     <w:p>
       <w:pPr>
         <w:spacing w:before="0" w:after="0"/>
-        <w:ind w:left="283" w:right="283"/>
+        <w:ind w:left="227" w:right="227"/>
         <w:shd w:val="clear" w:color="auto" w:fill="F0F0F0"/>
       </w:pPr>
       <w:r>
@@ -3249,7 +3258,7 @@
     <w:p>
       <w:pPr>
         <w:spacing w:before="0" w:after="0"/>
-        <w:ind w:left="283" w:right="283"/>
+        <w:ind w:left="227" w:right="227"/>
         <w:shd w:val="clear" w:color="auto" w:fill="F0F0F0"/>
       </w:pPr>
       <w:r>
@@ -3264,7 +3273,7 @@
     <w:p>
       <w:pPr>
         <w:spacing w:before="0" w:after="0"/>
-        <w:ind w:left="283" w:right="283"/>
+        <w:ind w:left="227" w:right="227"/>
         <w:shd w:val="clear" w:color="auto" w:fill="F0F0F0"/>
       </w:pPr>
       <w:r>
@@ -3279,7 +3288,7 @@
     <w:p>
       <w:pPr>
         <w:spacing w:before="0" w:after="0"/>
-        <w:ind w:left="283" w:right="283"/>
+        <w:ind w:left="227" w:right="227"/>
         <w:shd w:val="clear" w:color="auto" w:fill="F0F0F0"/>
       </w:pPr>
       <w:r>
@@ -3294,7 +3303,7 @@
     <w:p>
       <w:pPr>
         <w:spacing w:before="0" w:after="0"/>
-        <w:ind w:left="283" w:right="283"/>
+        <w:ind w:left="227" w:right="227"/>
         <w:shd w:val="clear" w:color="auto" w:fill="F0F0F0"/>
       </w:pPr>
       <w:r>
@@ -3309,7 +3318,7 @@
     <w:p>
       <w:pPr>
         <w:spacing w:before="0" w:after="0"/>
-        <w:ind w:left="283" w:right="283"/>
+        <w:ind w:left="227" w:right="227"/>
         <w:shd w:val="clear" w:color="auto" w:fill="F0F0F0"/>
       </w:pPr>
       <w:r>
@@ -3324,7 +3333,7 @@
     <w:p>
       <w:pPr>
         <w:spacing w:before="0" w:after="0"/>
-        <w:ind w:left="283" w:right="283"/>
+        <w:ind w:left="227" w:right="227"/>
         <w:shd w:val="clear" w:color="auto" w:fill="F0F0F0"/>
       </w:pPr>
       <w:r>
@@ -3339,7 +3348,7 @@
     <w:p>
       <w:pPr>
         <w:spacing w:before="0" w:after="0"/>
-        <w:ind w:left="283" w:right="283"/>
+        <w:ind w:left="227" w:right="227"/>
         <w:shd w:val="clear" w:color="auto" w:fill="F0F0F0"/>
       </w:pPr>
       <w:r>
@@ -3354,7 +3363,7 @@
     <w:p>
       <w:pPr>
         <w:spacing w:before="0" w:after="0"/>
-        <w:ind w:left="283" w:right="283"/>
+        <w:ind w:left="227" w:right="227"/>
         <w:shd w:val="clear" w:color="auto" w:fill="F0F0F0"/>
       </w:pPr>
       <w:r>
@@ -3369,7 +3378,7 @@
     <w:p>
       <w:pPr>
         <w:spacing w:before="0" w:after="0"/>
-        <w:ind w:left="283" w:right="283"/>
+        <w:ind w:left="227" w:right="227"/>
         <w:shd w:val="clear" w:color="auto" w:fill="F0F0F0"/>
       </w:pPr>
       <w:r>
@@ -3384,7 +3393,7 @@
     <w:p>
       <w:pPr>
         <w:spacing w:before="0" w:after="0"/>
-        <w:ind w:left="283" w:right="283"/>
+        <w:ind w:left="227" w:right="227"/>
         <w:shd w:val="clear" w:color="auto" w:fill="F0F0F0"/>
       </w:pPr>
       <w:r>
@@ -3399,7 +3408,7 @@
     <w:p>
       <w:pPr>
         <w:spacing w:before="0" w:after="0"/>
-        <w:ind w:left="283" w:right="283"/>
+        <w:ind w:left="227" w:right="227"/>
         <w:shd w:val="clear" w:color="auto" w:fill="F0F0F0"/>
       </w:pPr>
       <w:r>
@@ -3414,7 +3423,7 @@
     <w:p>
       <w:pPr>
         <w:spacing w:before="0" w:after="0"/>
-        <w:ind w:left="283" w:right="283"/>
+        <w:ind w:left="227" w:right="227"/>
         <w:shd w:val="clear" w:color="auto" w:fill="F0F0F0"/>
       </w:pPr>
       <w:r>
@@ -3429,7 +3438,7 @@
     <w:p>
       <w:pPr>
         <w:spacing w:before="0" w:after="0"/>
-        <w:ind w:left="283" w:right="283"/>
+        <w:ind w:left="227" w:right="227"/>
         <w:shd w:val="clear" w:color="auto" w:fill="F0F0F0"/>
       </w:pPr>
       <w:r>
@@ -3444,7 +3453,7 @@
     <w:p>
       <w:pPr>
         <w:spacing w:before="0" w:after="0"/>
-        <w:ind w:left="283" w:right="283"/>
+        <w:ind w:left="227" w:right="227"/>
         <w:shd w:val="clear" w:color="auto" w:fill="F0F0F0"/>
       </w:pPr>
       <w:r>
@@ -3459,7 +3468,7 @@
     <w:p>
       <w:pPr>
         <w:spacing w:before="0" w:after="0"/>
-        <w:ind w:left="283" w:right="283"/>
+        <w:ind w:left="227" w:right="227"/>
         <w:shd w:val="clear" w:color="auto" w:fill="F0F0F0"/>
       </w:pPr>
       <w:r>
@@ -3474,7 +3483,7 @@
     <w:p>
       <w:pPr>
         <w:spacing w:before="0" w:after="0"/>
-        <w:ind w:left="283" w:right="283"/>
+        <w:ind w:left="227" w:right="227"/>
         <w:shd w:val="clear" w:color="auto" w:fill="F0F0F0"/>
       </w:pPr>
       <w:r>
@@ -3489,7 +3498,7 @@
     <w:p>
       <w:pPr>
         <w:spacing w:before="0" w:after="0"/>
-        <w:ind w:left="283" w:right="283"/>
+        <w:ind w:left="227" w:right="227"/>
         <w:shd w:val="clear" w:color="auto" w:fill="F0F0F0"/>
       </w:pPr>
       <w:r>
@@ -3504,7 +3513,7 @@
     <w:p>
       <w:pPr>
         <w:spacing w:before="0" w:after="0"/>
-        <w:ind w:left="283" w:right="283"/>
+        <w:ind w:left="227" w:right="227"/>
         <w:shd w:val="clear" w:color="auto" w:fill="F0F0F0"/>
       </w:pPr>
       <w:r>
@@ -3519,7 +3528,7 @@
     <w:p>
       <w:pPr>
         <w:spacing w:before="0" w:after="0"/>
-        <w:ind w:left="283" w:right="283"/>
+        <w:ind w:left="227" w:right="227"/>
         <w:shd w:val="clear" w:color="auto" w:fill="F0F0F0"/>
       </w:pPr>
       <w:r>
@@ -3534,7 +3543,7 @@
     <w:p>
       <w:pPr>
         <w:spacing w:before="0" w:after="0"/>
-        <w:ind w:left="283" w:right="283"/>
+        <w:ind w:left="227" w:right="227"/>
         <w:shd w:val="clear" w:color="auto" w:fill="F0F0F0"/>
       </w:pPr>
       <w:r>
@@ -3549,7 +3558,7 @@
     <w:p>
       <w:pPr>
         <w:spacing w:before="0" w:after="0"/>
-        <w:ind w:left="283" w:right="283"/>
+        <w:ind w:left="227" w:right="227"/>
         <w:shd w:val="clear" w:color="auto" w:fill="F0F0F0"/>
       </w:pPr>
       <w:r>
@@ -3564,7 +3573,7 @@
     <w:p>
       <w:pPr>
         <w:spacing w:before="0" w:after="0"/>
-        <w:ind w:left="283" w:right="283"/>
+        <w:ind w:left="227" w:right="227"/>
         <w:shd w:val="clear" w:color="auto" w:fill="F0F0F0"/>
       </w:pPr>
       <w:r>
@@ -3579,7 +3588,7 @@
     <w:p>
       <w:pPr>
         <w:spacing w:before="0" w:after="0"/>
-        <w:ind w:left="283" w:right="283"/>
+        <w:ind w:left="227" w:right="227"/>
         <w:shd w:val="clear" w:color="auto" w:fill="F0F0F0"/>
       </w:pPr>
       <w:r>
@@ -3594,7 +3603,7 @@
     <w:p>
       <w:pPr>
         <w:spacing w:before="0" w:after="0"/>
-        <w:ind w:left="283" w:right="283"/>
+        <w:ind w:left="227" w:right="227"/>
         <w:shd w:val="clear" w:color="auto" w:fill="F0F0F0"/>
       </w:pPr>
       <w:r>
@@ -3609,7 +3618,7 @@
     <w:p>
       <w:pPr>
         <w:spacing w:before="0" w:after="0"/>
-        <w:ind w:left="283" w:right="283"/>
+        <w:ind w:left="227" w:right="227"/>
         <w:shd w:val="clear" w:color="auto" w:fill="F0F0F0"/>
       </w:pPr>
       <w:r>
@@ -3624,7 +3633,7 @@
     <w:p>
       <w:pPr>
         <w:spacing w:before="0" w:after="0"/>
-        <w:ind w:left="283" w:right="283"/>
+        <w:ind w:left="227" w:right="227"/>
         <w:shd w:val="clear" w:color="auto" w:fill="F0F0F0"/>
       </w:pPr>
       <w:r>
@@ -3639,7 +3648,7 @@
     <w:p>
       <w:pPr>
         <w:spacing w:before="0" w:after="0"/>
-        <w:ind w:left="283" w:right="283"/>
+        <w:ind w:left="227" w:right="227"/>
         <w:shd w:val="clear" w:color="auto" w:fill="F0F0F0"/>
       </w:pPr>
       <w:r>
@@ -3654,7 +3663,7 @@
     <w:p>
       <w:pPr>
         <w:spacing w:before="0" w:after="0"/>
-        <w:ind w:left="283" w:right="283"/>
+        <w:ind w:left="227" w:right="227"/>
         <w:shd w:val="clear" w:color="auto" w:fill="F0F0F0"/>
       </w:pPr>
       <w:r>
@@ -3669,7 +3678,7 @@
     <w:p>
       <w:pPr>
         <w:spacing w:before="0" w:after="0"/>
-        <w:ind w:left="283" w:right="283"/>
+        <w:ind w:left="227" w:right="227"/>
         <w:shd w:val="clear" w:color="auto" w:fill="F0F0F0"/>
       </w:pPr>
       <w:r>
@@ -3684,7 +3693,7 @@
     <w:p>
       <w:pPr>
         <w:spacing w:before="0" w:after="0"/>
-        <w:ind w:left="283" w:right="283"/>
+        <w:ind w:left="227" w:right="227"/>
         <w:shd w:val="clear" w:color="auto" w:fill="F0F0F0"/>
       </w:pPr>
       <w:r>
@@ -3699,7 +3708,7 @@
     <w:p>
       <w:pPr>
         <w:spacing w:before="0" w:after="0"/>
-        <w:ind w:left="283" w:right="283"/>
+        <w:ind w:left="227" w:right="227"/>
         <w:shd w:val="clear" w:color="auto" w:fill="F0F0F0"/>
       </w:pPr>
       <w:r>
@@ -3714,7 +3723,7 @@
     <w:p>
       <w:pPr>
         <w:spacing w:before="0" w:after="0"/>
-        <w:ind w:left="283" w:right="283"/>
+        <w:ind w:left="227" w:right="227"/>
         <w:shd w:val="clear" w:color="auto" w:fill="F0F0F0"/>
       </w:pPr>
       <w:r>
@@ -3729,7 +3738,7 @@
     <w:p>
       <w:pPr>
         <w:spacing w:before="0" w:after="0"/>
-        <w:ind w:left="283" w:right="283"/>
+        <w:ind w:left="227" w:right="227"/>
         <w:shd w:val="clear" w:color="auto" w:fill="F0F0F0"/>
       </w:pPr>
       <w:r>
@@ -3744,7 +3753,7 @@
     <w:p>
       <w:pPr>
         <w:spacing w:before="0" w:after="0"/>
-        <w:ind w:left="283" w:right="283"/>
+        <w:ind w:left="227" w:right="227"/>
         <w:shd w:val="clear" w:color="auto" w:fill="F0F0F0"/>
       </w:pPr>
       <w:r>
@@ -3759,7 +3768,7 @@
     <w:p>
       <w:pPr>
         <w:spacing w:before="0" w:after="0"/>
-        <w:ind w:left="283" w:right="283"/>
+        <w:ind w:left="227" w:right="227"/>
         <w:shd w:val="clear" w:color="auto" w:fill="F0F0F0"/>
       </w:pPr>
       <w:r>
@@ -3774,7 +3783,7 @@
     <w:p>
       <w:pPr>
         <w:spacing w:before="0" w:after="0"/>
-        <w:ind w:left="283" w:right="283"/>
+        <w:ind w:left="227" w:right="227"/>
         <w:shd w:val="clear" w:color="auto" w:fill="F0F0F0"/>
       </w:pPr>
       <w:r>
@@ -3789,7 +3798,7 @@
     <w:p>
       <w:pPr>
         <w:spacing w:before="0" w:after="0"/>
-        <w:ind w:left="283" w:right="283"/>
+        <w:ind w:left="227" w:right="227"/>
         <w:shd w:val="clear" w:color="auto" w:fill="F0F0F0"/>
       </w:pPr>
       <w:r>
@@ -3804,7 +3813,7 @@
     <w:p>
       <w:pPr>
         <w:spacing w:before="0" w:after="0"/>
-        <w:ind w:left="283" w:right="283"/>
+        <w:ind w:left="227" w:right="227"/>
         <w:shd w:val="clear" w:color="auto" w:fill="F0F0F0"/>
       </w:pPr>
       <w:r>
@@ -3819,7 +3828,7 @@
     <w:p>
       <w:pPr>
         <w:spacing w:before="0" w:after="0"/>
-        <w:ind w:left="283" w:right="283"/>
+        <w:ind w:left="227" w:right="227"/>
         <w:shd w:val="clear" w:color="auto" w:fill="F0F0F0"/>
       </w:pPr>
       <w:r>
@@ -3834,7 +3843,7 @@
     <w:p>
       <w:pPr>
         <w:spacing w:before="0" w:after="0"/>
-        <w:ind w:left="283" w:right="283"/>
+        <w:ind w:left="227" w:right="227"/>
         <w:shd w:val="clear" w:color="auto" w:fill="F0F0F0"/>
       </w:pPr>
       <w:r>
@@ -3849,7 +3858,7 @@
     <w:p>
       <w:pPr>
         <w:spacing w:before="0" w:after="0"/>
-        <w:ind w:left="283" w:right="283"/>
+        <w:ind w:left="227" w:right="227"/>
         <w:shd w:val="clear" w:color="auto" w:fill="F0F0F0"/>
       </w:pPr>
       <w:r>
@@ -3864,7 +3873,7 @@
     <w:p>
       <w:pPr>
         <w:spacing w:before="0" w:after="0"/>
-        <w:ind w:left="283" w:right="283"/>
+        <w:ind w:left="227" w:right="227"/>
         <w:shd w:val="clear" w:color="auto" w:fill="F0F0F0"/>
       </w:pPr>
       <w:r>
@@ -3879,7 +3888,7 @@
     <w:p>
       <w:pPr>
         <w:spacing w:before="0" w:after="0"/>
-        <w:ind w:left="283" w:right="283"/>
+        <w:ind w:left="227" w:right="227"/>
         <w:shd w:val="clear" w:color="auto" w:fill="F0F0F0"/>
       </w:pPr>
       <w:r>
@@ -3894,7 +3903,7 @@
     <w:p>
       <w:pPr>
         <w:spacing w:before="0" w:after="0"/>
-        <w:ind w:left="283" w:right="283"/>
+        <w:ind w:left="227" w:right="227"/>
         <w:shd w:val="clear" w:color="auto" w:fill="F0F0F0"/>
       </w:pPr>
       <w:r>
@@ -3909,7 +3918,7 @@
     <w:p>
       <w:pPr>
         <w:spacing w:before="0" w:after="0"/>
-        <w:ind w:left="283" w:right="283"/>
+        <w:ind w:left="227" w:right="227"/>
         <w:shd w:val="clear" w:color="auto" w:fill="F0F0F0"/>
       </w:pPr>
       <w:r>
@@ -3924,7 +3933,7 @@
     <w:p>
       <w:pPr>
         <w:spacing w:before="0" w:after="0"/>
-        <w:ind w:left="283" w:right="283"/>
+        <w:ind w:left="227" w:right="227"/>
         <w:shd w:val="clear" w:color="auto" w:fill="F0F0F0"/>
       </w:pPr>
       <w:r>
@@ -3939,7 +3948,7 @@
     <w:p>
       <w:pPr>
         <w:spacing w:before="0" w:after="0"/>
-        <w:ind w:left="283" w:right="283"/>
+        <w:ind w:left="227" w:right="227"/>
         <w:shd w:val="clear" w:color="auto" w:fill="F0F0F0"/>
       </w:pPr>
       <w:r>
@@ -3954,7 +3963,7 @@
     <w:p>
       <w:pPr>
         <w:spacing w:before="0" w:after="0"/>
-        <w:ind w:left="283" w:right="283"/>
+        <w:ind w:left="227" w:right="227"/>
         <w:shd w:val="clear" w:color="auto" w:fill="F0F0F0"/>
       </w:pPr>
       <w:r>
@@ -3969,7 +3978,7 @@
     <w:p>
       <w:pPr>
         <w:spacing w:before="0" w:after="0"/>
-        <w:ind w:left="283" w:right="283"/>
+        <w:ind w:left="227" w:right="227"/>
         <w:shd w:val="clear" w:color="auto" w:fill="F0F0F0"/>
       </w:pPr>
       <w:r>
@@ -3984,7 +3993,7 @@
     <w:p>
       <w:pPr>
         <w:spacing w:before="0" w:after="0"/>
-        <w:ind w:left="283" w:right="283"/>
+        <w:ind w:left="227" w:right="227"/>
         <w:shd w:val="clear" w:color="auto" w:fill="F0F0F0"/>
       </w:pPr>
       <w:r>
@@ -3999,7 +4008,7 @@
     <w:p>
       <w:pPr>
         <w:spacing w:before="0" w:after="0"/>
-        <w:ind w:left="283" w:right="283"/>
+        <w:ind w:left="227" w:right="227"/>
         <w:shd w:val="clear" w:color="auto" w:fill="F0F0F0"/>
       </w:pPr>
       <w:r>
@@ -4014,7 +4023,7 @@
     <w:p>
       <w:pPr>
         <w:spacing w:before="0" w:after="0"/>
-        <w:ind w:left="283" w:right="283"/>
+        <w:ind w:left="227" w:right="227"/>
         <w:shd w:val="clear" w:color="auto" w:fill="F0F0F0"/>
       </w:pPr>
       <w:r>
@@ -4029,7 +4038,7 @@
     <w:p>
       <w:pPr>
         <w:spacing w:before="0" w:after="0"/>
-        <w:ind w:left="283" w:right="283"/>
+        <w:ind w:left="227" w:right="227"/>
         <w:shd w:val="clear" w:color="auto" w:fill="F0F0F0"/>
       </w:pPr>
       <w:r>
@@ -4044,7 +4053,7 @@
     <w:p>
       <w:pPr>
         <w:spacing w:before="0" w:after="0"/>
-        <w:ind w:left="283" w:right="283"/>
+        <w:ind w:left="227" w:right="227"/>
         <w:shd w:val="clear" w:color="auto" w:fill="F0F0F0"/>
       </w:pPr>
       <w:r>
@@ -4059,7 +4068,7 @@
     <w:p>
       <w:pPr>
         <w:spacing w:before="0" w:after="0"/>
-        <w:ind w:left="283" w:right="283"/>
+        <w:ind w:left="227" w:right="227"/>
         <w:shd w:val="clear" w:color="auto" w:fill="F0F0F0"/>
       </w:pPr>
       <w:r>
@@ -4074,7 +4083,7 @@
     <w:p>
       <w:pPr>
         <w:spacing w:before="0" w:after="0"/>
-        <w:ind w:left="283" w:right="283"/>
+        <w:ind w:left="227" w:right="227"/>
         <w:shd w:val="clear" w:color="auto" w:fill="F0F0F0"/>
       </w:pPr>
       <w:r>
@@ -4089,7 +4098,7 @@
     <w:p>
       <w:pPr>
         <w:spacing w:before="0" w:after="0"/>
-        <w:ind w:left="283" w:right="283"/>
+        <w:ind w:left="227" w:right="227"/>
         <w:shd w:val="clear" w:color="auto" w:fill="F0F0F0"/>
       </w:pPr>
       <w:r>
@@ -4104,7 +4113,7 @@
     <w:p>
       <w:pPr>
         <w:spacing w:before="0" w:after="0"/>
-        <w:ind w:left="283" w:right="283"/>
+        <w:ind w:left="227" w:right="227"/>
         <w:shd w:val="clear" w:color="auto" w:fill="F0F0F0"/>
       </w:pPr>
       <w:r>
@@ -4119,7 +4128,7 @@
     <w:p>
       <w:pPr>
         <w:spacing w:before="0" w:after="0"/>
-        <w:ind w:left="283" w:right="283"/>
+        <w:ind w:left="227" w:right="227"/>
         <w:shd w:val="clear" w:color="auto" w:fill="F0F0F0"/>
       </w:pPr>
       <w:r>
@@ -4134,7 +4143,7 @@
     <w:p>
       <w:pPr>
         <w:spacing w:before="0" w:after="0"/>
-        <w:ind w:left="283" w:right="283"/>
+        <w:ind w:left="227" w:right="227"/>
         <w:shd w:val="clear" w:color="auto" w:fill="F0F0F0"/>
       </w:pPr>
       <w:r>
@@ -4149,7 +4158,7 @@
     <w:p>
       <w:pPr>
         <w:spacing w:before="0" w:after="0"/>
-        <w:ind w:left="283" w:right="283"/>
+        <w:ind w:left="227" w:right="227"/>
         <w:shd w:val="clear" w:color="auto" w:fill="F0F0F0"/>
       </w:pPr>
       <w:r>
@@ -4164,7 +4173,7 @@
     <w:p>
       <w:pPr>
         <w:spacing w:before="0" w:after="0"/>
-        <w:ind w:left="283" w:right="283"/>
+        <w:ind w:left="227" w:right="227"/>
         <w:shd w:val="clear" w:color="auto" w:fill="F0F0F0"/>
       </w:pPr>
       <w:r>
@@ -4179,7 +4188,7 @@
     <w:p>
       <w:pPr>
         <w:spacing w:before="0" w:after="0"/>
-        <w:ind w:left="283" w:right="283"/>
+        <w:ind w:left="227" w:right="227"/>
         <w:shd w:val="clear" w:color="auto" w:fill="F0F0F0"/>
       </w:pPr>
       <w:r>
@@ -4194,7 +4203,7 @@
     <w:p>
       <w:pPr>
         <w:spacing w:before="0" w:after="0"/>
-        <w:ind w:left="283" w:right="283"/>
+        <w:ind w:left="227" w:right="227"/>
         <w:shd w:val="clear" w:color="auto" w:fill="F0F0F0"/>
       </w:pPr>
       <w:r>
@@ -4209,7 +4218,7 @@
     <w:p>
       <w:pPr>
         <w:spacing w:before="0" w:after="0"/>
-        <w:ind w:left="283" w:right="283"/>
+        <w:ind w:left="227" w:right="227"/>
         <w:shd w:val="clear" w:color="auto" w:fill="F0F0F0"/>
       </w:pPr>
       <w:r>
@@ -4224,7 +4233,7 @@
     <w:p>
       <w:pPr>
         <w:spacing w:before="0" w:after="0"/>
-        <w:ind w:left="283" w:right="283"/>
+        <w:ind w:left="227" w:right="227"/>
         <w:shd w:val="clear" w:color="auto" w:fill="F0F0F0"/>
       </w:pPr>
       <w:r>
@@ -4239,7 +4248,7 @@
     <w:p>
       <w:pPr>
         <w:spacing w:before="0" w:after="0"/>
-        <w:ind w:left="283" w:right="283"/>
+        <w:ind w:left="227" w:right="227"/>
         <w:shd w:val="clear" w:color="auto" w:fill="F0F0F0"/>
       </w:pPr>
       <w:r>
@@ -4254,7 +4263,7 @@
     <w:p>
       <w:pPr>
         <w:spacing w:before="0" w:after="0"/>
-        <w:ind w:left="283" w:right="283"/>
+        <w:ind w:left="227" w:right="227"/>
         <w:shd w:val="clear" w:color="auto" w:fill="F0F0F0"/>
       </w:pPr>
       <w:r>
@@ -4269,7 +4278,7 @@
     <w:p>
       <w:pPr>
         <w:spacing w:before="0" w:after="0"/>
-        <w:ind w:left="283" w:right="283"/>
+        <w:ind w:left="227" w:right="227"/>
         <w:shd w:val="clear" w:color="auto" w:fill="F0F0F0"/>
       </w:pPr>
       <w:r>
@@ -4284,7 +4293,7 @@
     <w:p>
       <w:pPr>
         <w:spacing w:before="0" w:after="0"/>
-        <w:ind w:left="283" w:right="283"/>
+        <w:ind w:left="227" w:right="227"/>
         <w:shd w:val="clear" w:color="auto" w:fill="F0F0F0"/>
       </w:pPr>
       <w:r>
@@ -4299,7 +4308,7 @@
     <w:p>
       <w:pPr>
         <w:spacing w:before="0" w:after="0"/>
-        <w:ind w:left="283" w:right="283"/>
+        <w:ind w:left="227" w:right="227"/>
         <w:shd w:val="clear" w:color="auto" w:fill="F0F0F0"/>
       </w:pPr>
       <w:r>
@@ -4314,7 +4323,7 @@
     <w:p>
       <w:pPr>
         <w:spacing w:before="0" w:after="0"/>
-        <w:ind w:left="283" w:right="283"/>
+        <w:ind w:left="227" w:right="227"/>
         <w:shd w:val="clear" w:color="auto" w:fill="F0F0F0"/>
       </w:pPr>
       <w:r>
@@ -4329,7 +4338,7 @@
     <w:p>
       <w:pPr>
         <w:spacing w:before="0" w:after="0"/>
-        <w:ind w:left="283" w:right="283"/>
+        <w:ind w:left="227" w:right="227"/>
         <w:shd w:val="clear" w:color="auto" w:fill="F0F0F0"/>
       </w:pPr>
       <w:r>
@@ -4344,7 +4353,7 @@
     <w:p>
       <w:pPr>
         <w:spacing w:before="0" w:after="0"/>
-        <w:ind w:left="283" w:right="283"/>
+        <w:ind w:left="227" w:right="227"/>
         <w:shd w:val="clear" w:color="auto" w:fill="F0F0F0"/>
       </w:pPr>
       <w:r>
@@ -4359,7 +4368,7 @@
     <w:p>
       <w:pPr>
         <w:spacing w:before="0" w:after="0"/>
-        <w:ind w:left="283" w:right="283"/>
+        <w:ind w:left="227" w:right="227"/>
         <w:shd w:val="clear" w:color="auto" w:fill="F0F0F0"/>
       </w:pPr>
       <w:r>
@@ -4374,7 +4383,7 @@
     <w:p>
       <w:pPr>
         <w:spacing w:before="0" w:after="0"/>
-        <w:ind w:left="283" w:right="283"/>
+        <w:ind w:left="227" w:right="227"/>
         <w:shd w:val="clear" w:color="auto" w:fill="F0F0F0"/>
       </w:pPr>
       <w:r>
@@ -4389,7 +4398,7 @@
     <w:p>
       <w:pPr>
         <w:spacing w:before="0" w:after="0"/>
-        <w:ind w:left="283" w:right="283"/>
+        <w:ind w:left="227" w:right="227"/>
         <w:shd w:val="clear" w:color="auto" w:fill="F0F0F0"/>
       </w:pPr>
       <w:r>
@@ -4404,7 +4413,7 @@
     <w:p>
       <w:pPr>
         <w:spacing w:before="0" w:after="0"/>
-        <w:ind w:left="283" w:right="283"/>
+        <w:ind w:left="227" w:right="227"/>
         <w:shd w:val="clear" w:color="auto" w:fill="F0F0F0"/>
       </w:pPr>
       <w:r>
@@ -4419,7 +4428,7 @@
     <w:p>
       <w:pPr>
         <w:spacing w:before="0" w:after="0"/>
-        <w:ind w:left="283" w:right="283"/>
+        <w:ind w:left="227" w:right="227"/>
         <w:shd w:val="clear" w:color="auto" w:fill="F0F0F0"/>
       </w:pPr>
       <w:r>
@@ -4434,7 +4443,7 @@
     <w:p>
       <w:pPr>
         <w:spacing w:before="0" w:after="0"/>
-        <w:ind w:left="283" w:right="283"/>
+        <w:ind w:left="227" w:right="227"/>
         <w:shd w:val="clear" w:color="auto" w:fill="F0F0F0"/>
       </w:pPr>
       <w:r>
@@ -4449,7 +4458,7 @@
     <w:p>
       <w:pPr>
         <w:spacing w:before="0" w:after="0"/>
-        <w:ind w:left="283" w:right="283"/>
+        <w:ind w:left="227" w:right="227"/>
         <w:shd w:val="clear" w:color="auto" w:fill="F0F0F0"/>
       </w:pPr>
       <w:r>
@@ -4464,7 +4473,7 @@
     <w:p>
       <w:pPr>
         <w:spacing w:before="0" w:after="0"/>
-        <w:ind w:left="283" w:right="283"/>
+        <w:ind w:left="227" w:right="227"/>
         <w:shd w:val="clear" w:color="auto" w:fill="F0F0F0"/>
       </w:pPr>
       <w:r>
@@ -4479,7 +4488,7 @@
     <w:p>
       <w:pPr>
         <w:spacing w:before="0" w:after="0"/>
-        <w:ind w:left="283" w:right="283"/>
+        <w:ind w:left="227" w:right="227"/>
         <w:shd w:val="clear" w:color="auto" w:fill="F0F0F0"/>
       </w:pPr>
       <w:r>
@@ -4494,7 +4503,7 @@
     <w:p>
       <w:pPr>
         <w:spacing w:before="0" w:after="0"/>
-        <w:ind w:left="283" w:right="283"/>
+        <w:ind w:left="227" w:right="227"/>
         <w:shd w:val="clear" w:color="auto" w:fill="F0F0F0"/>
       </w:pPr>
       <w:r>
@@ -4509,7 +4518,7 @@
     <w:p>
       <w:pPr>
         <w:spacing w:before="0" w:after="0"/>
-        <w:ind w:left="283" w:right="283"/>
+        <w:ind w:left="227" w:right="227"/>
         <w:shd w:val="clear" w:color="auto" w:fill="F0F0F0"/>
       </w:pPr>
       <w:r>
@@ -4524,7 +4533,7 @@
     <w:p>
       <w:pPr>
         <w:spacing w:before="0" w:after="0"/>
-        <w:ind w:left="283" w:right="283"/>
+        <w:ind w:left="227" w:right="227"/>
         <w:shd w:val="clear" w:color="auto" w:fill="F0F0F0"/>
       </w:pPr>
       <w:r>
@@ -4539,7 +4548,7 @@
     <w:p>
       <w:pPr>
         <w:spacing w:before="0" w:after="0"/>
-        <w:ind w:left="283" w:right="283"/>
+        <w:ind w:left="227" w:right="227"/>
         <w:shd w:val="clear" w:color="auto" w:fill="F0F0F0"/>
       </w:pPr>
       <w:r>
@@ -4554,7 +4563,7 @@
     <w:p>
       <w:pPr>
         <w:spacing w:before="0" w:after="0"/>
-        <w:ind w:left="283" w:right="283"/>
+        <w:ind w:left="227" w:right="227"/>
         <w:shd w:val="clear" w:color="auto" w:fill="F0F0F0"/>
       </w:pPr>
       <w:r>
@@ -4569,7 +4578,7 @@
     <w:p>
       <w:pPr>
         <w:spacing w:before="0" w:after="0"/>
-        <w:ind w:left="283" w:right="283"/>
+        <w:ind w:left="227" w:right="227"/>
         <w:shd w:val="clear" w:color="auto" w:fill="F0F0F0"/>
       </w:pPr>
       <w:r>
@@ -4584,7 +4593,7 @@
     <w:p>
       <w:pPr>
         <w:spacing w:before="0" w:after="0"/>
-        <w:ind w:left="283" w:right="283"/>
+        <w:ind w:left="227" w:right="227"/>
         <w:shd w:val="clear" w:color="auto" w:fill="F0F0F0"/>
       </w:pPr>
       <w:r>
@@ -4599,7 +4608,7 @@
     <w:p>
       <w:pPr>
         <w:spacing w:before="0" w:after="0"/>
-        <w:ind w:left="283" w:right="283"/>
+        <w:ind w:left="227" w:right="227"/>
         <w:shd w:val="clear" w:color="auto" w:fill="F0F0F0"/>
       </w:pPr>
       <w:r>
@@ -4614,7 +4623,7 @@
     <w:p>
       <w:pPr>
         <w:spacing w:before="0" w:after="0"/>
-        <w:ind w:left="283" w:right="283"/>
+        <w:ind w:left="227" w:right="227"/>
         <w:shd w:val="clear" w:color="auto" w:fill="F0F0F0"/>
       </w:pPr>
       <w:r>
@@ -4629,7 +4638,7 @@
     <w:p>
       <w:pPr>
         <w:spacing w:before="0" w:after="0"/>
-        <w:ind w:left="283" w:right="283"/>
+        <w:ind w:left="227" w:right="227"/>
         <w:shd w:val="clear" w:color="auto" w:fill="F0F0F0"/>
       </w:pPr>
       <w:r>
@@ -4644,7 +4653,7 @@
     <w:p>
       <w:pPr>
         <w:spacing w:before="0" w:after="0"/>
-        <w:ind w:left="283" w:right="283"/>
+        <w:ind w:left="227" w:right="227"/>
         <w:shd w:val="clear" w:color="auto" w:fill="F0F0F0"/>
       </w:pPr>
       <w:r>
@@ -4659,7 +4668,7 @@
     <w:p>
       <w:pPr>
         <w:spacing w:before="0" w:after="0"/>
-        <w:ind w:left="283" w:right="283"/>
+        <w:ind w:left="227" w:right="227"/>
         <w:shd w:val="clear" w:color="auto" w:fill="F0F0F0"/>
       </w:pPr>
       <w:r>
@@ -4674,7 +4683,7 @@
     <w:p>
       <w:pPr>
         <w:spacing w:before="0" w:after="0"/>
-        <w:ind w:left="283" w:right="283"/>
+        <w:ind w:left="227" w:right="227"/>
         <w:shd w:val="clear" w:color="auto" w:fill="F0F0F0"/>
       </w:pPr>
       <w:r>
@@ -4689,7 +4698,7 @@
     <w:p>
       <w:pPr>
         <w:spacing w:before="0" w:after="0"/>
-        <w:ind w:left="283" w:right="283"/>
+        <w:ind w:left="227" w:right="227"/>
         <w:shd w:val="clear" w:color="auto" w:fill="F0F0F0"/>
       </w:pPr>
       <w:r>
@@ -4704,7 +4713,7 @@
     <w:p>
       <w:pPr>
         <w:spacing w:before="0" w:after="0"/>
-        <w:ind w:left="283" w:right="283"/>
+        <w:ind w:left="227" w:right="227"/>
         <w:shd w:val="clear" w:color="auto" w:fill="F0F0F0"/>
       </w:pPr>
       <w:r>
@@ -4719,7 +4728,7 @@
     <w:p>
       <w:pPr>
         <w:spacing w:before="0" w:after="0"/>
-        <w:ind w:left="283" w:right="283"/>
+        <w:ind w:left="227" w:right="227"/>
         <w:shd w:val="clear" w:color="auto" w:fill="F0F0F0"/>
       </w:pPr>
       <w:r>
@@ -4734,7 +4743,7 @@
     <w:p>
       <w:pPr>
         <w:spacing w:before="0" w:after="0"/>
-        <w:ind w:left="283" w:right="283"/>
+        <w:ind w:left="227" w:right="227"/>
         <w:shd w:val="clear" w:color="auto" w:fill="F0F0F0"/>
       </w:pPr>
       <w:r>
@@ -4749,7 +4758,7 @@
     <w:p>
       <w:pPr>
         <w:spacing w:before="0" w:after="0"/>
-        <w:ind w:left="283" w:right="283"/>
+        <w:ind w:left="227" w:right="227"/>
         <w:shd w:val="clear" w:color="auto" w:fill="F0F0F0"/>
       </w:pPr>
       <w:r>
@@ -4764,7 +4773,7 @@
     <w:p>
       <w:pPr>
         <w:spacing w:before="0" w:after="0"/>
-        <w:ind w:left="283" w:right="283"/>
+        <w:ind w:left="227" w:right="227"/>
         <w:shd w:val="clear" w:color="auto" w:fill="F0F0F0"/>
       </w:pPr>
       <w:r>
@@ -4779,7 +4788,7 @@
     <w:p>
       <w:pPr>
         <w:spacing w:before="0" w:after="0"/>
-        <w:ind w:left="283" w:right="283"/>
+        <w:ind w:left="227" w:right="227"/>
         <w:shd w:val="clear" w:color="auto" w:fill="F0F0F0"/>
       </w:pPr>
       <w:r>
@@ -4794,7 +4803,7 @@
     <w:p>
       <w:pPr>
         <w:spacing w:before="0" w:after="0"/>
-        <w:ind w:left="283" w:right="283"/>
+        <w:ind w:left="227" w:right="227"/>
         <w:shd w:val="clear" w:color="auto" w:fill="F0F0F0"/>
       </w:pPr>
       <w:r>
@@ -4809,7 +4818,7 @@
     <w:p>
       <w:pPr>
         <w:spacing w:before="0" w:after="0"/>
-        <w:ind w:left="283" w:right="283"/>
+        <w:ind w:left="227" w:right="227"/>
         <w:shd w:val="clear" w:color="auto" w:fill="F0F0F0"/>
       </w:pPr>
       <w:r>
@@ -4824,7 +4833,7 @@
     <w:p>
       <w:pPr>
         <w:spacing w:before="0" w:after="0"/>
-        <w:ind w:left="283" w:right="283"/>
+        <w:ind w:left="227" w:right="227"/>
         <w:shd w:val="clear" w:color="auto" w:fill="F0F0F0"/>
       </w:pPr>
       <w:r>
@@ -4839,7 +4848,7 @@
     <w:p>
       <w:pPr>
         <w:spacing w:before="0" w:after="0"/>
-        <w:ind w:left="283" w:right="283"/>
+        <w:ind w:left="227" w:right="227"/>
         <w:shd w:val="clear" w:color="auto" w:fill="F0F0F0"/>
       </w:pPr>
       <w:r>
@@ -4854,7 +4863,7 @@
     <w:p>
       <w:pPr>
         <w:spacing w:before="0" w:after="0"/>
-        <w:ind w:left="283" w:right="283"/>
+        <w:ind w:left="227" w:right="227"/>
         <w:shd w:val="clear" w:color="auto" w:fill="F0F0F0"/>
       </w:pPr>
       <w:r>
@@ -4869,7 +4878,7 @@
     <w:p>
       <w:pPr>
         <w:spacing w:before="0" w:after="0"/>
-        <w:ind w:left="283" w:right="283"/>
+        <w:ind w:left="227" w:right="227"/>
         <w:shd w:val="clear" w:color="auto" w:fill="F0F0F0"/>
       </w:pPr>
       <w:r>
@@ -4884,7 +4893,7 @@
     <w:p>
       <w:pPr>
         <w:spacing w:before="0" w:after="0"/>
-        <w:ind w:left="283" w:right="283"/>
+        <w:ind w:left="227" w:right="227"/>
         <w:shd w:val="clear" w:color="auto" w:fill="F0F0F0"/>
       </w:pPr>
       <w:r>
@@ -4899,7 +4908,7 @@
     <w:p>
       <w:pPr>
         <w:spacing w:before="0" w:after="0"/>
-        <w:ind w:left="283" w:right="283"/>
+        <w:ind w:left="227" w:right="227"/>
         <w:shd w:val="clear" w:color="auto" w:fill="F0F0F0"/>
       </w:pPr>
       <w:r>
@@ -4914,7 +4923,7 @@
     <w:p>
       <w:pPr>
         <w:spacing w:before="0" w:after="0"/>
-        <w:ind w:left="283" w:right="283"/>
+        <w:ind w:left="227" w:right="227"/>
         <w:shd w:val="clear" w:color="auto" w:fill="F0F0F0"/>
       </w:pPr>
       <w:r>
@@ -4929,7 +4938,7 @@
     <w:p>
       <w:pPr>
         <w:spacing w:before="0" w:after="0"/>
-        <w:ind w:left="283" w:right="283"/>
+        <w:ind w:left="227" w:right="227"/>
         <w:shd w:val="clear" w:color="auto" w:fill="F0F0F0"/>
       </w:pPr>
       <w:r>
@@ -4944,7 +4953,7 @@
     <w:p>
       <w:pPr>
         <w:spacing w:before="0" w:after="0"/>
-        <w:ind w:left="283" w:right="283"/>
+        <w:ind w:left="227" w:right="227"/>
         <w:shd w:val="clear" w:color="auto" w:fill="F0F0F0"/>
       </w:pPr>
       <w:r>
@@ -4959,7 +4968,7 @@
     <w:p>
       <w:pPr>
         <w:spacing w:before="0" w:after="0"/>
-        <w:ind w:left="283" w:right="283"/>
+        <w:ind w:left="227" w:right="227"/>
         <w:shd w:val="clear" w:color="auto" w:fill="F0F0F0"/>
       </w:pPr>
       <w:r>
@@ -4974,7 +4983,7 @@
     <w:p>
       <w:pPr>
         <w:spacing w:before="0" w:after="0"/>
-        <w:ind w:left="283" w:right="283"/>
+        <w:ind w:left="227" w:right="227"/>
         <w:shd w:val="clear" w:color="auto" w:fill="F0F0F0"/>
       </w:pPr>
       <w:r>
@@ -4989,7 +4998,7 @@
     <w:p>
       <w:pPr>
         <w:spacing w:before="0" w:after="0"/>
-        <w:ind w:left="283" w:right="283"/>
+        <w:ind w:left="227" w:right="227"/>
         <w:shd w:val="clear" w:color="auto" w:fill="F0F0F0"/>
       </w:pPr>
       <w:r>
@@ -5004,7 +5013,7 @@
     <w:p>
       <w:pPr>
         <w:spacing w:before="0" w:after="0"/>
-        <w:ind w:left="283" w:right="283"/>
+        <w:ind w:left="227" w:right="227"/>
         <w:shd w:val="clear" w:color="auto" w:fill="F0F0F0"/>
       </w:pPr>
       <w:r>
@@ -5019,7 +5028,7 @@
     <w:p>
       <w:pPr>
         <w:spacing w:before="0" w:after="0"/>
-        <w:ind w:left="283" w:right="283"/>
+        <w:ind w:left="227" w:right="227"/>
         <w:shd w:val="clear" w:color="auto" w:fill="F0F0F0"/>
       </w:pPr>
       <w:r>
@@ -5034,7 +5043,7 @@
     <w:p>
       <w:pPr>
         <w:spacing w:before="0" w:after="0"/>
-        <w:ind w:left="283" w:right="283"/>
+        <w:ind w:left="227" w:right="227"/>
         <w:shd w:val="clear" w:color="auto" w:fill="F0F0F0"/>
       </w:pPr>
       <w:r>
@@ -5049,7 +5058,7 @@
     <w:p>
       <w:pPr>
         <w:spacing w:before="0" w:after="0"/>
-        <w:ind w:left="283" w:right="283"/>
+        <w:ind w:left="227" w:right="227"/>
         <w:shd w:val="clear" w:color="auto" w:fill="F0F0F0"/>
       </w:pPr>
       <w:r>
@@ -5064,7 +5073,7 @@
     <w:p>
       <w:pPr>
         <w:spacing w:before="0" w:after="0"/>
-        <w:ind w:left="283" w:right="283"/>
+        <w:ind w:left="227" w:right="227"/>
         <w:shd w:val="clear" w:color="auto" w:fill="F0F0F0"/>
       </w:pPr>
       <w:r>
@@ -5079,7 +5088,7 @@
     <w:p>
       <w:pPr>
         <w:spacing w:before="0" w:after="0"/>
-        <w:ind w:left="283" w:right="283"/>
+        <w:ind w:left="227" w:right="227"/>
         <w:shd w:val="clear" w:color="auto" w:fill="F0F0F0"/>
       </w:pPr>
       <w:r>
@@ -5094,7 +5103,7 @@
     <w:p>
       <w:pPr>
         <w:spacing w:before="0" w:after="0"/>
-        <w:ind w:left="283" w:right="283"/>
+        <w:ind w:left="227" w:right="227"/>
         <w:shd w:val="clear" w:color="auto" w:fill="F0F0F0"/>
       </w:pPr>
       <w:r>
@@ -5109,7 +5118,7 @@
     <w:p>
       <w:pPr>
         <w:spacing w:before="0" w:after="0"/>
-        <w:ind w:left="283" w:right="283"/>
+        <w:ind w:left="227" w:right="227"/>
         <w:shd w:val="clear" w:color="auto" w:fill="F0F0F0"/>
       </w:pPr>
       <w:r>
@@ -5124,7 +5133,7 @@
     <w:p>
       <w:pPr>
         <w:spacing w:before="0" w:after="0"/>
-        <w:ind w:left="283" w:right="283"/>
+        <w:ind w:left="227" w:right="227"/>
         <w:shd w:val="clear" w:color="auto" w:fill="F0F0F0"/>
       </w:pPr>
       <w:r>
@@ -5139,7 +5148,7 @@
     <w:p>
       <w:pPr>
         <w:spacing w:before="0" w:after="0"/>
-        <w:ind w:left="283" w:right="283"/>
+        <w:ind w:left="227" w:right="227"/>
         <w:shd w:val="clear" w:color="auto" w:fill="F0F0F0"/>
       </w:pPr>
       <w:r>
@@ -5154,7 +5163,7 @@
     <w:p>
       <w:pPr>
         <w:spacing w:before="0" w:after="0"/>
-        <w:ind w:left="283" w:right="283"/>
+        <w:ind w:left="227" w:right="227"/>
         <w:shd w:val="clear" w:color="auto" w:fill="F0F0F0"/>
       </w:pPr>
       <w:r>
@@ -5169,7 +5178,7 @@
     <w:p>
       <w:pPr>
         <w:spacing w:before="0" w:after="0"/>
-        <w:ind w:left="283" w:right="283"/>
+        <w:ind w:left="227" w:right="227"/>
         <w:shd w:val="clear" w:color="auto" w:fill="F0F0F0"/>
       </w:pPr>
       <w:r>
@@ -5184,7 +5193,7 @@
     <w:p>
       <w:pPr>
         <w:spacing w:before="0" w:after="0"/>
-        <w:ind w:left="283" w:right="283"/>
+        <w:ind w:left="227" w:right="227"/>
         <w:shd w:val="clear" w:color="auto" w:fill="F0F0F0"/>
       </w:pPr>
       <w:r>
@@ -5199,7 +5208,7 @@
     <w:p>
       <w:pPr>
         <w:spacing w:before="0" w:after="0"/>
-        <w:ind w:left="283" w:right="283"/>
+        <w:ind w:left="227" w:right="227"/>
         <w:shd w:val="clear" w:color="auto" w:fill="F0F0F0"/>
       </w:pPr>
       <w:r>
@@ -5214,7 +5223,7 @@
     <w:p>
       <w:pPr>
         <w:spacing w:before="0" w:after="0"/>
-        <w:ind w:left="283" w:right="283"/>
+        <w:ind w:left="227" w:right="227"/>
         <w:shd w:val="clear" w:color="auto" w:fill="F0F0F0"/>
       </w:pPr>
       <w:r>
@@ -5229,7 +5238,7 @@
     <w:p>
       <w:pPr>
         <w:spacing w:before="0" w:after="0"/>
-        <w:ind w:left="283" w:right="283"/>
+        <w:ind w:left="227" w:right="227"/>
         <w:shd w:val="clear" w:color="auto" w:fill="F0F0F0"/>
       </w:pPr>
       <w:r>
@@ -5244,7 +5253,7 @@
     <w:p>
       <w:pPr>
         <w:spacing w:before="0" w:after="0"/>
-        <w:ind w:left="283" w:right="283"/>
+        <w:ind w:left="227" w:right="227"/>
         <w:shd w:val="clear" w:color="auto" w:fill="F0F0F0"/>
       </w:pPr>
       <w:r>
@@ -5259,7 +5268,7 @@
     <w:p>
       <w:pPr>
         <w:spacing w:before="0" w:after="0"/>
-        <w:ind w:left="283" w:right="283"/>
+        <w:ind w:left="227" w:right="227"/>
         <w:shd w:val="clear" w:color="auto" w:fill="F0F0F0"/>
       </w:pPr>
       <w:r>
@@ -5274,7 +5283,7 @@
     <w:p>
       <w:pPr>
         <w:spacing w:before="0" w:after="0"/>
-        <w:ind w:left="283" w:right="283"/>
+        <w:ind w:left="227" w:right="227"/>
         <w:shd w:val="clear" w:color="auto" w:fill="F0F0F0"/>
       </w:pPr>
       <w:r>
@@ -5289,7 +5298,7 @@
     <w:p>
       <w:pPr>
         <w:spacing w:before="0" w:after="0"/>
-        <w:ind w:left="283" w:right="283"/>
+        <w:ind w:left="227" w:right="227"/>
         <w:shd w:val="clear" w:color="auto" w:fill="F0F0F0"/>
       </w:pPr>
       <w:r>
@@ -5304,7 +5313,7 @@
     <w:p>
       <w:pPr>
         <w:spacing w:before="0" w:after="0"/>
-        <w:ind w:left="283" w:right="283"/>
+        <w:ind w:left="227" w:right="227"/>
         <w:shd w:val="clear" w:color="auto" w:fill="F0F0F0"/>
       </w:pPr>
       <w:r>
@@ -5319,7 +5328,7 @@
     <w:p>
       <w:pPr>
         <w:spacing w:before="0" w:after="0"/>
-        <w:ind w:left="283" w:right="283"/>
+        <w:ind w:left="227" w:right="227"/>
         <w:shd w:val="clear" w:color="auto" w:fill="F0F0F0"/>
       </w:pPr>
       <w:r>
@@ -5334,7 +5343,7 @@
     <w:p>
       <w:pPr>
         <w:spacing w:before="0" w:after="0"/>
-        <w:ind w:left="283" w:right="283"/>
+        <w:ind w:left="227" w:right="227"/>
         <w:shd w:val="clear" w:color="auto" w:fill="F0F0F0"/>
       </w:pPr>
       <w:r>
@@ -5349,7 +5358,7 @@
     <w:p>
       <w:pPr>
         <w:spacing w:before="0" w:after="0"/>
-        <w:ind w:left="283" w:right="283"/>
+        <w:ind w:left="227" w:right="227"/>
         <w:shd w:val="clear" w:color="auto" w:fill="F0F0F0"/>
       </w:pPr>
       <w:r>
@@ -5364,7 +5373,7 @@
     <w:p>
       <w:pPr>
         <w:spacing w:before="0" w:after="0"/>
-        <w:ind w:left="283" w:right="283"/>
+        <w:ind w:left="227" w:right="227"/>
         <w:shd w:val="clear" w:color="auto" w:fill="F0F0F0"/>
       </w:pPr>
       <w:r>
@@ -5379,7 +5388,7 @@
     <w:p>
       <w:pPr>
         <w:spacing w:before="0" w:after="0"/>
-        <w:ind w:left="283" w:right="283"/>
+        <w:ind w:left="227" w:right="227"/>
         <w:shd w:val="clear" w:color="auto" w:fill="F0F0F0"/>
       </w:pPr>
       <w:r>
@@ -5394,7 +5403,7 @@
     <w:p>
       <w:pPr>
         <w:spacing w:before="0" w:after="0"/>
-        <w:ind w:left="283" w:right="283"/>
+        <w:ind w:left="227" w:right="227"/>
         <w:shd w:val="clear" w:color="auto" w:fill="F0F0F0"/>
       </w:pPr>
       <w:r>
@@ -5409,7 +5418,7 @@
     <w:p>
       <w:pPr>
         <w:spacing w:before="0" w:after="0"/>
-        <w:ind w:left="283" w:right="283"/>
+        <w:ind w:left="227" w:right="227"/>
         <w:shd w:val="clear" w:color="auto" w:fill="F0F0F0"/>
       </w:pPr>
       <w:r>
@@ -5424,7 +5433,7 @@
     <w:p>
       <w:pPr>
         <w:spacing w:before="0" w:after="0"/>
-        <w:ind w:left="283" w:right="283"/>
+        <w:ind w:left="227" w:right="227"/>
         <w:shd w:val="clear" w:color="auto" w:fill="F0F0F0"/>
       </w:pPr>
       <w:r>
@@ -5439,7 +5448,7 @@
     <w:p>
       <w:pPr>
         <w:spacing w:before="0" w:after="0"/>
-        <w:ind w:left="283" w:right="283"/>
+        <w:ind w:left="227" w:right="227"/>
         <w:shd w:val="clear" w:color="auto" w:fill="F0F0F0"/>
       </w:pPr>
       <w:r>
@@ -5454,7 +5463,7 @@
     <w:p>
       <w:pPr>
         <w:spacing w:before="0" w:after="0"/>
-        <w:ind w:left="283" w:right="283"/>
+        <w:ind w:left="227" w:right="227"/>
         <w:shd w:val="clear" w:color="auto" w:fill="F0F0F0"/>
       </w:pPr>
       <w:r>
@@ -5469,7 +5478,7 @@
     <w:p>
       <w:pPr>
         <w:spacing w:before="0" w:after="0"/>
-        <w:ind w:left="283" w:right="283"/>
+        <w:ind w:left="227" w:right="227"/>
         <w:shd w:val="clear" w:color="auto" w:fill="F0F0F0"/>
       </w:pPr>
       <w:r>
@@ -5484,7 +5493,7 @@
     <w:p>
       <w:pPr>
         <w:spacing w:before="0" w:after="0"/>
-        <w:ind w:left="283" w:right="283"/>
+        <w:ind w:left="227" w:right="227"/>
         <w:shd w:val="clear" w:color="auto" w:fill="F0F0F0"/>
       </w:pPr>
       <w:r>
@@ -5499,7 +5508,7 @@
     <w:p>
       <w:pPr>
         <w:spacing w:before="0" w:after="0"/>
-        <w:ind w:left="283" w:right="283"/>
+        <w:ind w:left="227" w:right="227"/>
         <w:shd w:val="clear" w:color="auto" w:fill="F0F0F0"/>
       </w:pPr>
       <w:r>
@@ -5514,7 +5523,7 @@
     <w:p>
       <w:pPr>
         <w:spacing w:before="0" w:after="0"/>
-        <w:ind w:left="283" w:right="283"/>
+        <w:ind w:left="227" w:right="227"/>
         <w:shd w:val="clear" w:color="auto" w:fill="F0F0F0"/>
       </w:pPr>
       <w:r>
@@ -5529,7 +5538,7 @@
     <w:p>
       <w:pPr>
         <w:spacing w:before="0" w:after="0"/>
-        <w:ind w:left="283" w:right="283"/>
+        <w:ind w:left="227" w:right="227"/>
         <w:shd w:val="clear" w:color="auto" w:fill="F0F0F0"/>
       </w:pPr>
       <w:r>
@@ -5544,7 +5553,7 @@
     <w:p>
       <w:pPr>
         <w:spacing w:before="0" w:after="0"/>
-        <w:ind w:left="283" w:right="283"/>
+        <w:ind w:left="227" w:right="227"/>
         <w:shd w:val="clear" w:color="auto" w:fill="F0F0F0"/>
       </w:pPr>
       <w:r>
@@ -5559,7 +5568,7 @@
     <w:p>
       <w:pPr>
         <w:spacing w:before="0" w:after="0"/>
-        <w:ind w:left="283" w:right="283"/>
+        <w:ind w:left="227" w:right="227"/>
         <w:shd w:val="clear" w:color="auto" w:fill="F0F0F0"/>
       </w:pPr>
       <w:r>
@@ -5574,7 +5583,7 @@
     <w:p>
       <w:pPr>
         <w:spacing w:before="0" w:after="0"/>
-        <w:ind w:left="283" w:right="283"/>
+        <w:ind w:left="227" w:right="227"/>
         <w:shd w:val="clear" w:color="auto" w:fill="F0F0F0"/>
       </w:pPr>
       <w:r>
@@ -5589,7 +5598,7 @@
     <w:p>
       <w:pPr>
         <w:spacing w:before="0" w:after="0"/>
-        <w:ind w:left="283" w:right="283"/>
+        <w:ind w:left="227" w:right="227"/>
         <w:shd w:val="clear" w:color="auto" w:fill="F0F0F0"/>
       </w:pPr>
       <w:r>
@@ -5604,7 +5613,7 @@
     <w:p>
       <w:pPr>
         <w:spacing w:before="0" w:after="0"/>
-        <w:ind w:left="283" w:right="283"/>
+        <w:ind w:left="227" w:right="227"/>
         <w:shd w:val="clear" w:color="auto" w:fill="F0F0F0"/>
       </w:pPr>
       <w:r>
@@ -5619,7 +5628,7 @@
     <w:p>
       <w:pPr>
         <w:spacing w:before="0" w:after="0"/>
-        <w:ind w:left="283" w:right="283"/>
+        <w:ind w:left="227" w:right="227"/>
         <w:shd w:val="clear" w:color="auto" w:fill="F0F0F0"/>
       </w:pPr>
       <w:r>
@@ -5634,7 +5643,7 @@
     <w:p>
       <w:pPr>
         <w:spacing w:before="0" w:after="0"/>
-        <w:ind w:left="283" w:right="283"/>
+        <w:ind w:left="227" w:right="227"/>
         <w:shd w:val="clear" w:color="auto" w:fill="F0F0F0"/>
       </w:pPr>
       <w:r>
@@ -5649,7 +5658,7 @@
     <w:p>
       <w:pPr>
         <w:spacing w:before="0" w:after="0"/>
-        <w:ind w:left="283" w:right="283"/>
+        <w:ind w:left="227" w:right="227"/>
         <w:shd w:val="clear" w:color="auto" w:fill="F0F0F0"/>
       </w:pPr>
       <w:r>
@@ -5664,7 +5673,7 @@
     <w:p>
       <w:pPr>
         <w:spacing w:before="0" w:after="0"/>
-        <w:ind w:left="283" w:right="283"/>
+        <w:ind w:left="227" w:right="227"/>
         <w:shd w:val="clear" w:color="auto" w:fill="F0F0F0"/>
       </w:pPr>
       <w:r>
@@ -5679,7 +5688,7 @@
     <w:p>
       <w:pPr>
         <w:spacing w:before="0" w:after="0"/>
-        <w:ind w:left="283" w:right="283"/>
+        <w:ind w:left="227" w:right="227"/>
         <w:shd w:val="clear" w:color="auto" w:fill="F0F0F0"/>
       </w:pPr>
       <w:r>
@@ -5694,7 +5703,7 @@
     <w:p>
       <w:pPr>
         <w:spacing w:before="0" w:after="0"/>
-        <w:ind w:left="283" w:right="283"/>
+        <w:ind w:left="227" w:right="227"/>
         <w:shd w:val="clear" w:color="auto" w:fill="F0F0F0"/>
       </w:pPr>
       <w:r>
@@ -5709,7 +5718,7 @@
     <w:p>
       <w:pPr>
         <w:spacing w:before="0" w:after="0"/>
-        <w:ind w:left="283" w:right="283"/>
+        <w:ind w:left="227" w:right="227"/>
         <w:shd w:val="clear" w:color="auto" w:fill="F0F0F0"/>
       </w:pPr>
       <w:r>
@@ -5724,7 +5733,7 @@
     <w:p>
       <w:pPr>
         <w:spacing w:before="0" w:after="0"/>
-        <w:ind w:left="283" w:right="283"/>
+        <w:ind w:left="227" w:right="227"/>
         <w:shd w:val="clear" w:color="auto" w:fill="F0F0F0"/>
       </w:pPr>
       <w:r>
@@ -5739,7 +5748,7 @@
     <w:p>
       <w:pPr>
         <w:spacing w:before="0" w:after="0"/>
-        <w:ind w:left="283" w:right="283"/>
+        <w:ind w:left="227" w:right="227"/>
         <w:shd w:val="clear" w:color="auto" w:fill="F0F0F0"/>
       </w:pPr>
       <w:r>
@@ -5754,7 +5763,7 @@
     <w:p>
       <w:pPr>
         <w:spacing w:before="0" w:after="0"/>
-        <w:ind w:left="283" w:right="283"/>
+        <w:ind w:left="227" w:right="227"/>
         <w:shd w:val="clear" w:color="auto" w:fill="F0F0F0"/>
       </w:pPr>
       <w:r>
@@ -5769,7 +5778,7 @@
     <w:p>
       <w:pPr>
         <w:spacing w:before="0" w:after="0"/>
-        <w:ind w:left="283" w:right="283"/>
+        <w:ind w:left="227" w:right="227"/>
         <w:shd w:val="clear" w:color="auto" w:fill="F0F0F0"/>
       </w:pPr>
       <w:r>
@@ -5784,7 +5793,7 @@
     <w:p>
       <w:pPr>
         <w:spacing w:before="0" w:after="0"/>
-        <w:ind w:left="283" w:right="283"/>
+        <w:ind w:left="227" w:right="227"/>
         <w:shd w:val="clear" w:color="auto" w:fill="F0F0F0"/>
       </w:pPr>
       <w:r>
@@ -5799,7 +5808,7 @@
     <w:p>
       <w:pPr>
         <w:spacing w:before="0" w:after="0"/>
-        <w:ind w:left="283" w:right="283"/>
+        <w:ind w:left="227" w:right="227"/>
         <w:shd w:val="clear" w:color="auto" w:fill="F0F0F0"/>
       </w:pPr>
       <w:r>
@@ -5814,7 +5823,7 @@
     <w:p>
       <w:pPr>
         <w:spacing w:before="0" w:after="0"/>
-        <w:ind w:left="283" w:right="283"/>
+        <w:ind w:left="227" w:right="227"/>
         <w:shd w:val="clear" w:color="auto" w:fill="F0F0F0"/>
       </w:pPr>
       <w:r>
@@ -5829,7 +5838,7 @@
     <w:p>
       <w:pPr>
         <w:spacing w:before="0" w:after="0"/>
-        <w:ind w:left="283" w:right="283"/>
+        <w:ind w:left="227" w:right="227"/>
         <w:shd w:val="clear" w:color="auto" w:fill="F0F0F0"/>
       </w:pPr>
       <w:r>
@@ -5844,7 +5853,7 @@
     <w:p>
       <w:pPr>
         <w:spacing w:before="0" w:after="0"/>
-        <w:ind w:left="283" w:right="283"/>
+        <w:ind w:left="227" w:right="227"/>
         <w:shd w:val="clear" w:color="auto" w:fill="F0F0F0"/>
       </w:pPr>
       <w:r>
@@ -5859,7 +5868,7 @@
     <w:p>
       <w:pPr>
         <w:spacing w:before="0" w:after="0"/>
-        <w:ind w:left="283" w:right="283"/>
+        <w:ind w:left="227" w:right="227"/>
         <w:shd w:val="clear" w:color="auto" w:fill="F0F0F0"/>
       </w:pPr>
       <w:r>
@@ -5874,7 +5883,7 @@
     <w:p>
       <w:pPr>
         <w:spacing w:before="0" w:after="0"/>
-        <w:ind w:left="283" w:right="283"/>
+        <w:ind w:left="227" w:right="227"/>
         <w:shd w:val="clear" w:color="auto" w:fill="F0F0F0"/>
       </w:pPr>
       <w:r>
@@ -5889,7 +5898,7 @@
     <w:p>
       <w:pPr>
         <w:spacing w:before="0" w:after="0"/>
-        <w:ind w:left="283" w:right="283"/>
+        <w:ind w:left="227" w:right="227"/>
         <w:shd w:val="clear" w:color="auto" w:fill="F0F0F0"/>
       </w:pPr>
       <w:r>
@@ -5904,7 +5913,7 @@
     <w:p>
       <w:pPr>
         <w:spacing w:before="0" w:after="0"/>
-        <w:ind w:left="283" w:right="283"/>
+        <w:ind w:left="227" w:right="227"/>
         <w:shd w:val="clear" w:color="auto" w:fill="F0F0F0"/>
       </w:pPr>
       <w:r>
@@ -5995,7 +6004,7 @@
         <w:tc>
           <w:tcPr>
             <w:tcW w:type="dxa" w:w="3135"/>
-            <w:shd w:val="clear" w:color="auto" w:fill="FFFFFF"/>
+            <w:shd w:val="clear" w:color="auto" w:fill="F5F5F5"/>
           </w:tcPr>
           <w:p>
             <w:r>
@@ -6009,7 +6018,7 @@
         <w:tc>
           <w:tcPr>
             <w:tcW w:type="dxa" w:w="3135"/>
-            <w:shd w:val="clear" w:color="auto" w:fill="FFFFFF"/>
+            <w:shd w:val="clear" w:color="auto" w:fill="F5F5F5"/>
           </w:tcPr>
           <w:p>
             <w:r>
@@ -6023,6 +6032,22 @@
         <w:tc>
           <w:tcPr>
             <w:tcW w:type="dxa" w:w="3135"/>
+            <w:shd w:val="clear" w:color="auto" w:fill="F5F5F5"/>
+          </w:tcPr>
+          <w:p>
+            <w:r>
+              <w:rPr>
+                <w:sz w:val="20"/>
+              </w:rPr>
+              <w:t>Custom binary parser reads the LabSpec 6 file. Automatically finds the wavenumber axis (200.9–3199.9 cm⁻¹, 1989 points) and 27 intensity spectra.</w:t>
+            </w:r>
+          </w:p>
+        </w:tc>
+      </w:tr>
+      <w:tr>
+        <w:tc>
+          <w:tcPr>
+            <w:tcW w:type="dxa" w:w="3135"/>
             <w:shd w:val="clear" w:color="auto" w:fill="FFFFFF"/>
           </w:tcPr>
           <w:p>
@@ -6030,7 +6055,35 @@
               <w:rPr>
                 <w:sz w:val="20"/>
               </w:rPr>
-              <w:t>Custom binary parser reads the LabSpec 6 file. Finds the wavenumber axis (200.9–3199.9 cm⁻¹, 1989 points) and 27 intensity spectra automatically.</w:t>
+              <w:t>2</w:t>
+            </w:r>
+          </w:p>
+        </w:tc>
+        <w:tc>
+          <w:tcPr>
+            <w:tcW w:type="dxa" w:w="3135"/>
+            <w:shd w:val="clear" w:color="auto" w:fill="FFFFFF"/>
+          </w:tcPr>
+          <w:p>
+            <w:r>
+              <w:rPr>
+                <w:sz w:val="20"/>
+              </w:rPr>
+              <w:t>Average spectrum</w:t>
+            </w:r>
+          </w:p>
+        </w:tc>
+        <w:tc>
+          <w:tcPr>
+            <w:tcW w:type="dxa" w:w="3135"/>
+            <w:shd w:val="clear" w:color="auto" w:fill="FFFFFF"/>
+          </w:tcPr>
+          <w:p>
+            <w:r>
+              <w:rPr>
+                <w:sz w:val="20"/>
+              </w:rPr>
+              <w:t>Averages all 25 valid map pixels. 2 corrupted pixels are excluded automatically. Noise reduces by √25 = 5×.</w:t>
             </w:r>
           </w:p>
         </w:tc>
@@ -6046,7 +6099,7 @@
               <w:rPr>
                 <w:sz w:val="20"/>
               </w:rPr>
-              <w:t>2</w:t>
+              <w:t>3</w:t>
             </w:r>
           </w:p>
         </w:tc>
@@ -6060,7 +6113,7 @@
               <w:rPr>
                 <w:sz w:val="20"/>
               </w:rPr>
-              <w:t>Average spectrum</w:t>
+              <w:t>Wavelet denoising</w:t>
             </w:r>
           </w:p>
         </w:tc>
@@ -6074,7 +6127,7 @@
               <w:rPr>
                 <w:sz w:val="20"/>
               </w:rPr>
-              <w:t>Averages all 25 valid map pixels (2 corrupted pixels are excluded). Result: one spectrum representing the whole map. Noise reduces by √25 = 5×.</w:t>
+              <w:t>Removes electronic noise using Daubechies-8 wavelet, 5 levels, soft universal threshold. Preserves Raman peak shapes.</w:t>
             </w:r>
           </w:p>
         </w:tc>
@@ -6090,7 +6143,7 @@
               <w:rPr>
                 <w:sz w:val="20"/>
               </w:rPr>
-              <w:t>3</w:t>
+              <w:t>4</w:t>
             </w:r>
           </w:p>
         </w:tc>
@@ -6104,7 +6157,7 @@
               <w:rPr>
                 <w:sz w:val="20"/>
               </w:rPr>
-              <w:t>Wavelet denoising</w:t>
+              <w:t>Min-Max normalise</w:t>
             </w:r>
           </w:p>
         </w:tc>
@@ -6118,7 +6171,7 @@
               <w:rPr>
                 <w:sz w:val="20"/>
               </w:rPr>
-              <w:t>Removes high-frequency electronic noise using Daubechies-8 wavelet, 5 decomposition levels, soft universal threshold. Preserves sharp Raman peak shapes better than smoothing filters.</w:t>
+              <w:t>Rescales to [0, 1]:  x_norm = (x − min) / (max − min). Makes intensities comparable across measurements.</w:t>
             </w:r>
           </w:p>
         </w:tc>
@@ -6134,7 +6187,7 @@
               <w:rPr>
                 <w:sz w:val="20"/>
               </w:rPr>
-              <w:t>4</w:t>
+              <w:t>5</w:t>
             </w:r>
           </w:p>
         </w:tc>
@@ -6148,7 +6201,7 @@
               <w:rPr>
                 <w:sz w:val="20"/>
               </w:rPr>
-              <w:t>Min-Max normalise</w:t>
+              <w:t>SNV</w:t>
             </w:r>
           </w:p>
         </w:tc>
@@ -6162,51 +6215,7 @@
               <w:rPr>
                 <w:sz w:val="20"/>
               </w:rPr>
-              <w:t>Rescales intensities to [0, 1] using x_norm = (x − min)/(max − min). Makes peak heights comparable across different measurements.</w:t>
-            </w:r>
-          </w:p>
-        </w:tc>
-      </w:tr>
-      <w:tr>
-        <w:tc>
-          <w:tcPr>
-            <w:tcW w:type="dxa" w:w="3135"/>
-            <w:shd w:val="clear" w:color="auto" w:fill="FFFFFF"/>
-          </w:tcPr>
-          <w:p>
-            <w:r>
-              <w:rPr>
-                <w:sz w:val="20"/>
-              </w:rPr>
-              <w:t>5</w:t>
-            </w:r>
-          </w:p>
-        </w:tc>
-        <w:tc>
-          <w:tcPr>
-            <w:tcW w:type="dxa" w:w="3135"/>
-            <w:shd w:val="clear" w:color="auto" w:fill="FFFFFF"/>
-          </w:tcPr>
-          <w:p>
-            <w:r>
-              <w:rPr>
-                <w:sz w:val="20"/>
-              </w:rPr>
-              <w:t>SNV pre-processing</w:t>
-            </w:r>
-          </w:p>
-        </w:tc>
-        <w:tc>
-          <w:tcPr>
-            <w:tcW w:type="dxa" w:w="3135"/>
-            <w:shd w:val="clear" w:color="auto" w:fill="FFFFFF"/>
-          </w:tcPr>
-          <w:p>
-            <w:r>
-              <w:rPr>
-                <w:sz w:val="20"/>
-              </w:rPr>
-              <w:t>Standard Normal Variate: x_snv = (x − mean)/std. Centres spectrum to zero mean, unit variance. Removes multiplicative scatter differences across the sample.</w:t>
+              <w:t>Standard Normal Variate:  x_snv = (x − mean) / std. Removes multiplicative scatter differences across the sample.</w:t>
             </w:r>
           </w:p>
         </w:tc>
@@ -6235,7 +6244,7 @@
           <w:b/>
           <w:sz w:val="22"/>
         </w:rPr>
-        <w:t xml:space="preserve">raman_pipeline_output.png      </w:t>
+        <w:t xml:space="preserve">raman_pipeline_output.png     </w:t>
       </w:r>
       <w:r>
         <w:rPr>
@@ -6254,13 +6263,13 @@
           <w:b/>
           <w:sz w:val="22"/>
         </w:rPr>
-        <w:t xml:space="preserve">raman_overlay_comparison.png   </w:t>
+        <w:t xml:space="preserve">raman_overlay_comparison.png  </w:t>
       </w:r>
       <w:r>
         <w:rPr>
           <w:sz w:val="22"/>
         </w:rPr>
-        <w:t xml:space="preserve">  Denoised, normalised, and SNV spectra on one axis</w:t>
+        <w:t xml:space="preserve">  Denoised, normalised, and SNV spectra overlaid</w:t>
       </w:r>
     </w:p>
     <w:p>
@@ -6273,7 +6282,7 @@
           <w:b/>
           <w:sz w:val="22"/>
         </w:rPr>
-        <w:t xml:space="preserve">raman_processed_spectrum.csv   </w:t>
+        <w:t xml:space="preserve">raman_processed_spectrum.csv  </w:t>
       </w:r>
       <w:r>
         <w:rPr>
@@ -6284,192 +6293,15 @@
     </w:p>
     <w:p>
       <w:pPr>
-        <w:spacing w:after="80" w:before="40"/>
+        <w:spacing w:after="80"/>
       </w:pPr>
       <w:r>
         <w:rPr>
           <w:sz w:val="22"/>
         </w:rPr>
-        <w:t>All files are saved in the same folder where you run the script.</w:t>
-      </w:r>
-    </w:p>
-    <w:p>
-      <w:pPr>
-        <w:pStyle w:val="Heading1"/>
-      </w:pPr>
-      <w:r>
-        <w:rPr>
-          <w:b/>
-          <w:color w:val="1F4E79"/>
-        </w:rPr>
-        <w:t>5.  Key Formulas</w:t>
-      </w:r>
-    </w:p>
-    <w:tbl>
-      <w:tblPr>
-        <w:tblStyle w:val="TableGrid"/>
-        <w:tblW w:type="auto" w:w="0"/>
-        <w:tblLook w:firstColumn="1" w:firstRow="1" w:lastColumn="0" w:lastRow="0" w:noHBand="0" w:noVBand="1" w:val="04A0"/>
-      </w:tblPr>
-      <w:tblGrid>
-        <w:gridCol w:w="4703"/>
-        <w:gridCol w:w="4703"/>
-      </w:tblGrid>
-      <w:tr>
-        <w:tc>
-          <w:tcPr>
-            <w:tcW w:type="dxa" w:w="4703"/>
-            <w:shd w:val="clear" w:color="auto" w:fill="2E75B6"/>
-          </w:tcPr>
-          <w:p>
-            <w:r>
-              <w:rPr>
-                <w:b/>
-                <w:color w:val="FFFFFF"/>
-                <w:sz w:val="20"/>
-              </w:rPr>
-              <w:t>Formula</w:t>
-            </w:r>
-          </w:p>
-        </w:tc>
-        <w:tc>
-          <w:tcPr>
-            <w:tcW w:type="dxa" w:w="4703"/>
-            <w:shd w:val="clear" w:color="auto" w:fill="2E75B6"/>
-          </w:tcPr>
-          <w:p>
-            <w:r>
-              <w:rPr>
-                <w:b/>
-                <w:color w:val="FFFFFF"/>
-                <w:sz w:val="20"/>
-              </w:rPr>
-              <w:t>Meaning</w:t>
-            </w:r>
-          </w:p>
-        </w:tc>
-      </w:tr>
-      <w:tr>
-        <w:tc>
-          <w:tcPr>
-            <w:tcW w:type="dxa" w:w="4703"/>
-            <w:shd w:val="clear" w:color="auto" w:fill="F5F5F5"/>
-          </w:tcPr>
-          <w:p>
-            <w:r>
-              <w:rPr>
-                <w:sz w:val="20"/>
-              </w:rPr>
-              <w:t>I_avg(ν) = (1/N) Σ Iᵢ(ν)</w:t>
-            </w:r>
-          </w:p>
-        </w:tc>
-        <w:tc>
-          <w:tcPr>
-            <w:tcW w:type="dxa" w:w="4703"/>
-            <w:shd w:val="clear" w:color="auto" w:fill="F5F5F5"/>
-          </w:tcPr>
-          <w:p>
-            <w:r>
-              <w:rPr>
-                <w:sz w:val="20"/>
-              </w:rPr>
-              <w:t>Average N spectra channel by channel</w:t>
-            </w:r>
-          </w:p>
-        </w:tc>
-      </w:tr>
-      <w:tr>
-        <w:tc>
-          <w:tcPr>
-            <w:tcW w:type="dxa" w:w="4703"/>
-            <w:shd w:val="clear" w:color="auto" w:fill="FFFFFF"/>
-          </w:tcPr>
-          <w:p>
-            <w:r>
-              <w:rPr>
-                <w:sz w:val="20"/>
-              </w:rPr>
-              <w:t>T = σ √(2 ln N),   σ = median|d| / 0.6745</w:t>
-            </w:r>
-          </w:p>
-        </w:tc>
-        <w:tc>
-          <w:tcPr>
-            <w:tcW w:type="dxa" w:w="4703"/>
-            <w:shd w:val="clear" w:color="auto" w:fill="FFFFFF"/>
-          </w:tcPr>
-          <w:p>
-            <w:r>
-              <w:rPr>
-                <w:sz w:val="20"/>
-              </w:rPr>
-              <w:t>Universal wavelet threshold from noise σ</w:t>
-            </w:r>
-          </w:p>
-        </w:tc>
-      </w:tr>
-      <w:tr>
-        <w:tc>
-          <w:tcPr>
-            <w:tcW w:type="dxa" w:w="4703"/>
-            <w:shd w:val="clear" w:color="auto" w:fill="F5F5F5"/>
-          </w:tcPr>
-          <w:p>
-            <w:r>
-              <w:rPr>
-                <w:sz w:val="20"/>
-              </w:rPr>
-              <w:t>x_norm = (x − min) / (max − min)</w:t>
-            </w:r>
-          </w:p>
-        </w:tc>
-        <w:tc>
-          <w:tcPr>
-            <w:tcW w:type="dxa" w:w="4703"/>
-            <w:shd w:val="clear" w:color="auto" w:fill="F5F5F5"/>
-          </w:tcPr>
-          <w:p>
-            <w:r>
-              <w:rPr>
-                <w:sz w:val="20"/>
-              </w:rPr>
-              <w:t>Min-Max normalisation → range [0, 1]</w:t>
-            </w:r>
-          </w:p>
-        </w:tc>
-      </w:tr>
-      <w:tr>
-        <w:tc>
-          <w:tcPr>
-            <w:tcW w:type="dxa" w:w="4703"/>
-            <w:shd w:val="clear" w:color="auto" w:fill="FFFFFF"/>
-          </w:tcPr>
-          <w:p>
-            <w:r>
-              <w:rPr>
-                <w:sz w:val="20"/>
-              </w:rPr>
-              <w:t>x_snv  = (x − μ)  / σ_x</w:t>
-            </w:r>
-          </w:p>
-        </w:tc>
-        <w:tc>
-          <w:tcPr>
-            <w:tcW w:type="dxa" w:w="4703"/>
-            <w:shd w:val="clear" w:color="auto" w:fill="FFFFFF"/>
-          </w:tcPr>
-          <w:p>
-            <w:r>
-              <w:rPr>
-                <w:sz w:val="20"/>
-              </w:rPr>
-              <w:t>SNV → zero mean, unit standard deviation</w:t>
-            </w:r>
-          </w:p>
-        </w:tc>
-      </w:tr>
-    </w:tbl>
+        <w:t>Files are saved in the same folder as your sers_analysis.py script.</w:t>
+      </w:r>
+    </w:p>
     <w:sectPr>
       <w:pgSz w:w="12240" w:h="15840"/>
       <w:pgMar w:top="1417" w:right="1417" w:bottom="1417" w:left="1417" w:header="720" w:footer="720" w:gutter="0"/>

</xml_diff>

<commit_message>
v4: individual per-spectrum plots vs CaF2 reference with SERS-specific peak markers
New functions:
- detect_peaks(): scipy find_peaks on ALS-corrected spectrum, 400-1800 cm-1
- plot_spectrum_vs_caf2(): one figure per map spectrum overlaid with CaF2
  reference; dotted vertical lines label every peak; '?' marks peaks
  present in the SERS spectrum but absent in CaF2 (biologically significant)
- plot_all_individual(): loops over all N map spectra, saves individual PNGs,
  produces a summary grid (5-per-row) and prints a SERS-unique peak frequency
  table to the console

Output saved to: <same folder as .l6m file>/individual_spectra/
  spectrum_01_vs_caf2.png … spectrum_N_vs_caf2.png
  summary_grid_all_spectra.png

https://claude.ai/code/session_01MMZZNNZ37d4FGiNKUpmbH2
</commit_message>
<xml_diff>
--- a/Raman_Analysis_Code_and_Explanation.docx
+++ b/Raman_Analysis_Code_and_Explanation.docx
@@ -2671,6 +2671,473 @@
         <w:br/>
         <w:t># ─────────────────────────────────────────────────────────────────────────────</w:t>
         <w:br/>
+        <w:t>#  11.  PEAK DETECTION  (automatic, scipy.signal)</w:t>
+        <w:br/>
+        <w:t># ─────────────────────────────────────────────────────────────────────────────</w:t>
+        <w:br/>
+        <w:t>def detect_peaks(wn, spectrum, distance_cm=35, height_pct=0.04, prominence_pct=0.03):</w:t>
+        <w:br/>
+        <w:t xml:space="preserve">    """</w:t>
+        <w:br/>
+        <w:t xml:space="preserve">    Find peaks in a spectrum over 400–1800 cm⁻¹.</w:t>
+        <w:br/>
+        <w:br/>
+        <w:t xml:space="preserve">    Works on the ALS-baseline-corrected signal so broad fluorescence</w:t>
+        <w:br/>
+        <w:t xml:space="preserve">    background does not swamp low Raman peaks.  Returns an array of</w:t>
+        <w:br/>
+        <w:t xml:space="preserve">    peak wavenumbers sorted by ascending wavenumber.</w:t>
+        <w:br/>
+        <w:t xml:space="preserve">    """</w:t>
+        <w:br/>
+        <w:t xml:space="preserve">    from scipy.signal import find_peaks as _fp</w:t>
+        <w:br/>
+        <w:br/>
+        <w:t xml:space="preserve">    mask = (wn &gt;= 395) &amp; (wn &lt;= 1810)</w:t>
+        <w:br/>
+        <w:t xml:space="preserve">    wn_r   = wn[mask]</w:t>
+        <w:br/>
+        <w:t xml:space="preserve">    sp_sg  = savgol_filter(spectrum[mask], window_length=11, polyorder=3)</w:t>
+        <w:br/>
+        <w:t xml:space="preserve">    bline  = als_baseline(sp_sg, lam=1e5, p=0.01, n_iter=10)</w:t>
+        <w:br/>
+        <w:t xml:space="preserve">    sp_bc  = np.clip(sp_sg - bline, 0, None)</w:t>
+        <w:br/>
+        <w:br/>
+        <w:t xml:space="preserve">    if sp_bc.max() &lt; 1e-6:</w:t>
+        <w:br/>
+        <w:t xml:space="preserve">        return np.array([])</w:t>
+        <w:br/>
+        <w:br/>
+        <w:t xml:space="preserve">    step         = float(np.diff(wn_r).mean())</w:t>
+        <w:br/>
+        <w:t xml:space="preserve">    dist_pts     = max(3, int(distance_cm / step))</w:t>
+        <w:br/>
+        <w:t xml:space="preserve">    height_thr   = height_pct    * sp_bc.max()</w:t>
+        <w:br/>
+        <w:t xml:space="preserve">    prom_thr     = prominence_pct * sp_bc.max()</w:t>
+        <w:br/>
+        <w:br/>
+        <w:t xml:space="preserve">    idxs, _ = _fp(sp_bc, height=height_thr, distance=dist_pts,</w:t>
+        <w:br/>
+        <w:t xml:space="preserve">                  prominence=prom_thr)</w:t>
+        <w:br/>
+        <w:t xml:space="preserve">    return wn_r[idxs]</w:t>
+        <w:br/>
+        <w:br/>
+        <w:br/>
+        <w:t># ─────────────────────────────────────────────────────────────────────────────</w:t>
+        <w:br/>
+        <w:t>#  12.  INDIVIDUAL SPECTRUM vs CaF₂ COMPARISON PLOTS</w:t>
+        <w:br/>
+        <w:t># ─────────────────────────────────────────────────────────────────────────────</w:t>
+        <w:br/>
+        <w:t>def _sg_display(spectrum, wl=9, po=3):</w:t>
+        <w:br/>
+        <w:t xml:space="preserve">    """Light Savitzky-Golay smooth for display (preserves counts scale)."""</w:t>
+        <w:br/>
+        <w:t xml:space="preserve">    return savgol_filter(spectrum, window_length=wl, polyorder=po)</w:t>
+        <w:br/>
+        <w:br/>
+        <w:br/>
+        <w:t>def plot_spectrum_vs_caf2(wn_map, sp_map, wn_caf2, sp_caf2,</w:t>
+        <w:br/>
+        <w:t xml:space="preserve">                          peaks_map, peaks_caf2,</w:t>
+        <w:br/>
+        <w:t xml:space="preserve">                          spectrum_idx, out_dir,</w:t>
+        <w:br/>
+        <w:t xml:space="preserve">                          peak_tol=22.0):</w:t>
+        <w:br/>
+        <w:t xml:space="preserve">    """</w:t>
+        <w:br/>
+        <w:t xml:space="preserve">    One-panel figure: SERS spectrum (black) vs CaF₂ reference (red).</w:t>
+        <w:br/>
+        <w:br/>
+        <w:t xml:space="preserve">    Dotted vertical lines mark every detected peak.</w:t>
+        <w:br/>
+        <w:t xml:space="preserve">    Wavenumber label + '?' → peak present in SERS but NOT in CaF₂.</w:t>
+        <w:br/>
+        <w:t xml:space="preserve">    Plain wavenumber label  → peak present in BOTH (substrate / instrument).</w:t>
+        <w:br/>
+        <w:t xml:space="preserve">    """</w:t>
+        <w:br/>
+        <w:t xml:space="preserve">    matplotlib.rcParams.update({"font.family": "DejaVu Sans",</w:t>
+        <w:br/>
+        <w:t xml:space="preserve">                                 "figure.facecolor": "white"})</w:t>
+        <w:br/>
+        <w:br/>
+        <w:t xml:space="preserve">    # Restrict display to fingerprint region</w:t>
+        <w:br/>
+        <w:t xml:space="preserve">    fp = (400, 1800)</w:t>
+        <w:br/>
+        <w:t xml:space="preserve">    m_m   = (wn_map  &gt;= fp[0]) &amp; (wn_map  &lt;= fp[1])</w:t>
+        <w:br/>
+        <w:t xml:space="preserve">    m_c   = (wn_caf2 &gt;= fp[0]) &amp; (wn_caf2 &lt;= fp[1])</w:t>
+        <w:br/>
+        <w:br/>
+        <w:t xml:space="preserve">    sp_m_d = _sg_display(sp_map)</w:t>
+        <w:br/>
+        <w:t xml:space="preserve">    sp_c_d = _sg_display(sp_caf2)</w:t>
+        <w:br/>
+        <w:br/>
+        <w:t xml:space="preserve">    fig, ax = plt.subplots(figsize=(14, 5))</w:t>
+        <w:br/>
+        <w:t xml:space="preserve">    ax.plot(wn_map[m_m],   sp_m_d[m_m],  color="black", lw=1.3,</w:t>
+        <w:br/>
+        <w:t xml:space="preserve">            label=f"SERS map spectrum #{spectrum_idx + 1}")</w:t>
+        <w:br/>
+        <w:t xml:space="preserve">    ax.plot(wn_caf2[m_c],  sp_c_d[m_c],  color="#C0392B", lw=1.0, alpha=0.85,</w:t>
+        <w:br/>
+        <w:t xml:space="preserve">            label="CaF₂ reference")</w:t>
+        <w:br/>
+        <w:br/>
+        <w:t xml:space="preserve">    ymax_m = sp_m_d[m_m].max()</w:t>
+        <w:br/>
+        <w:t xml:space="preserve">    ymax_c = sp_c_d[m_c].max()</w:t>
+        <w:br/>
+        <w:t xml:space="preserve">    ymax   = max(ymax_m, ymax_c)</w:t>
+        <w:br/>
+        <w:t xml:space="preserve">    ymin   = min(sp_m_d[m_m].min(), sp_c_d[m_c].min())</w:t>
+        <w:br/>
+        <w:t xml:space="preserve">    y_span = ymax - ymin</w:t>
+        <w:br/>
+        <w:br/>
+        <w:t xml:space="preserve">    used_x = []</w:t>
+        <w:br/>
+        <w:br/>
+        <w:t xml:space="preserve">    # ── annotate SERS peaks ──────────────────────────────────────────────────</w:t>
+        <w:br/>
+        <w:t xml:space="preserve">    for wn_p in sorted(peaks_map):</w:t>
+        <w:br/>
+        <w:t xml:space="preserve">        if not (fp[0] &lt;= wn_p &lt;= fp[1]):</w:t>
+        <w:br/>
+        <w:t xml:space="preserve">            continue</w:t>
+        <w:br/>
+        <w:t xml:space="preserve">        if any(abs(wn_p - u) &lt; peak_tol * 0.7 for u in used_x):</w:t>
+        <w:br/>
+        <w:t xml:space="preserve">            continue</w:t>
+        <w:br/>
+        <w:t xml:space="preserve">        used_x.append(wn_p)</w:t>
+        <w:br/>
+        <w:br/>
+        <w:t xml:space="preserve">        in_caf2 = any(abs(wn_p - c) &lt; peak_tol for c in peaks_caf2)</w:t>
+        <w:br/>
+        <w:br/>
+        <w:t xml:space="preserve">        # height at this wavenumber in the smoothed map spectrum</w:t>
+        <w:br/>
+        <w:t xml:space="preserve">        i_local = np.argmin(np.abs(wn_map - wn_p))</w:t>
+        <w:br/>
+        <w:t xml:space="preserve">        y_val   = sp_m_d[i_local]</w:t>
+        <w:br/>
+        <w:br/>
+        <w:t xml:space="preserve">        color  = "#C0392B" if not in_caf2 else "#555555"</w:t>
+        <w:br/>
+        <w:t xml:space="preserve">        marker = "?\n" if not in_caf2 else ""</w:t>
+        <w:br/>
+        <w:t xml:space="preserve">        lw_vl  = 1.0 if not in_caf2 else 0.7</w:t>
+        <w:br/>
+        <w:br/>
+        <w:t xml:space="preserve">        ax.axvline(wn_p, color=color, lw=lw_vl, ls=":", alpha=0.85)</w:t>
+        <w:br/>
+        <w:t xml:space="preserve">        ax.text(wn_p,</w:t>
+        <w:br/>
+        <w:t xml:space="preserve">                y_val + y_span * 0.04,</w:t>
+        <w:br/>
+        <w:t xml:space="preserve">                f"{marker}{int(round(wn_p))}",</w:t>
+        <w:br/>
+        <w:t xml:space="preserve">                fontsize=7.5, ha="center", va="bottom",</w:t>
+        <w:br/>
+        <w:t xml:space="preserve">                color=color,</w:t>
+        <w:br/>
+        <w:t xml:space="preserve">                fontweight="bold" if not in_caf2 else "normal",</w:t>
+        <w:br/>
+        <w:t xml:space="preserve">                bbox=dict(boxstyle="round,pad=0.1", fc="white",</w:t>
+        <w:br/>
+        <w:t xml:space="preserve">                          ec="none", alpha=0.7))</w:t>
+        <w:br/>
+        <w:br/>
+        <w:t xml:space="preserve">    # ── annotate CaF₂-only peaks ────────────────────────────────────────────</w:t>
+        <w:br/>
+        <w:t xml:space="preserve">    for wn_p in sorted(peaks_caf2):</w:t>
+        <w:br/>
+        <w:t xml:space="preserve">        if not (fp[0] &lt;= wn_p &lt;= fp[1]):</w:t>
+        <w:br/>
+        <w:t xml:space="preserve">            continue</w:t>
+        <w:br/>
+        <w:t xml:space="preserve">        if any(abs(wn_p - u) &lt; peak_tol * 0.7 for u in used_x):</w:t>
+        <w:br/>
+        <w:t xml:space="preserve">            continue</w:t>
+        <w:br/>
+        <w:t xml:space="preserve">        used_x.append(wn_p)</w:t>
+        <w:br/>
+        <w:br/>
+        <w:t xml:space="preserve">        i_local = np.argmin(np.abs(wn_caf2 - wn_p))</w:t>
+        <w:br/>
+        <w:t xml:space="preserve">        y_val   = sp_c_d[i_local]</w:t>
+        <w:br/>
+        <w:br/>
+        <w:t xml:space="preserve">        ax.axvline(wn_p, color="#888888", lw=0.6, ls=":", alpha=0.6)</w:t>
+        <w:br/>
+        <w:t xml:space="preserve">        ax.text(wn_p,</w:t>
+        <w:br/>
+        <w:t xml:space="preserve">                y_val + y_span * 0.02,</w:t>
+        <w:br/>
+        <w:t xml:space="preserve">                f"{int(round(wn_p))}",</w:t>
+        <w:br/>
+        <w:t xml:space="preserve">                fontsize=6.5, ha="center", va="bottom",</w:t>
+        <w:br/>
+        <w:t xml:space="preserve">                color="#888888", alpha=0.85)</w:t>
+        <w:br/>
+        <w:br/>
+        <w:t xml:space="preserve">    ax.set_xlim(fp[0] - 10, fp[1] + 10)</w:t>
+        <w:br/>
+        <w:t xml:space="preserve">    ax.set_ylim(ymin - y_span * 0.08, ymax + y_span * 0.30)</w:t>
+        <w:br/>
+        <w:t xml:space="preserve">    ax.set_xlabel("Raman shift (cm⁻¹)", fontsize=10)</w:t>
+        <w:br/>
+        <w:t xml:space="preserve">    ax.set_ylabel("Intensity (counts)", fontsize=10)</w:t>
+        <w:br/>
+        <w:t xml:space="preserve">    ax.set_title(</w:t>
+        <w:br/>
+        <w:t xml:space="preserve">        f"Spectrum #{spectrum_idx + 1}  vs  CaF₂ reference   "</w:t>
+        <w:br/>
+        <w:t xml:space="preserve">        f"|   ? = SERS-specific peak (not in CaF₂)",</w:t>
+        <w:br/>
+        <w:t xml:space="preserve">        fontsize=10, fontweight="bold"</w:t>
+        <w:br/>
+        <w:t xml:space="preserve">    )</w:t>
+        <w:br/>
+        <w:t xml:space="preserve">    ax.legend(fontsize=9, loc="upper right", framealpha=0.9)</w:t>
+        <w:br/>
+        <w:t xml:space="preserve">    ax.spines["top"].set_visible(False)</w:t>
+        <w:br/>
+        <w:t xml:space="preserve">    ax.spines["right"].set_visible(False)</w:t>
+        <w:br/>
+        <w:t xml:space="preserve">    ax.tick_params(labelsize=9)</w:t>
+        <w:br/>
+        <w:t xml:space="preserve">    ax.grid(True, alpha=0.12, lw=0.5)</w:t>
+        <w:br/>
+        <w:br/>
+        <w:t xml:space="preserve">    os.makedirs(out_dir, exist_ok=True)</w:t>
+        <w:br/>
+        <w:t xml:space="preserve">    outfile = os.path.join(out_dir, f"spectrum_{spectrum_idx + 1:02d}_vs_caf2.png")</w:t>
+        <w:br/>
+        <w:t xml:space="preserve">    fig.savefig(outfile, dpi=150, bbox_inches="tight", facecolor="white")</w:t>
+        <w:br/>
+        <w:t xml:space="preserve">    plt.close(fig)</w:t>
+        <w:br/>
+        <w:t xml:space="preserve">    return outfile</w:t>
+        <w:br/>
+        <w:br/>
+        <w:br/>
+        <w:t>def plot_all_individual(wn, spectra, wn_caf2, sp_caf2, out_dir):</w:t>
+        <w:br/>
+        <w:t xml:space="preserve">    """</w:t>
+        <w:br/>
+        <w:t xml:space="preserve">    Generate one figure per map spectrum (spectrum_01 … spectrum_N) plus a</w:t>
+        <w:br/>
+        <w:t xml:space="preserve">    summary grid showing all spectra together.</w:t>
+        <w:br/>
+        <w:t xml:space="preserve">    """</w:t>
+        <w:br/>
+        <w:t xml:space="preserve">    matplotlib.rcParams.update({"font.family": "DejaVu Sans",</w:t>
+        <w:br/>
+        <w:t xml:space="preserve">                                 "figure.facecolor": "white"})</w:t>
+        <w:br/>
+        <w:br/>
+        <w:t xml:space="preserve">    print(f"\n  Detecting CaF₂ reference peaks …")</w:t>
+        <w:br/>
+        <w:t xml:space="preserve">    peaks_caf2 = detect_peaks(wn_caf2, sp_caf2)</w:t>
+        <w:br/>
+        <w:t xml:space="preserve">    print(f"  CaF₂ peaks found: {len(peaks_caf2)}  "</w:t>
+        <w:br/>
+        <w:t xml:space="preserve">          f"({', '.join(str(int(w)) for w in peaks_caf2[:10])}{'…' if len(peaks_caf2)&gt;10 else ''})")</w:t>
+        <w:br/>
+        <w:br/>
+        <w:t xml:space="preserve">    n = len(spectra)</w:t>
+        <w:br/>
+        <w:t xml:space="preserve">    print(f"\n  Plotting {n} individual spectra vs CaF₂ …")</w:t>
+        <w:br/>
+        <w:br/>
+        <w:t xml:space="preserve">    # ── Individual figures ────────────────────────────────────────────────────</w:t>
+        <w:br/>
+        <w:t xml:space="preserve">    all_peaks_map = []</w:t>
+        <w:br/>
+        <w:t xml:space="preserve">    for i, sp in enumerate(spectra):</w:t>
+        <w:br/>
+        <w:t xml:space="preserve">        pk = detect_peaks(wn, sp)</w:t>
+        <w:br/>
+        <w:t xml:space="preserve">        all_peaks_map.append(pk)</w:t>
+        <w:br/>
+        <w:t xml:space="preserve">        outfile = plot_spectrum_vs_caf2(</w:t>
+        <w:br/>
+        <w:t xml:space="preserve">            wn, sp, wn_caf2, sp_caf2,</w:t>
+        <w:br/>
+        <w:t xml:space="preserve">            pk, peaks_caf2, i, out_dir</w:t>
+        <w:br/>
+        <w:t xml:space="preserve">        )</w:t>
+        <w:br/>
+        <w:t xml:space="preserve">        print(f"    [{i+1:2d}/{n}]  {len(pk)} peaks  → {os.path.basename(outfile)}")</w:t>
+        <w:br/>
+        <w:br/>
+        <w:t xml:space="preserve">    # ── Summary grid ─────────────────────────────────────────────────────────</w:t>
+        <w:br/>
+        <w:t xml:space="preserve">    ncols = 5</w:t>
+        <w:br/>
+        <w:t xml:space="preserve">    nrows = int(np.ceil(n / ncols))</w:t>
+        <w:br/>
+        <w:t xml:space="preserve">    fig, axes = plt.subplots(nrows, ncols,</w:t>
+        <w:br/>
+        <w:t xml:space="preserve">                             figsize=(ncols * 4.5, nrows * 3.2),</w:t>
+        <w:br/>
+        <w:t xml:space="preserve">                             sharex=True)</w:t>
+        <w:br/>
+        <w:t xml:space="preserve">    fig.suptitle(</w:t>
+        <w:br/>
+        <w:t xml:space="preserve">        "All SERS Map Spectra vs CaF₂ Reference  (400–1800 cm⁻¹)\n"</w:t>
+        <w:br/>
+        <w:t xml:space="preserve">        "Black = SERS  |  Red = CaF₂  |  ? = SERS-specific peak",</w:t>
+        <w:br/>
+        <w:t xml:space="preserve">        fontsize=12, fontweight="bold", y=1.01</w:t>
+        <w:br/>
+        <w:t xml:space="preserve">    )</w:t>
+        <w:br/>
+        <w:br/>
+        <w:t xml:space="preserve">    sp_caf2_sg = _sg_display(sp_caf2)</w:t>
+        <w:br/>
+        <w:t xml:space="preserve">    m_c = (wn_caf2 &gt;= 400) &amp; (wn_caf2 &lt;= 1800)</w:t>
+        <w:br/>
+        <w:br/>
+        <w:t xml:space="preserve">    axes_flat = axes.flat if nrows &gt; 1 else [axes] if ncols == 1 else list(axes.flat)</w:t>
+        <w:br/>
+        <w:t xml:space="preserve">    for i in range(ncols * nrows):</w:t>
+        <w:br/>
+        <w:t xml:space="preserve">        ax = list(axes.flat)[i]</w:t>
+        <w:br/>
+        <w:t xml:space="preserve">        if i &gt;= n:</w:t>
+        <w:br/>
+        <w:t xml:space="preserve">            ax.set_visible(False)</w:t>
+        <w:br/>
+        <w:t xml:space="preserve">            continue</w:t>
+        <w:br/>
+        <w:br/>
+        <w:t xml:space="preserve">        sp_sg = _sg_display(spectra[i])</w:t>
+        <w:br/>
+        <w:t xml:space="preserve">        m_m   = (wn &gt;= 400) &amp; (wn &lt;= 1800)</w:t>
+        <w:br/>
+        <w:br/>
+        <w:t xml:space="preserve">        ax.plot(wn[m_m],      sp_sg[m_m],      color="black", lw=0.9)</w:t>
+        <w:br/>
+        <w:t xml:space="preserve">        ax.plot(wn_caf2[m_c], sp_caf2_sg[m_c], color="#C0392B", lw=0.7, alpha=0.8)</w:t>
+        <w:br/>
+        <w:br/>
+        <w:t xml:space="preserve">        ymax = max(sp_sg[m_m].max(), sp_caf2_sg[m_c].max())</w:t>
+        <w:br/>
+        <w:t xml:space="preserve">        ymin = min(sp_sg[m_m].min(), sp_caf2_sg[m_c].min())</w:t>
+        <w:br/>
+        <w:br/>
+        <w:t xml:space="preserve">        for wn_p in all_peaks_map[i]:</w:t>
+        <w:br/>
+        <w:t xml:space="preserve">            if not (400 &lt;= wn_p &lt;= 1800):</w:t>
+        <w:br/>
+        <w:t xml:space="preserve">                continue</w:t>
+        <w:br/>
+        <w:t xml:space="preserve">            in_caf2 = any(abs(wn_p - c) &lt; 22 for c in peaks_caf2)</w:t>
+        <w:br/>
+        <w:t xml:space="preserve">            color = "#C0392B" if not in_caf2 else "#888888"</w:t>
+        <w:br/>
+        <w:t xml:space="preserve">            ax.axvline(wn_p, color=color, lw=0.5, ls=":", alpha=0.8)</w:t>
+        <w:br/>
+        <w:t xml:space="preserve">            marker = "?" if not in_caf2 else ""</w:t>
+        <w:br/>
+        <w:t xml:space="preserve">            ax.text(wn_p, ymax + (ymax - ymin) * 0.05,</w:t>
+        <w:br/>
+        <w:t xml:space="preserve">                    f"{marker}{int(round(wn_p))}",</w:t>
+        <w:br/>
+        <w:t xml:space="preserve">                    fontsize=5.5, ha="center", va="bottom",</w:t>
+        <w:br/>
+        <w:t xml:space="preserve">                    color=color, rotation=90)</w:t>
+        <w:br/>
+        <w:br/>
+        <w:t xml:space="preserve">        ax.set_xlim(400, 1800)</w:t>
+        <w:br/>
+        <w:t xml:space="preserve">        ax.set_ylim(ymin - (ymax - ymin) * 0.05,</w:t>
+        <w:br/>
+        <w:t xml:space="preserve">                    ymax + (ymax - ymin) * 0.45)</w:t>
+        <w:br/>
+        <w:t xml:space="preserve">        ax.set_title(f"#{i + 1}", fontsize=8, pad=2)</w:t>
+        <w:br/>
+        <w:t xml:space="preserve">        ax.tick_params(labelsize=6)</w:t>
+        <w:br/>
+        <w:t xml:space="preserve">        ax.spines["top"].set_visible(False)</w:t>
+        <w:br/>
+        <w:t xml:space="preserve">        ax.spines["right"].set_visible(False)</w:t>
+        <w:br/>
+        <w:br/>
+        <w:t xml:space="preserve">    for ax in list(axes.flat)[n:]:</w:t>
+        <w:br/>
+        <w:t xml:space="preserve">        ax.set_visible(False)</w:t>
+        <w:br/>
+        <w:br/>
+        <w:t xml:space="preserve">    fig.tight_layout()</w:t>
+        <w:br/>
+        <w:t xml:space="preserve">    grid_file = os.path.join(out_dir, "summary_grid_all_spectra.png")</w:t>
+        <w:br/>
+        <w:t xml:space="preserve">    fig.savefig(grid_file, dpi=150, bbox_inches="tight", facecolor="white")</w:t>
+        <w:br/>
+        <w:t xml:space="preserve">    plt.close(fig)</w:t>
+        <w:br/>
+        <w:t xml:space="preserve">    print(f"\n  Summary grid saved → {grid_file}")</w:t>
+        <w:br/>
+        <w:br/>
+        <w:t xml:space="preserve">    # ── SERS-unique peak frequency table ─────────────────────────────────────</w:t>
+        <w:br/>
+        <w:t xml:space="preserve">    # Collect all SERS-unique peaks across all spectra; bin into 20-cm⁻¹ slots</w:t>
+        <w:br/>
+        <w:t xml:space="preserve">    sers_unique = []</w:t>
+        <w:br/>
+        <w:t xml:space="preserve">    for pk_map in all_peaks_map:</w:t>
+        <w:br/>
+        <w:t xml:space="preserve">        for wn_p in pk_map:</w:t>
+        <w:br/>
+        <w:t xml:space="preserve">            if not (400 &lt;= wn_p &lt;= 1800):</w:t>
+        <w:br/>
+        <w:t xml:space="preserve">                continue</w:t>
+        <w:br/>
+        <w:t xml:space="preserve">            if not any(abs(wn_p - c) &lt; 22 for c in peaks_caf2):</w:t>
+        <w:br/>
+        <w:t xml:space="preserve">                sers_unique.append(wn_p)</w:t>
+        <w:br/>
+        <w:br/>
+        <w:t xml:space="preserve">    if sers_unique:</w:t>
+        <w:br/>
+        <w:t xml:space="preserve">        sers_unique = np.array(sers_unique)</w:t>
+        <w:br/>
+        <w:t xml:space="preserve">        bins = np.arange(400, 1820, 20)</w:t>
+        <w:br/>
+        <w:t xml:space="preserve">        counts, edges = np.histogram(sers_unique, bins=bins)</w:t>
+        <w:br/>
+        <w:t xml:space="preserve">        hot = np.where(counts &gt; 0)[0]</w:t>
+        <w:br/>
+        <w:t xml:space="preserve">        print(f"\n  SERS-unique peak frequency (wavenumber : # spectra showing it):")</w:t>
+        <w:br/>
+        <w:t xml:space="preserve">        for idx_b in hot:</w:t>
+        <w:br/>
+        <w:t xml:space="preserve">            c = int(counts[idx_b])</w:t>
+        <w:br/>
+        <w:t xml:space="preserve">            wn_c = 0.5 * (edges[idx_b] + edges[idx_b + 1])</w:t>
+        <w:br/>
+        <w:t xml:space="preserve">            bar = "█" * c</w:t>
+        <w:br/>
+        <w:t xml:space="preserve">            print(f"    {wn_c:6.0f} cm⁻¹ : {c:2d}  {bar}")</w:t>
+        <w:br/>
+        <w:br/>
+        <w:t xml:space="preserve">    print(f"\n  All files saved to: {out_dir}\n")</w:t>
+        <w:br/>
+        <w:br/>
+        <w:br/>
+        <w:t># ─────────────────────────────────────────────────────────────────────────────</w:t>
+        <w:br/>
         <w:t>#  MAIN</w:t>
         <w:br/>
         <w:t># ─────────────────────────────────────────────────────────────────────────────</w:t>
@@ -2811,11 +3278,30 @@
         <w:t xml:space="preserve">    snv_s = preprocess_single(wn_s, raw_s)</w:t>
         <w:br/>
         <w:br/>
-        <w:t xml:space="preserve">    # ── Comparison plot ───────────────────────────────────────────────────────</w:t>
+        <w:t xml:space="preserve">    # ── Comparison plot (SNV overlay) ─────────────────────────────────────────</w:t>
         <w:br/>
         <w:t xml:space="preserve">    print("  Generating comparison figure …")</w:t>
         <w:br/>
         <w:t xml:space="preserve">    plot_comparison(wn, avg_snv, wn_s, snv_s)</w:t>
+        <w:br/>
+        <w:br/>
+        <w:t xml:space="preserve">    # ── Individual spectra vs CaF₂  ───────────────────────────────────────────</w:t>
+        <w:br/>
+        <w:t xml:space="preserve">    print("\n" + "="*55)</w:t>
+        <w:br/>
+        <w:t xml:space="preserve">    print("  INDIVIDUAL SPECTRA vs CaF₂  (400–1800 cm⁻¹)")</w:t>
+        <w:br/>
+        <w:t xml:space="preserve">    print("="*55)</w:t>
+        <w:br/>
+        <w:t xml:space="preserve">    # Save to the same folder as the input .l6m file</w:t>
+        <w:br/>
+        <w:t xml:space="preserve">    out_dir = os.path.join(os.path.dirname(FILE_PATH), "individual_spectra")</w:t>
+        <w:br/>
+        <w:t xml:space="preserve">    print(f"  Output folder: {out_dir}")</w:t>
+        <w:br/>
+        <w:t xml:space="preserve">    # Use spike-cleaned spectra so cosmic rays don't become false peaks</w:t>
+        <w:br/>
+        <w:t xml:space="preserve">    plot_all_individual(wn, cleaned_spectra, wn_s, raw_s, out_dir)</w:t>
         <w:br/>
         <w:br/>
         <w:t xml:space="preserve">    print("\n  Done.\n")</w:t>

</xml_diff>

<commit_message>
v5: zoomed 3-panel individual spectra with baseline-corrected display
Key fixes vs v4:
- Spectra now shown ALS-baseline-corrected (fluorescence floor removed),
  so Raman peaks clearly rise from zero instead of being invisible bumps
  on a 200-count background
- Each figure split into 3 zoomed sub-panels (400-750, 750-1250, 1250-1800)
  for 2-3x horizontal magnification per region
- CaF2 peak detection now uses strict thresholds (distance 60 cm-1,
  height 12%, prominence 10%) to suppress noise false-positives
- SERS peak detection uses moderate thresholds (45 cm-1, 6%, 5%)
- Peak labels enlarged (fontsize 9) with coloured bounding boxes
- Fill-under-curve added to both traces for visual clarity
- Summary grid also shows baseline-corrected spectra

https://claude.ai/code/session_01MMZZNNZ37d4FGiNKUpmbH2
</commit_message>
<xml_diff>
--- a/Raman_Analysis_Code_and_Explanation.docx
+++ b/Raman_Analysis_Code_and_Explanation.docx
@@ -2669,74 +2669,190 @@
         <w:br/>
         <w:br/>
         <w:br/>
-        <w:t># ─────────────────────────────────────────────────────────────────────────────</w:t>
+        <w:br/>
+        <w:t># -----------------------------------------------------------------------------</w:t>
         <w:br/>
         <w:t>#  11.  PEAK DETECTION  (automatic, scipy.signal)</w:t>
         <w:br/>
-        <w:t># ─────────────────────────────────────────────────────────────────────────────</w:t>
-        <w:br/>
-        <w:t>def detect_peaks(wn, spectrum, distance_cm=35, height_pct=0.04, prominence_pct=0.03):</w:t>
+        <w:t># -----------------------------------------------------------------------------</w:t>
+        <w:br/>
+        <w:t>def _baseline_correct_display(wn, spectrum):</w:t>
+        <w:br/>
+        <w:t xml:space="preserve">    """Baseline-correct a spectrum for display; returns (wn_region, bc_spectrum)."""</w:t>
+        <w:br/>
+        <w:t xml:space="preserve">    mask  = (wn &gt;= 395) &amp; (wn &lt;= 1810)</w:t>
+        <w:br/>
+        <w:t xml:space="preserve">    wn_r  = wn[mask]</w:t>
+        <w:br/>
+        <w:t xml:space="preserve">    sp_sg = savgol_filter(spectrum[mask], window_length=11, polyorder=3)</w:t>
+        <w:br/>
+        <w:t xml:space="preserve">    bline = als_baseline(sp_sg, lam=1e6, p=0.005, n_iter=15)</w:t>
+        <w:br/>
+        <w:t xml:space="preserve">    return wn_r, np.clip(sp_sg - bline, 0, None)</w:t>
+        <w:br/>
+        <w:br/>
+        <w:br/>
+        <w:t>def detect_peaks(wn, spectrum,</w:t>
+        <w:br/>
+        <w:t xml:space="preserve">                 distance_cm=45, height_pct=0.06, prominence_pct=0.05):</w:t>
         <w:br/>
         <w:t xml:space="preserve">    """</w:t>
         <w:br/>
-        <w:t xml:space="preserve">    Find peaks in a spectrum over 400–1800 cm⁻¹.</w:t>
-        <w:br/>
-        <w:br/>
-        <w:t xml:space="preserve">    Works on the ALS-baseline-corrected signal so broad fluorescence</w:t>
-        <w:br/>
-        <w:t xml:space="preserve">    background does not swamp low Raman peaks.  Returns an array of</w:t>
-        <w:br/>
-        <w:t xml:space="preserve">    peak wavenumbers sorted by ascending wavenumber.</w:t>
+        <w:t xml:space="preserve">    Find peaks in the ALS-baseline-corrected spectrum (400-1800 cm-1).</w:t>
+        <w:br/>
+        <w:t xml:space="preserve">    Returns sorted array of peak wavenumbers.</w:t>
         <w:br/>
         <w:t xml:space="preserve">    """</w:t>
         <w:br/>
         <w:t xml:space="preserve">    from scipy.signal import find_peaks as _fp</w:t>
         <w:br/>
-        <w:br/>
-        <w:t xml:space="preserve">    mask = (wn &gt;= 395) &amp; (wn &lt;= 1810)</w:t>
-        <w:br/>
-        <w:t xml:space="preserve">    wn_r   = wn[mask]</w:t>
-        <w:br/>
-        <w:t xml:space="preserve">    sp_sg  = savgol_filter(spectrum[mask], window_length=11, polyorder=3)</w:t>
-        <w:br/>
-        <w:t xml:space="preserve">    bline  = als_baseline(sp_sg, lam=1e5, p=0.01, n_iter=10)</w:t>
-        <w:br/>
-        <w:t xml:space="preserve">    sp_bc  = np.clip(sp_sg - bline, 0, None)</w:t>
-        <w:br/>
+        <w:t xml:space="preserve">    wn_r, sp_bc = _baseline_correct_display(wn, spectrum)</w:t>
         <w:br/>
         <w:t xml:space="preserve">    if sp_bc.max() &lt; 1e-6:</w:t>
         <w:br/>
         <w:t xml:space="preserve">        return np.array([])</w:t>
         <w:br/>
-        <w:br/>
-        <w:t xml:space="preserve">    step         = float(np.diff(wn_r).mean())</w:t>
-        <w:br/>
-        <w:t xml:space="preserve">    dist_pts     = max(3, int(distance_cm / step))</w:t>
-        <w:br/>
-        <w:t xml:space="preserve">    height_thr   = height_pct    * sp_bc.max()</w:t>
-        <w:br/>
-        <w:t xml:space="preserve">    prom_thr     = prominence_pct * sp_bc.max()</w:t>
-        <w:br/>
-        <w:br/>
-        <w:t xml:space="preserve">    idxs, _ = _fp(sp_bc, height=height_thr, distance=dist_pts,</w:t>
-        <w:br/>
-        <w:t xml:space="preserve">                  prominence=prom_thr)</w:t>
+        <w:t xml:space="preserve">    step     = float(np.diff(wn_r).mean())</w:t>
+        <w:br/>
+        <w:t xml:space="preserve">    dist_pts = max(3, int(distance_cm / step))</w:t>
+        <w:br/>
+        <w:t xml:space="preserve">    idxs, _ = _fp(sp_bc,</w:t>
+        <w:br/>
+        <w:t xml:space="preserve">                  height     = height_pct    * sp_bc.max(),</w:t>
+        <w:br/>
+        <w:t xml:space="preserve">                  distance   = dist_pts,</w:t>
+        <w:br/>
+        <w:t xml:space="preserve">                  prominence = prominence_pct * sp_bc.max())</w:t>
         <w:br/>
         <w:t xml:space="preserve">    return wn_r[idxs]</w:t>
         <w:br/>
         <w:br/>
         <w:br/>
-        <w:t># ─────────────────────────────────────────────────────────────────────────────</w:t>
-        <w:br/>
-        <w:t>#  12.  INDIVIDUAL SPECTRUM vs CaF₂ COMPARISON PLOTS</w:t>
-        <w:br/>
-        <w:t># ─────────────────────────────────────────────────────────────────────────────</w:t>
-        <w:br/>
-        <w:t>def _sg_display(spectrum, wl=9, po=3):</w:t>
-        <w:br/>
-        <w:t xml:space="preserve">    """Light Savitzky-Golay smooth for display (preserves counts scale)."""</w:t>
-        <w:br/>
-        <w:t xml:space="preserve">    return savgol_filter(spectrum, window_length=wl, polyorder=po)</w:t>
+        <w:t>def detect_peaks_caf2(wn, spectrum):</w:t>
+        <w:br/>
+        <w:t xml:space="preserve">    """Stricter peak detection for CaF2 (few real Raman bands in 400-1800)."""</w:t>
+        <w:br/>
+        <w:t xml:space="preserve">    return detect_peaks(wn, spectrum,</w:t>
+        <w:br/>
+        <w:t xml:space="preserve">                        distance_cm=60, height_pct=0.12, prominence_pct=0.10)</w:t>
+        <w:br/>
+        <w:br/>
+        <w:br/>
+        <w:t># -----------------------------------------------------------------------------</w:t>
+        <w:br/>
+        <w:t>#  12.  INDIVIDUAL SPECTRUM vs CaF2  --  3-PANEL ZOOMED FIGURES</w:t>
+        <w:br/>
+        <w:t># -----------------------------------------------------------------------------</w:t>
+        <w:br/>
+        <w:t>_ZOOM_REGIONS = [(400, 750), (750, 1250), (1250, 1800)]</w:t>
+        <w:br/>
+        <w:t>_ZOOM_LABELS  = ["400 - 750 cm⁻¹", "750 - 1250 cm⁻¹", "1250 - 1800 cm⁻¹"]</w:t>
+        <w:br/>
+        <w:br/>
+        <w:br/>
+        <w:t>def _annotate_panel(ax, wn_m, sp_m, wn_c, sp_c,</w:t>
+        <w:br/>
+        <w:t xml:space="preserve">                    peaks_map, peaks_caf2, lo, hi, peak_tol=22.0):</w:t>
+        <w:br/>
+        <w:t xml:space="preserve">    """</w:t>
+        <w:br/>
+        <w:t xml:space="preserve">    Add dotted vertical lines + wavenumber labels to one zoomed panel.</w:t>
+        <w:br/>
+        <w:t xml:space="preserve">    Red bold '?' label  =&gt; peak in SERS but NOT in CaF2.</w:t>
+        <w:br/>
+        <w:t xml:space="preserve">    Grey label          =&gt; peak shared with CaF2 (substrate/instrument).</w:t>
+        <w:br/>
+        <w:t xml:space="preserve">    """</w:t>
+        <w:br/>
+        <w:t xml:space="preserve">    y_m   = sp_m[(wn_m &gt;= lo) &amp; (wn_m &lt;= hi)]</w:t>
+        <w:br/>
+        <w:t xml:space="preserve">    y_c   = sp_c[(wn_c &gt;= lo) &amp; (wn_c &lt;= hi)]</w:t>
+        <w:br/>
+        <w:t xml:space="preserve">    ymax  = max(y_m.max() if y_m.size else 0, y_c.max() if y_c.size else 0)</w:t>
+        <w:br/>
+        <w:t xml:space="preserve">    yspan = ymax if ymax &gt; 0 else 1.0</w:t>
+        <w:br/>
+        <w:br/>
+        <w:t xml:space="preserve">    used_x = []</w:t>
+        <w:br/>
+        <w:br/>
+        <w:t xml:space="preserve">    # SERS peaks</w:t>
+        <w:br/>
+        <w:t xml:space="preserve">    for wn_p in sorted(peaks_map):</w:t>
+        <w:br/>
+        <w:t xml:space="preserve">        if not (lo &lt;= wn_p &lt;= hi):</w:t>
+        <w:br/>
+        <w:t xml:space="preserve">            continue</w:t>
+        <w:br/>
+        <w:t xml:space="preserve">        if any(abs(wn_p - u) &lt; peak_tol * 0.6 for u in used_x):</w:t>
+        <w:br/>
+        <w:t xml:space="preserve">            continue</w:t>
+        <w:br/>
+        <w:t xml:space="preserve">        used_x.append(wn_p)</w:t>
+        <w:br/>
+        <w:br/>
+        <w:t xml:space="preserve">        in_caf2 = any(abs(wn_p - c) &lt; peak_tol for c in peaks_caf2)</w:t>
+        <w:br/>
+        <w:t xml:space="preserve">        color  = "#C0392B" if not in_caf2 else "#555555"</w:t>
+        <w:br/>
+        <w:t xml:space="preserve">        weight = "bold"    if not in_caf2 else "normal"</w:t>
+        <w:br/>
+        <w:t xml:space="preserve">        marker = "?\n"     if not in_caf2 else ""</w:t>
+        <w:br/>
+        <w:br/>
+        <w:t xml:space="preserve">        i_loc  = np.argmin(np.abs(wn_m - wn_p))</w:t>
+        <w:br/>
+        <w:t xml:space="preserve">        y_peak = sp_m[i_loc]</w:t>
+        <w:br/>
+        <w:br/>
+        <w:t xml:space="preserve">        ax.axvline(wn_p, color=color, lw=0.9, ls="--", alpha=0.75)</w:t>
+        <w:br/>
+        <w:t xml:space="preserve">        ax.text(wn_p, y_peak + yspan * 0.06,</w:t>
+        <w:br/>
+        <w:t xml:space="preserve">                f"{marker}{int(round(wn_p))}",</w:t>
+        <w:br/>
+        <w:t xml:space="preserve">                fontsize=9, ha="center", va="bottom",</w:t>
+        <w:br/>
+        <w:t xml:space="preserve">                color=color, fontweight=weight,</w:t>
+        <w:br/>
+        <w:t xml:space="preserve">                bbox=dict(boxstyle="round,pad=0.15", fc="white",</w:t>
+        <w:br/>
+        <w:t xml:space="preserve">                          ec=color, lw=0.5, alpha=0.85))</w:t>
+        <w:br/>
+        <w:br/>
+        <w:t xml:space="preserve">    # CaF2-only peaks</w:t>
+        <w:br/>
+        <w:t xml:space="preserve">    for wn_p in sorted(peaks_caf2):</w:t>
+        <w:br/>
+        <w:t xml:space="preserve">        if not (lo &lt;= wn_p &lt;= hi):</w:t>
+        <w:br/>
+        <w:t xml:space="preserve">            continue</w:t>
+        <w:br/>
+        <w:t xml:space="preserve">        if any(abs(wn_p - u) &lt; peak_tol * 0.6 for u in used_x):</w:t>
+        <w:br/>
+        <w:t xml:space="preserve">            continue</w:t>
+        <w:br/>
+        <w:t xml:space="preserve">        used_x.append(wn_p)</w:t>
+        <w:br/>
+        <w:br/>
+        <w:t xml:space="preserve">        i_loc  = np.argmin(np.abs(wn_c - wn_p))</w:t>
+        <w:br/>
+        <w:t xml:space="preserve">        y_peak = sp_c[i_loc]</w:t>
+        <w:br/>
+        <w:br/>
+        <w:t xml:space="preserve">        ax.axvline(wn_p, color="#999999", lw=0.7, ls="--", alpha=0.60)</w:t>
+        <w:br/>
+        <w:t xml:space="preserve">        ax.text(wn_p, y_peak + yspan * 0.04,</w:t>
+        <w:br/>
+        <w:t xml:space="preserve">                f"{int(round(wn_p))}",</w:t>
+        <w:br/>
+        <w:t xml:space="preserve">                fontsize=7.5, ha="center", va="bottom",</w:t>
+        <w:br/>
+        <w:t xml:space="preserve">                color="#777777",</w:t>
+        <w:br/>
+        <w:t xml:space="preserve">                bbox=dict(boxstyle="round,pad=0.10", fc="white",</w:t>
+        <w:br/>
+        <w:t xml:space="preserve">                          ec="none", alpha=0.7))</w:t>
         <w:br/>
         <w:br/>
         <w:br/>
@@ -2744,392 +2860,294 @@
         <w:br/>
         <w:t xml:space="preserve">                          peaks_map, peaks_caf2,</w:t>
         <w:br/>
-        <w:t xml:space="preserve">                          spectrum_idx, out_dir,</w:t>
-        <w:br/>
-        <w:t xml:space="preserve">                          peak_tol=22.0):</w:t>
+        <w:t xml:space="preserve">                          spectrum_idx, out_dir, peak_tol=22.0):</w:t>
         <w:br/>
         <w:t xml:space="preserve">    """</w:t>
         <w:br/>
-        <w:t xml:space="preserve">    One-panel figure: SERS spectrum (black) vs CaF₂ reference (red).</w:t>
-        <w:br/>
-        <w:br/>
-        <w:t xml:space="preserve">    Dotted vertical lines mark every detected peak.</w:t>
-        <w:br/>
-        <w:t xml:space="preserve">    Wavenumber label + '?' → peak present in SERS but NOT in CaF₂.</w:t>
-        <w:br/>
-        <w:t xml:space="preserve">    Plain wavenumber label  → peak present in BOTH (substrate / instrument).</w:t>
+        <w:t xml:space="preserve">    Three-panel zoomed figure per map spectrum.</w:t>
+        <w:br/>
+        <w:br/>
+        <w:t xml:space="preserve">    Both spectra displayed baseline-corrected so Raman peaks rise from zero.</w:t>
+        <w:br/>
+        <w:t xml:space="preserve">    Panel 1: 400-750 cm-1   Panel 2: 750-1250 cm-1   Panel 3: 1250-1800 cm-1</w:t>
+        <w:br/>
+        <w:t xml:space="preserve">    Black = SERS.  Red = CaF2.  Red bold '?' = SERS-specific peak.</w:t>
         <w:br/>
         <w:t xml:space="preserve">    """</w:t>
         <w:br/>
         <w:t xml:space="preserve">    matplotlib.rcParams.update({"font.family": "DejaVu Sans",</w:t>
         <w:br/>
+        <w:t xml:space="preserve">                                 "figure.facecolor": "white",</w:t>
+        <w:br/>
+        <w:t xml:space="preserve">                                 "axes.titlesize": 11,</w:t>
+        <w:br/>
+        <w:t xml:space="preserve">                                 "axes.titleweight": "bold"})</w:t>
+        <w:br/>
+        <w:br/>
+        <w:t xml:space="preserve">    wn_m, sp_m = _baseline_correct_display(wn_map,  sp_map)</w:t>
+        <w:br/>
+        <w:t xml:space="preserve">    wn_c, sp_c = _baseline_correct_display(wn_caf2, sp_caf2)</w:t>
+        <w:br/>
+        <w:br/>
+        <w:t xml:space="preserve">    fig, axes = plt.subplots(3, 1, figsize=(16, 13),</w:t>
+        <w:br/>
+        <w:t xml:space="preserve">                             gridspec_kw={"hspace": 0.55,</w:t>
+        <w:br/>
+        <w:t xml:space="preserve">                                          "left": 0.06, "right": 0.98,</w:t>
+        <w:br/>
+        <w:t xml:space="preserve">                                          "top": 0.93, "bottom": 0.06})</w:t>
+        <w:br/>
+        <w:t xml:space="preserve">    fig.suptitle(</w:t>
+        <w:br/>
+        <w:t xml:space="preserve">        f"Spectrum #{spectrum_idx + 1}  vs  CaF₂ reference  "</w:t>
+        <w:br/>
+        <w:t xml:space="preserve">        f"(ALS baseline-corrected)\n"</w:t>
+        <w:br/>
+        <w:t xml:space="preserve">        f"Red bold ? = SERS-specific peak  |  Grey = shared with CaF₂",</w:t>
+        <w:br/>
+        <w:t xml:space="preserve">        fontsize=12, fontweight="bold"</w:t>
+        <w:br/>
+        <w:t xml:space="preserve">    )</w:t>
+        <w:br/>
+        <w:br/>
+        <w:t xml:space="preserve">    for ax, (lo, hi), rlabel in zip(axes, _ZOOM_REGIONS, _ZOOM_LABELS):</w:t>
+        <w:br/>
+        <w:t xml:space="preserve">        m_m = (wn_m &gt;= lo) &amp; (wn_m &lt;= hi)</w:t>
+        <w:br/>
+        <w:t xml:space="preserve">        m_c = (wn_c &gt;= lo) &amp; (wn_c &lt;= hi)</w:t>
+        <w:br/>
+        <w:t xml:space="preserve">        y_m = sp_m[m_m];  y_c = sp_c[m_c]</w:t>
+        <w:br/>
+        <w:br/>
+        <w:t xml:space="preserve">        if y_m.size == 0 and y_c.size == 0:</w:t>
+        <w:br/>
+        <w:t xml:space="preserve">            ax.set_visible(False); continue</w:t>
+        <w:br/>
+        <w:br/>
+        <w:t xml:space="preserve">        ax.fill_between(wn_m[m_m], y_m, alpha=0.13, color="black")</w:t>
+        <w:br/>
+        <w:t xml:space="preserve">        ax.plot(wn_m[m_m], y_m, color="black",   lw=1.7,</w:t>
+        <w:br/>
+        <w:t xml:space="preserve">                label=f"SERS #{spectrum_idx + 1}")</w:t>
+        <w:br/>
+        <w:t xml:space="preserve">        ax.fill_between(wn_c[m_c], y_c, alpha=0.13, color="#C0392B")</w:t>
+        <w:br/>
+        <w:t xml:space="preserve">        ax.plot(wn_c[m_c], y_c, color="#C0392B", lw=1.3, alpha=0.9,</w:t>
+        <w:br/>
+        <w:t xml:space="preserve">                label="CaF₂ reference")</w:t>
+        <w:br/>
+        <w:br/>
+        <w:t xml:space="preserve">        ymax_local = max(y_m.max() if y_m.size else 0,</w:t>
+        <w:br/>
+        <w:t xml:space="preserve">                         y_c.max() if y_c.size else 0)</w:t>
+        <w:br/>
+        <w:t xml:space="preserve">        ax.set_ylim(-ymax_local * 0.05, ymax_local * 1.55)</w:t>
+        <w:br/>
+        <w:br/>
+        <w:t xml:space="preserve">        _annotate_panel(ax, wn_m, sp_m, wn_c, sp_c,</w:t>
+        <w:br/>
+        <w:t xml:space="preserve">                        peaks_map, peaks_caf2, lo, hi, peak_tol)</w:t>
+        <w:br/>
+        <w:br/>
+        <w:t xml:space="preserve">        ax.set_xlim(lo, hi)</w:t>
+        <w:br/>
+        <w:t xml:space="preserve">        ax.set_xlabel("Raman shift (cm⁻¹)", fontsize=10)</w:t>
+        <w:br/>
+        <w:t xml:space="preserve">        ax.set_ylabel("Intensity (a.u.)", fontsize=10)</w:t>
+        <w:br/>
+        <w:t xml:space="preserve">        ax.set_title(rlabel)</w:t>
+        <w:br/>
+        <w:t xml:space="preserve">        ax.legend(fontsize=9, loc="upper right", framealpha=0.9)</w:t>
+        <w:br/>
+        <w:t xml:space="preserve">        ax.spines["top"].set_visible(False)</w:t>
+        <w:br/>
+        <w:t xml:space="preserve">        ax.spines["right"].set_visible(False)</w:t>
+        <w:br/>
+        <w:t xml:space="preserve">        ax.tick_params(labelsize=9)</w:t>
+        <w:br/>
+        <w:t xml:space="preserve">        ax.grid(True, alpha=0.15, lw=0.5)</w:t>
+        <w:br/>
+        <w:br/>
+        <w:t xml:space="preserve">    os.makedirs(out_dir, exist_ok=True)</w:t>
+        <w:br/>
+        <w:t xml:space="preserve">    outfile = os.path.join(out_dir, f"spectrum_{spectrum_idx + 1:02d}_vs_caf2.png")</w:t>
+        <w:br/>
+        <w:t xml:space="preserve">    fig.savefig(outfile, dpi=160, bbox_inches="tight", facecolor="white")</w:t>
+        <w:br/>
+        <w:t xml:space="preserve">    plt.close(fig)</w:t>
+        <w:br/>
+        <w:t xml:space="preserve">    return outfile</w:t>
+        <w:br/>
+        <w:br/>
+        <w:br/>
+        <w:t>def plot_all_individual(wn, spectra, wn_caf2, sp_caf2, out_dir):</w:t>
+        <w:br/>
+        <w:t xml:space="preserve">    """</w:t>
+        <w:br/>
+        <w:t xml:space="preserve">    One 3-panel zoomed figure per map spectrum + summary grid.</w:t>
+        <w:br/>
+        <w:t xml:space="preserve">    """</w:t>
+        <w:br/>
+        <w:t xml:space="preserve">    matplotlib.rcParams.update({"font.family": "DejaVu Sans",</w:t>
+        <w:br/>
         <w:t xml:space="preserve">                                 "figure.facecolor": "white"})</w:t>
         <w:br/>
         <w:br/>
-        <w:t xml:space="preserve">    # Restrict display to fingerprint region</w:t>
-        <w:br/>
-        <w:t xml:space="preserve">    fp = (400, 1800)</w:t>
-        <w:br/>
-        <w:t xml:space="preserve">    m_m   = (wn_map  &gt;= fp[0]) &amp; (wn_map  &lt;= fp[1])</w:t>
-        <w:br/>
-        <w:t xml:space="preserve">    m_c   = (wn_caf2 &gt;= fp[0]) &amp; (wn_caf2 &lt;= fp[1])</w:t>
-        <w:br/>
-        <w:br/>
-        <w:t xml:space="preserve">    sp_m_d = _sg_display(sp_map)</w:t>
-        <w:br/>
-        <w:t xml:space="preserve">    sp_c_d = _sg_display(sp_caf2)</w:t>
-        <w:br/>
-        <w:br/>
-        <w:t xml:space="preserve">    fig, ax = plt.subplots(figsize=(14, 5))</w:t>
-        <w:br/>
-        <w:t xml:space="preserve">    ax.plot(wn_map[m_m],   sp_m_d[m_m],  color="black", lw=1.3,</w:t>
-        <w:br/>
-        <w:t xml:space="preserve">            label=f"SERS map spectrum #{spectrum_idx + 1}")</w:t>
-        <w:br/>
-        <w:t xml:space="preserve">    ax.plot(wn_caf2[m_c],  sp_c_d[m_c],  color="#C0392B", lw=1.0, alpha=0.85,</w:t>
-        <w:br/>
-        <w:t xml:space="preserve">            label="CaF₂ reference")</w:t>
-        <w:br/>
-        <w:br/>
-        <w:t xml:space="preserve">    ymax_m = sp_m_d[m_m].max()</w:t>
-        <w:br/>
-        <w:t xml:space="preserve">    ymax_c = sp_c_d[m_c].max()</w:t>
-        <w:br/>
-        <w:t xml:space="preserve">    ymax   = max(ymax_m, ymax_c)</w:t>
-        <w:br/>
-        <w:t xml:space="preserve">    ymin   = min(sp_m_d[m_m].min(), sp_c_d[m_c].min())</w:t>
-        <w:br/>
-        <w:t xml:space="preserve">    y_span = ymax - ymin</w:t>
-        <w:br/>
-        <w:br/>
-        <w:t xml:space="preserve">    used_x = []</w:t>
-        <w:br/>
-        <w:br/>
-        <w:t xml:space="preserve">    # ── annotate SERS peaks ──────────────────────────────────────────────────</w:t>
-        <w:br/>
-        <w:t xml:space="preserve">    for wn_p in sorted(peaks_map):</w:t>
-        <w:br/>
-        <w:t xml:space="preserve">        if not (fp[0] &lt;= wn_p &lt;= fp[1]):</w:t>
-        <w:br/>
-        <w:t xml:space="preserve">            continue</w:t>
-        <w:br/>
-        <w:t xml:space="preserve">        if any(abs(wn_p - u) &lt; peak_tol * 0.7 for u in used_x):</w:t>
-        <w:br/>
-        <w:t xml:space="preserve">            continue</w:t>
-        <w:br/>
-        <w:t xml:space="preserve">        used_x.append(wn_p)</w:t>
-        <w:br/>
-        <w:br/>
-        <w:t xml:space="preserve">        in_caf2 = any(abs(wn_p - c) &lt; peak_tol for c in peaks_caf2)</w:t>
-        <w:br/>
-        <w:br/>
-        <w:t xml:space="preserve">        # height at this wavenumber in the smoothed map spectrum</w:t>
-        <w:br/>
-        <w:t xml:space="preserve">        i_local = np.argmin(np.abs(wn_map - wn_p))</w:t>
-        <w:br/>
-        <w:t xml:space="preserve">        y_val   = sp_m_d[i_local]</w:t>
-        <w:br/>
-        <w:br/>
-        <w:t xml:space="preserve">        color  = "#C0392B" if not in_caf2 else "#555555"</w:t>
-        <w:br/>
-        <w:t xml:space="preserve">        marker = "?\n" if not in_caf2 else ""</w:t>
-        <w:br/>
-        <w:t xml:space="preserve">        lw_vl  = 1.0 if not in_caf2 else 0.7</w:t>
-        <w:br/>
-        <w:br/>
-        <w:t xml:space="preserve">        ax.axvline(wn_p, color=color, lw=lw_vl, ls=":", alpha=0.85)</w:t>
-        <w:br/>
-        <w:t xml:space="preserve">        ax.text(wn_p,</w:t>
-        <w:br/>
-        <w:t xml:space="preserve">                y_val + y_span * 0.04,</w:t>
-        <w:br/>
-        <w:t xml:space="preserve">                f"{marker}{int(round(wn_p))}",</w:t>
-        <w:br/>
-        <w:t xml:space="preserve">                fontsize=7.5, ha="center", va="bottom",</w:t>
-        <w:br/>
-        <w:t xml:space="preserve">                color=color,</w:t>
-        <w:br/>
-        <w:t xml:space="preserve">                fontweight="bold" if not in_caf2 else "normal",</w:t>
-        <w:br/>
-        <w:t xml:space="preserve">                bbox=dict(boxstyle="round,pad=0.1", fc="white",</w:t>
-        <w:br/>
-        <w:t xml:space="preserve">                          ec="none", alpha=0.7))</w:t>
-        <w:br/>
-        <w:br/>
-        <w:t xml:space="preserve">    # ── annotate CaF₂-only peaks ────────────────────────────────────────────</w:t>
-        <w:br/>
-        <w:t xml:space="preserve">    for wn_p in sorted(peaks_caf2):</w:t>
-        <w:br/>
-        <w:t xml:space="preserve">        if not (fp[0] &lt;= wn_p &lt;= fp[1]):</w:t>
-        <w:br/>
-        <w:t xml:space="preserve">            continue</w:t>
-        <w:br/>
-        <w:t xml:space="preserve">        if any(abs(wn_p - u) &lt; peak_tol * 0.7 for u in used_x):</w:t>
-        <w:br/>
-        <w:t xml:space="preserve">            continue</w:t>
-        <w:br/>
-        <w:t xml:space="preserve">        used_x.append(wn_p)</w:t>
-        <w:br/>
-        <w:br/>
-        <w:t xml:space="preserve">        i_local = np.argmin(np.abs(wn_caf2 - wn_p))</w:t>
-        <w:br/>
-        <w:t xml:space="preserve">        y_val   = sp_c_d[i_local]</w:t>
-        <w:br/>
-        <w:br/>
-        <w:t xml:space="preserve">        ax.axvline(wn_p, color="#888888", lw=0.6, ls=":", alpha=0.6)</w:t>
-        <w:br/>
-        <w:t xml:space="preserve">        ax.text(wn_p,</w:t>
-        <w:br/>
-        <w:t xml:space="preserve">                y_val + y_span * 0.02,</w:t>
-        <w:br/>
-        <w:t xml:space="preserve">                f"{int(round(wn_p))}",</w:t>
-        <w:br/>
-        <w:t xml:space="preserve">                fontsize=6.5, ha="center", va="bottom",</w:t>
-        <w:br/>
-        <w:t xml:space="preserve">                color="#888888", alpha=0.85)</w:t>
-        <w:br/>
-        <w:br/>
-        <w:t xml:space="preserve">    ax.set_xlim(fp[0] - 10, fp[1] + 10)</w:t>
-        <w:br/>
-        <w:t xml:space="preserve">    ax.set_ylim(ymin - y_span * 0.08, ymax + y_span * 0.30)</w:t>
-        <w:br/>
-        <w:t xml:space="preserve">    ax.set_xlabel("Raman shift (cm⁻¹)", fontsize=10)</w:t>
-        <w:br/>
-        <w:t xml:space="preserve">    ax.set_ylabel("Intensity (counts)", fontsize=10)</w:t>
-        <w:br/>
-        <w:t xml:space="preserve">    ax.set_title(</w:t>
-        <w:br/>
-        <w:t xml:space="preserve">        f"Spectrum #{spectrum_idx + 1}  vs  CaF₂ reference   "</w:t>
-        <w:br/>
-        <w:t xml:space="preserve">        f"|   ? = SERS-specific peak (not in CaF₂)",</w:t>
-        <w:br/>
-        <w:t xml:space="preserve">        fontsize=10, fontweight="bold"</w:t>
-        <w:br/>
-        <w:t xml:space="preserve">    )</w:t>
-        <w:br/>
-        <w:t xml:space="preserve">    ax.legend(fontsize=9, loc="upper right", framealpha=0.9)</w:t>
-        <w:br/>
-        <w:t xml:space="preserve">    ax.spines["top"].set_visible(False)</w:t>
-        <w:br/>
-        <w:t xml:space="preserve">    ax.spines["right"].set_visible(False)</w:t>
-        <w:br/>
-        <w:t xml:space="preserve">    ax.tick_params(labelsize=9)</w:t>
-        <w:br/>
-        <w:t xml:space="preserve">    ax.grid(True, alpha=0.12, lw=0.5)</w:t>
-        <w:br/>
-        <w:br/>
-        <w:t xml:space="preserve">    os.makedirs(out_dir, exist_ok=True)</w:t>
-        <w:br/>
-        <w:t xml:space="preserve">    outfile = os.path.join(out_dir, f"spectrum_{spectrum_idx + 1:02d}_vs_caf2.png")</w:t>
-        <w:br/>
-        <w:t xml:space="preserve">    fig.savefig(outfile, dpi=150, bbox_inches="tight", facecolor="white")</w:t>
+        <w:t xml:space="preserve">    print("\n  Detecting CaF₂ reference peaks (strict thresholds) ...")</w:t>
+        <w:br/>
+        <w:t xml:space="preserve">    peaks_caf2 = detect_peaks_caf2(wn_caf2, sp_caf2)</w:t>
+        <w:br/>
+        <w:t xml:space="preserve">    print(f"  CaF₂ peaks: {len(peaks_caf2)}  "</w:t>
+        <w:br/>
+        <w:t xml:space="preserve">          f"[{', '.join(str(int(w)) for w in sorted(peaks_caf2))}]")</w:t>
+        <w:br/>
+        <w:br/>
+        <w:t xml:space="preserve">    n = len(spectra)</w:t>
+        <w:br/>
+        <w:t xml:space="preserve">    print(f"\n  Plotting {n} individual spectra vs CaF₂ ...")</w:t>
+        <w:br/>
+        <w:br/>
+        <w:t xml:space="preserve">    all_peaks_map = []</w:t>
+        <w:br/>
+        <w:t xml:space="preserve">    for i, sp in enumerate(spectra):</w:t>
+        <w:br/>
+        <w:t xml:space="preserve">        pk = detect_peaks(wn, sp)</w:t>
+        <w:br/>
+        <w:t xml:space="preserve">        all_peaks_map.append(pk)</w:t>
+        <w:br/>
+        <w:t xml:space="preserve">        outfile = plot_spectrum_vs_caf2(</w:t>
+        <w:br/>
+        <w:t xml:space="preserve">            wn, sp, wn_caf2, sp_caf2, pk, peaks_caf2, i, out_dir)</w:t>
+        <w:br/>
+        <w:t xml:space="preserve">        sers_only = sum(1 for w in pk</w:t>
+        <w:br/>
+        <w:t xml:space="preserve">                        if not any(abs(w - c) &lt; 22 for c in peaks_caf2))</w:t>
+        <w:br/>
+        <w:t xml:space="preserve">        print(f"    [{i+1:2d}/{n}]  {len(pk)} peaks  ({sers_only} SERS-specific)"</w:t>
+        <w:br/>
+        <w:t xml:space="preserve">              f"  -&gt; {os.path.basename(outfile)}")</w:t>
+        <w:br/>
+        <w:br/>
+        <w:t xml:space="preserve">    # Summary grid (baseline-corrected)</w:t>
+        <w:br/>
+        <w:t xml:space="preserve">    ncols = 5</w:t>
+        <w:br/>
+        <w:t xml:space="preserve">    nrows = int(np.ceil(n / ncols))</w:t>
+        <w:br/>
+        <w:t xml:space="preserve">    fig, axes = plt.subplots(nrows, ncols,</w:t>
+        <w:br/>
+        <w:t xml:space="preserve">                             figsize=(ncols * 4.0, nrows * 3.0),</w:t>
+        <w:br/>
+        <w:t xml:space="preserve">                             sharex=True)</w:t>
+        <w:br/>
+        <w:t xml:space="preserve">    fig.suptitle(</w:t>
+        <w:br/>
+        <w:t xml:space="preserve">        "All SERS Map Spectra vs CaF₂  (baseline-corrected, 400-1800 cm⁻¹)\n"</w:t>
+        <w:br/>
+        <w:t xml:space="preserve">        "Black = SERS  |  Red = CaF₂  |  red ? = SERS-specific",</w:t>
+        <w:br/>
+        <w:t xml:space="preserve">        fontsize=11, fontweight="bold", y=1.01)</w:t>
+        <w:br/>
+        <w:br/>
+        <w:t xml:space="preserve">    wn_c_bc, sp_c_bc = _baseline_correct_display(wn_caf2, sp_caf2)</w:t>
+        <w:br/>
+        <w:t xml:space="preserve">    m_c_g = (wn_c_bc &gt;= 400) &amp; (wn_c_bc &lt;= 1800)</w:t>
+        <w:br/>
+        <w:br/>
+        <w:t xml:space="preserve">    for i in range(ncols * nrows):</w:t>
+        <w:br/>
+        <w:t xml:space="preserve">        ax = list(axes.flat)[i]</w:t>
+        <w:br/>
+        <w:t xml:space="preserve">        if i &gt;= n:</w:t>
+        <w:br/>
+        <w:t xml:space="preserve">            ax.set_visible(False); continue</w:t>
+        <w:br/>
+        <w:br/>
+        <w:t xml:space="preserve">        wn_m_bc, sp_m_bc = _baseline_correct_display(wn, spectra[i])</w:t>
+        <w:br/>
+        <w:t xml:space="preserve">        m_m_g = (wn_m_bc &gt;= 400) &amp; (wn_m_bc &lt;= 1800)</w:t>
+        <w:br/>
+        <w:br/>
+        <w:t xml:space="preserve">        ax.plot(wn_m_bc[m_m_g], sp_m_bc[m_m_g], color="black",   lw=0.9)</w:t>
+        <w:br/>
+        <w:t xml:space="preserve">        ax.plot(wn_c_bc[m_c_g], sp_c_bc[m_c_g], color="#C0392B", lw=0.7, alpha=0.8)</w:t>
+        <w:br/>
+        <w:br/>
+        <w:t xml:space="preserve">        ymax_g = max(sp_m_bc[m_m_g].max(), sp_c_bc[m_c_g].max())</w:t>
+        <w:br/>
+        <w:br/>
+        <w:t xml:space="preserve">        for wn_p in all_peaks_map[i]:</w:t>
+        <w:br/>
+        <w:t xml:space="preserve">            if not (400 &lt;= wn_p &lt;= 1800):</w:t>
+        <w:br/>
+        <w:t xml:space="preserve">                continue</w:t>
+        <w:br/>
+        <w:t xml:space="preserve">            in_caf2 = any(abs(wn_p - c) &lt; 22 for c in peaks_caf2)</w:t>
+        <w:br/>
+        <w:t xml:space="preserve">            color  = "#C0392B" if not in_caf2 else "#888888"</w:t>
+        <w:br/>
+        <w:t xml:space="preserve">            marker = "?" if not in_caf2 else ""</w:t>
+        <w:br/>
+        <w:t xml:space="preserve">            ax.axvline(wn_p, color=color, lw=0.5, ls=":", alpha=0.8)</w:t>
+        <w:br/>
+        <w:t xml:space="preserve">            ax.text(wn_p, ymax_g * 1.05,</w:t>
+        <w:br/>
+        <w:t xml:space="preserve">                    f"{marker}{int(round(wn_p))}",</w:t>
+        <w:br/>
+        <w:t xml:space="preserve">                    fontsize=4.5, ha="center", va="bottom",</w:t>
+        <w:br/>
+        <w:t xml:space="preserve">                    color=color, rotation=90)</w:t>
+        <w:br/>
+        <w:br/>
+        <w:t xml:space="preserve">        ax.set_xlim(400, 1800)</w:t>
+        <w:br/>
+        <w:t xml:space="preserve">        ax.set_ylim(-ymax_g * 0.05, ymax_g * 1.6)</w:t>
+        <w:br/>
+        <w:t xml:space="preserve">        ax.set_title(f"#{i + 1}", fontsize=8, pad=2)</w:t>
+        <w:br/>
+        <w:t xml:space="preserve">        ax.tick_params(labelsize=6)</w:t>
+        <w:br/>
+        <w:t xml:space="preserve">        ax.spines["top"].set_visible(False)</w:t>
+        <w:br/>
+        <w:t xml:space="preserve">        ax.spines["right"].set_visible(False)</w:t>
+        <w:br/>
+        <w:br/>
+        <w:t xml:space="preserve">    fig.tight_layout()</w:t>
+        <w:br/>
+        <w:t xml:space="preserve">    grid_file = os.path.join(out_dir, "summary_grid_all_spectra.png")</w:t>
+        <w:br/>
+        <w:t xml:space="preserve">    fig.savefig(grid_file, dpi=150, bbox_inches="tight", facecolor="white")</w:t>
         <w:br/>
         <w:t xml:space="preserve">    plt.close(fig)</w:t>
         <w:br/>
-        <w:t xml:space="preserve">    return outfile</w:t>
-        <w:br/>
-        <w:br/>
-        <w:br/>
-        <w:t>def plot_all_individual(wn, spectra, wn_caf2, sp_caf2, out_dir):</w:t>
-        <w:br/>
-        <w:t xml:space="preserve">    """</w:t>
-        <w:br/>
-        <w:t xml:space="preserve">    Generate one figure per map spectrum (spectrum_01 … spectrum_N) plus a</w:t>
-        <w:br/>
-        <w:t xml:space="preserve">    summary grid showing all spectra together.</w:t>
-        <w:br/>
-        <w:t xml:space="preserve">    """</w:t>
-        <w:br/>
-        <w:t xml:space="preserve">    matplotlib.rcParams.update({"font.family": "DejaVu Sans",</w:t>
-        <w:br/>
-        <w:t xml:space="preserve">                                 "figure.facecolor": "white"})</w:t>
-        <w:br/>
-        <w:br/>
-        <w:t xml:space="preserve">    print(f"\n  Detecting CaF₂ reference peaks …")</w:t>
-        <w:br/>
-        <w:t xml:space="preserve">    peaks_caf2 = detect_peaks(wn_caf2, sp_caf2)</w:t>
-        <w:br/>
-        <w:t xml:space="preserve">    print(f"  CaF₂ peaks found: {len(peaks_caf2)}  "</w:t>
-        <w:br/>
-        <w:t xml:space="preserve">          f"({', '.join(str(int(w)) for w in peaks_caf2[:10])}{'…' if len(peaks_caf2)&gt;10 else ''})")</w:t>
-        <w:br/>
-        <w:br/>
-        <w:t xml:space="preserve">    n = len(spectra)</w:t>
-        <w:br/>
-        <w:t xml:space="preserve">    print(f"\n  Plotting {n} individual spectra vs CaF₂ …")</w:t>
-        <w:br/>
-        <w:br/>
-        <w:t xml:space="preserve">    # ── Individual figures ────────────────────────────────────────────────────</w:t>
-        <w:br/>
-        <w:t xml:space="preserve">    all_peaks_map = []</w:t>
-        <w:br/>
-        <w:t xml:space="preserve">    for i, sp in enumerate(spectra):</w:t>
-        <w:br/>
-        <w:t xml:space="preserve">        pk = detect_peaks(wn, sp)</w:t>
-        <w:br/>
-        <w:t xml:space="preserve">        all_peaks_map.append(pk)</w:t>
-        <w:br/>
-        <w:t xml:space="preserve">        outfile = plot_spectrum_vs_caf2(</w:t>
-        <w:br/>
-        <w:t xml:space="preserve">            wn, sp, wn_caf2, sp_caf2,</w:t>
-        <w:br/>
-        <w:t xml:space="preserve">            pk, peaks_caf2, i, out_dir</w:t>
-        <w:br/>
-        <w:t xml:space="preserve">        )</w:t>
-        <w:br/>
-        <w:t xml:space="preserve">        print(f"    [{i+1:2d}/{n}]  {len(pk)} peaks  → {os.path.basename(outfile)}")</w:t>
-        <w:br/>
-        <w:br/>
-        <w:t xml:space="preserve">    # ── Summary grid ─────────────────────────────────────────────────────────</w:t>
-        <w:br/>
-        <w:t xml:space="preserve">    ncols = 5</w:t>
-        <w:br/>
-        <w:t xml:space="preserve">    nrows = int(np.ceil(n / ncols))</w:t>
-        <w:br/>
-        <w:t xml:space="preserve">    fig, axes = plt.subplots(nrows, ncols,</w:t>
-        <w:br/>
-        <w:t xml:space="preserve">                             figsize=(ncols * 4.5, nrows * 3.2),</w:t>
-        <w:br/>
-        <w:t xml:space="preserve">                             sharex=True)</w:t>
-        <w:br/>
-        <w:t xml:space="preserve">    fig.suptitle(</w:t>
-        <w:br/>
-        <w:t xml:space="preserve">        "All SERS Map Spectra vs CaF₂ Reference  (400–1800 cm⁻¹)\n"</w:t>
-        <w:br/>
-        <w:t xml:space="preserve">        "Black = SERS  |  Red = CaF₂  |  ? = SERS-specific peak",</w:t>
-        <w:br/>
-        <w:t xml:space="preserve">        fontsize=12, fontweight="bold", y=1.01</w:t>
-        <w:br/>
-        <w:t xml:space="preserve">    )</w:t>
-        <w:br/>
-        <w:br/>
-        <w:t xml:space="preserve">    sp_caf2_sg = _sg_display(sp_caf2)</w:t>
-        <w:br/>
-        <w:t xml:space="preserve">    m_c = (wn_caf2 &gt;= 400) &amp; (wn_caf2 &lt;= 1800)</w:t>
-        <w:br/>
-        <w:br/>
-        <w:t xml:space="preserve">    axes_flat = axes.flat if nrows &gt; 1 else [axes] if ncols == 1 else list(axes.flat)</w:t>
-        <w:br/>
-        <w:t xml:space="preserve">    for i in range(ncols * nrows):</w:t>
-        <w:br/>
-        <w:t xml:space="preserve">        ax = list(axes.flat)[i]</w:t>
-        <w:br/>
-        <w:t xml:space="preserve">        if i &gt;= n:</w:t>
-        <w:br/>
-        <w:t xml:space="preserve">            ax.set_visible(False)</w:t>
-        <w:br/>
-        <w:t xml:space="preserve">            continue</w:t>
-        <w:br/>
-        <w:br/>
-        <w:t xml:space="preserve">        sp_sg = _sg_display(spectra[i])</w:t>
-        <w:br/>
-        <w:t xml:space="preserve">        m_m   = (wn &gt;= 400) &amp; (wn &lt;= 1800)</w:t>
-        <w:br/>
-        <w:br/>
-        <w:t xml:space="preserve">        ax.plot(wn[m_m],      sp_sg[m_m],      color="black", lw=0.9)</w:t>
-        <w:br/>
-        <w:t xml:space="preserve">        ax.plot(wn_caf2[m_c], sp_caf2_sg[m_c], color="#C0392B", lw=0.7, alpha=0.8)</w:t>
-        <w:br/>
-        <w:br/>
-        <w:t xml:space="preserve">        ymax = max(sp_sg[m_m].max(), sp_caf2_sg[m_c].max())</w:t>
-        <w:br/>
-        <w:t xml:space="preserve">        ymin = min(sp_sg[m_m].min(), sp_caf2_sg[m_c].min())</w:t>
-        <w:br/>
-        <w:br/>
-        <w:t xml:space="preserve">        for wn_p in all_peaks_map[i]:</w:t>
-        <w:br/>
-        <w:t xml:space="preserve">            if not (400 &lt;= wn_p &lt;= 1800):</w:t>
-        <w:br/>
-        <w:t xml:space="preserve">                continue</w:t>
-        <w:br/>
-        <w:t xml:space="preserve">            in_caf2 = any(abs(wn_p - c) &lt; 22 for c in peaks_caf2)</w:t>
-        <w:br/>
-        <w:t xml:space="preserve">            color = "#C0392B" if not in_caf2 else "#888888"</w:t>
-        <w:br/>
-        <w:t xml:space="preserve">            ax.axvline(wn_p, color=color, lw=0.5, ls=":", alpha=0.8)</w:t>
-        <w:br/>
-        <w:t xml:space="preserve">            marker = "?" if not in_caf2 else ""</w:t>
-        <w:br/>
-        <w:t xml:space="preserve">            ax.text(wn_p, ymax + (ymax - ymin) * 0.05,</w:t>
-        <w:br/>
-        <w:t xml:space="preserve">                    f"{marker}{int(round(wn_p))}",</w:t>
-        <w:br/>
-        <w:t xml:space="preserve">                    fontsize=5.5, ha="center", va="bottom",</w:t>
-        <w:br/>
-        <w:t xml:space="preserve">                    color=color, rotation=90)</w:t>
-        <w:br/>
-        <w:br/>
-        <w:t xml:space="preserve">        ax.set_xlim(400, 1800)</w:t>
-        <w:br/>
-        <w:t xml:space="preserve">        ax.set_ylim(ymin - (ymax - ymin) * 0.05,</w:t>
-        <w:br/>
-        <w:t xml:space="preserve">                    ymax + (ymax - ymin) * 0.45)</w:t>
-        <w:br/>
-        <w:t xml:space="preserve">        ax.set_title(f"#{i + 1}", fontsize=8, pad=2)</w:t>
-        <w:br/>
-        <w:t xml:space="preserve">        ax.tick_params(labelsize=6)</w:t>
-        <w:br/>
-        <w:t xml:space="preserve">        ax.spines["top"].set_visible(False)</w:t>
-        <w:br/>
-        <w:t xml:space="preserve">        ax.spines["right"].set_visible(False)</w:t>
-        <w:br/>
-        <w:br/>
-        <w:t xml:space="preserve">    for ax in list(axes.flat)[n:]:</w:t>
-        <w:br/>
-        <w:t xml:space="preserve">        ax.set_visible(False)</w:t>
-        <w:br/>
-        <w:br/>
-        <w:t xml:space="preserve">    fig.tight_layout()</w:t>
-        <w:br/>
-        <w:t xml:space="preserve">    grid_file = os.path.join(out_dir, "summary_grid_all_spectra.png")</w:t>
-        <w:br/>
-        <w:t xml:space="preserve">    fig.savefig(grid_file, dpi=150, bbox_inches="tight", facecolor="white")</w:t>
-        <w:br/>
-        <w:t xml:space="preserve">    plt.close(fig)</w:t>
-        <w:br/>
-        <w:t xml:space="preserve">    print(f"\n  Summary grid saved → {grid_file}")</w:t>
-        <w:br/>
-        <w:br/>
-        <w:t xml:space="preserve">    # ── SERS-unique peak frequency table ─────────────────────────────────────</w:t>
-        <w:br/>
-        <w:t xml:space="preserve">    # Collect all SERS-unique peaks across all spectra; bin into 20-cm⁻¹ slots</w:t>
-        <w:br/>
-        <w:t xml:space="preserve">    sers_unique = []</w:t>
-        <w:br/>
-        <w:t xml:space="preserve">    for pk_map in all_peaks_map:</w:t>
-        <w:br/>
-        <w:t xml:space="preserve">        for wn_p in pk_map:</w:t>
-        <w:br/>
-        <w:t xml:space="preserve">            if not (400 &lt;= wn_p &lt;= 1800):</w:t>
-        <w:br/>
-        <w:t xml:space="preserve">                continue</w:t>
-        <w:br/>
-        <w:t xml:space="preserve">            if not any(abs(wn_p - c) &lt; 22 for c in peaks_caf2):</w:t>
-        <w:br/>
-        <w:t xml:space="preserve">                sers_unique.append(wn_p)</w:t>
-        <w:br/>
+        <w:t xml:space="preserve">    print(f"\n  Summary grid -&gt; {grid_file}")</w:t>
+        <w:br/>
+        <w:br/>
+        <w:t xml:space="preserve">    # SERS-unique peak frequency table</w:t>
+        <w:br/>
+        <w:t xml:space="preserve">    sers_unique = [wn_p for pk in all_peaks_map for wn_p in pk</w:t>
+        <w:br/>
+        <w:t xml:space="preserve">                   if 400 &lt;= wn_p &lt;= 1800</w:t>
+        <w:br/>
+        <w:t xml:space="preserve">                   and not any(abs(wn_p - c) &lt; 22 for c in peaks_caf2)]</w:t>
         <w:br/>
         <w:t xml:space="preserve">    if sers_unique:</w:t>
         <w:br/>
-        <w:t xml:space="preserve">        sers_unique = np.array(sers_unique)</w:t>
-        <w:br/>
-        <w:t xml:space="preserve">        bins = np.arange(400, 1820, 20)</w:t>
-        <w:br/>
-        <w:t xml:space="preserve">        counts, edges = np.histogram(sers_unique, bins=bins)</w:t>
+        <w:t xml:space="preserve">        bins = np.arange(400, 1820, 25)</w:t>
+        <w:br/>
+        <w:t xml:space="preserve">        counts, edges = np.histogram(np.array(sers_unique), bins=bins)</w:t>
         <w:br/>
         <w:t xml:space="preserve">        hot = np.where(counts &gt; 0)[0]</w:t>
         <w:br/>
-        <w:t xml:space="preserve">        print(f"\n  SERS-unique peak frequency (wavenumber : # spectra showing it):")</w:t>
-        <w:br/>
-        <w:t xml:space="preserve">        for idx_b in hot:</w:t>
-        <w:br/>
-        <w:t xml:space="preserve">            c = int(counts[idx_b])</w:t>
-        <w:br/>
-        <w:t xml:space="preserve">            wn_c = 0.5 * (edges[idx_b] + edges[idx_b + 1])</w:t>
-        <w:br/>
-        <w:t xml:space="preserve">            bar = "█" * c</w:t>
-        <w:br/>
-        <w:t xml:space="preserve">            print(f"    {wn_c:6.0f} cm⁻¹ : {c:2d}  {bar}")</w:t>
+        <w:t xml:space="preserve">        print("\n  SERS-unique peak frequency  (cm-1 : n spectra):")</w:t>
+        <w:br/>
+        <w:t xml:space="preserve">        for idx_b in sorted(hot, key=lambda x: -counts[x]):</w:t>
+        <w:br/>
+        <w:t xml:space="preserve">            c  = int(counts[idx_b])</w:t>
+        <w:br/>
+        <w:t xml:space="preserve">            wc = 0.5 * (edges[idx_b] + edges[idx_b + 1])</w:t>
+        <w:br/>
+        <w:t xml:space="preserve">            print(f"    {wc:6.0f} cm-1 : {c:2d}  {'#' * c}")</w:t>
         <w:br/>
         <w:br/>
         <w:t xml:space="preserve">    print(f"\n  All files saved to: {out_dir}\n")</w:t>

</xml_diff>

<commit_message>
v6: add .txt map and CaF2 loaders for Map 2; MODE switch at top of file
New loaders:
- load_txt_map(): reads LabSpec6 exported .txt map files
  Format: #-prefixed metadata header, then row1=wavenumber axis,
  row2+= X(um) Y(um) intensity[0..N] per spectrum.
  Tested: 25 spectra x 1989 pts, 200-3200 cm-1.
- load_txt_caf2(): reads 2-column tab-separated single-spectrum .txt
  (wavenumber, intensity). Also handles optional leading row-index column.
  Tested: 861 pts, 400-1800 cm-1.

New constants:
  FILE_PATH_TXT     = m2-...-drop-edge.txt  (Map 2 SERS map)
  FILE_PATH_CAF2_TXT = S1-...-100%.txt      (CaF2 reference)

New function main_txt(): identical pipeline to main() but uses text
  loaders; saves outputs to the same folder as FILE_PATH_TXT under
  subfolder individual_spectra_map2/.

MODE switch at top of file:
  MODE = "map2"  -> runs main_txt()   (default, active now)
  MODE = "map1"  -> runs main()       (binary .l6m / .l6s)

https://claude.ai/code/session_01MMZZNNZ37d4FGiNKUpmbH2
</commit_message>
<xml_diff>
--- a/Raman_Analysis_Code_and_Explanation.docx
+++ b/Raman_Analysis_Code_and_Explanation.docx
@@ -1418,8 +1418,17 @@
         <w:br/>
         <w:t>#  FILE PATHS</w:t>
         <w:br/>
+        <w:t>#  Set MODE = "map1"  to run on the binary .l6m map  (Map 1)</w:t>
+        <w:br/>
+        <w:t>#  Set MODE = "map2"  to run on the exported .txt map (Map 2)</w:t>
+        <w:br/>
         <w:t># ─────────────────────────────────────────────────────────────────────────────</w:t>
         <w:br/>
+        <w:t>MODE = "map2"   # &lt;-- change to "map1" for the binary .l6m / .l6s pipeline</w:t>
+        <w:br/>
+        <w:br/>
+        <w:t># --- Map 1  (binary LabSpec 6 files) ---</w:t>
+        <w:br/>
         <w:t>FILE_PATH = (</w:t>
         <w:br/>
         <w:t xml:space="preserve">    r"C:\Users\Hira Aman\Desktop\RAMAN MAP 1"</w:t>
@@ -1428,7 +1437,6 @@
         <w:br/>
         <w:t>)</w:t>
         <w:br/>
-        <w:br/>
         <w:t>FILE_PATH_L6S = (</w:t>
         <w:br/>
         <w:t xml:space="preserve">    r"C:\Users\Hira Aman\Desktop\RAMAN MAP 1"</w:t>
@@ -1438,6 +1446,25 @@
         <w:t>)</w:t>
         <w:br/>
         <w:br/>
+        <w:t># --- Map 2  (LabSpec 6 exported .txt files) ---</w:t>
+        <w:br/>
+        <w:t>FILE_PATH_TXT = (</w:t>
+        <w:br/>
+        <w:t xml:space="preserve">    r"C:\Users\Hira Aman\Desktop\RAMAN MAP 1"</w:t>
+        <w:br/>
+        <w:t xml:space="preserve">    r"\m2-DNA-HACAT1-20ng-AgSiNW_532nm_600gr_BC200_50XLF_05s_4a_2-5%_5ul_drop-edge.txt"</w:t>
+        <w:br/>
+        <w:t>)</w:t>
+        <w:br/>
+        <w:t>FILE_PATH_CAF2_TXT = (</w:t>
+        <w:br/>
+        <w:t xml:space="preserve">    r"C:\Users\Hira Aman\Desktop\RAMAN MAP 1"</w:t>
+        <w:br/>
+        <w:t xml:space="preserve">    r"\S1-DNA-HACAT1-20ng-CaF2_532nm_600gr_BC50_100X_10s_4a_100%.txt"</w:t>
+        <w:br/>
+        <w:t>)</w:t>
+        <w:br/>
+        <w:br/>
         <w:t># ─────────────────────────────────────────────────────────────────────────────</w:t>
         <w:br/>
         <w:t>#  KNOWN RAMAN / SERS PEAKS  (DNA + HACAT + AgNW, 532 nm excitation)</w:t>
@@ -1585,10 +1612,205 @@
         <w:br/>
         <w:t># ─────────────────────────────────────────────────────────────────────────────</w:t>
         <w:br/>
-        <w:t>#  1b.  LOAD  .l6s  (single spectrum, LabSpec 6)</w:t>
+        <w:t>#  1b.  LOAD  .txt map  (LabSpec 6 exported text, Map 2 format)</w:t>
         <w:br/>
         <w:t># ─────────────────────────────────────────────────────────────────────────────</w:t>
         <w:br/>
+        <w:t>def load_txt_map(filepath):</w:t>
+        <w:br/>
+        <w:t xml:space="preserve">    """</w:t>
+        <w:br/>
+        <w:t xml:space="preserve">    Load a LabSpec 6 map exported as .txt.</w:t>
+        <w:br/>
+        <w:br/>
+        <w:t xml:space="preserve">    File structure:</w:t>
+        <w:br/>
+        <w:t xml:space="preserve">      Lines starting with '#' = metadata header.</w:t>
+        <w:br/>
+        <w:t xml:space="preserve">      First data line         = wavenumber axis (tab-separated floats, no X/Y prefix).</w:t>
+        <w:br/>
+        <w:t xml:space="preserve">      Subsequent data lines   = spectra: col[0]=X(um), col[1]=Y(um), col[2:]=intensities.</w:t>
+        <w:br/>
+        <w:t xml:space="preserve">    """</w:t>
+        <w:br/>
+        <w:t xml:space="preserve">    if not os.path.isfile(filepath):</w:t>
+        <w:br/>
+        <w:t xml:space="preserve">        raise FileNotFoundError(f"File not found:\n  {filepath}")</w:t>
+        <w:br/>
+        <w:br/>
+        <w:t xml:space="preserve">    with open(filepath, "r", encoding="utf-8", errors="replace") as fh:</w:t>
+        <w:br/>
+        <w:t xml:space="preserve">        lines = fh.readlines()</w:t>
+        <w:br/>
+        <w:br/>
+        <w:t xml:space="preserve">    data_lines = [l.rstrip("\n") for l in lines</w:t>
+        <w:br/>
+        <w:t xml:space="preserve">                  if l.strip() and not l.strip().startswith("#")]</w:t>
+        <w:br/>
+        <w:br/>
+        <w:t xml:space="preserve">    if len(data_lines) &lt; 2:</w:t>
+        <w:br/>
+        <w:t xml:space="preserve">        raise ValueError("No data found in .txt map file.")</w:t>
+        <w:br/>
+        <w:br/>
+        <w:t xml:space="preserve">    # First data line = wavenumber axis</w:t>
+        <w:br/>
+        <w:t xml:space="preserve">    wn_fields = data_lines[0].split("\t")</w:t>
+        <w:br/>
+        <w:t xml:space="preserve">    wavenumbers = np.array([float(v) for v in wn_fields if v.strip()], dtype=np.float64)</w:t>
+        <w:br/>
+        <w:t xml:space="preserve">    n_wn = len(wavenumbers)</w:t>
+        <w:br/>
+        <w:br/>
+        <w:t xml:space="preserve">    # Remaining lines = spectra (first two fields are X, Y coords)</w:t>
+        <w:br/>
+        <w:t xml:space="preserve">    spectra = []</w:t>
+        <w:br/>
+        <w:t xml:space="preserve">    xy = []</w:t>
+        <w:br/>
+        <w:t xml:space="preserve">    for line in data_lines[1:]:</w:t>
+        <w:br/>
+        <w:t xml:space="preserve">        parts = line.split("\t")</w:t>
+        <w:br/>
+        <w:t xml:space="preserve">        if len(parts) &lt; n_wn + 2:</w:t>
+        <w:br/>
+        <w:t xml:space="preserve">            continue</w:t>
+        <w:br/>
+        <w:t xml:space="preserve">        try:</w:t>
+        <w:br/>
+        <w:t xml:space="preserve">            x_um = float(parts[0])</w:t>
+        <w:br/>
+        <w:t xml:space="preserve">            y_um = float(parts[1])</w:t>
+        <w:br/>
+        <w:t xml:space="preserve">            intensities = np.array([float(v) for v in parts[2:2 + n_wn]],</w:t>
+        <w:br/>
+        <w:t xml:space="preserve">                                   dtype=np.float64)</w:t>
+        <w:br/>
+        <w:t xml:space="preserve">        except ValueError:</w:t>
+        <w:br/>
+        <w:t xml:space="preserve">            continue</w:t>
+        <w:br/>
+        <w:t xml:space="preserve">        if len(intensities) == n_wn:</w:t>
+        <w:br/>
+        <w:t xml:space="preserve">            spectra.append(intensities)</w:t>
+        <w:br/>
+        <w:t xml:space="preserve">            xy.append((x_um, y_um))</w:t>
+        <w:br/>
+        <w:br/>
+        <w:t xml:space="preserve">    spectra = np.array(spectra)</w:t>
+        <w:br/>
+        <w:t xml:space="preserve">    spectra[~np.isfinite(spectra)] = np.nan</w:t>
+        <w:br/>
+        <w:t xml:space="preserve">    spectra[spectra &gt; 1e7]         = np.nan</w:t>
+        <w:br/>
+        <w:t xml:space="preserve">    spectra[spectra &lt; 0]           = np.nan</w:t>
+        <w:br/>
+        <w:br/>
+        <w:t xml:space="preserve">    print(f"\n{'─'*55}")</w:t>
+        <w:br/>
+        <w:t xml:space="preserve">    print(f"  Map .txt : {len(spectra)} spectra  x  {n_wn} points")</w:t>
+        <w:br/>
+        <w:t xml:space="preserve">    print(f"  Range    : {wavenumbers[0]:.1f} - {wavenumbers[-1]:.1f} cm-1")</w:t>
+        <w:br/>
+        <w:t xml:space="preserve">    print(f"  Step     : {np.diff(wavenumbers).mean():.3f} cm-1/ch")</w:t>
+        <w:br/>
+        <w:t xml:space="preserve">    print(f"{'─'*55}\n")</w:t>
+        <w:br/>
+        <w:t xml:space="preserve">    return wavenumbers, spectra</w:t>
+        <w:br/>
+        <w:br/>
+        <w:br/>
+        <w:t>def load_txt_caf2(filepath):</w:t>
+        <w:br/>
+        <w:t xml:space="preserve">    """</w:t>
+        <w:br/>
+        <w:t xml:space="preserve">    Load a LabSpec 6 single-spectrum exported as .txt.</w:t>
+        <w:br/>
+        <w:br/>
+        <w:t xml:space="preserve">    Supports both:</w:t>
+        <w:br/>
+        <w:t xml:space="preserve">      2-column format:  wavenumber  intensity          (tab-separated)</w:t>
+        <w:br/>
+        <w:t xml:space="preserve">      3-column format:  row_index   wavenumber  intensity</w:t>
+        <w:br/>
+        <w:t xml:space="preserve">    Lines that start with '#' or cannot be parsed are skipped.</w:t>
+        <w:br/>
+        <w:t xml:space="preserve">    """</w:t>
+        <w:br/>
+        <w:t xml:space="preserve">    if not os.path.isfile(filepath):</w:t>
+        <w:br/>
+        <w:t xml:space="preserve">        raise FileNotFoundError(f"File not found:\n  {filepath}")</w:t>
+        <w:br/>
+        <w:br/>
+        <w:t xml:space="preserve">    wn_list, int_list = [], []</w:t>
+        <w:br/>
+        <w:t xml:space="preserve">    with open(filepath, "r", encoding="utf-8", errors="replace") as fh:</w:t>
+        <w:br/>
+        <w:t xml:space="preserve">        for line in fh:</w:t>
+        <w:br/>
+        <w:t xml:space="preserve">            line = line.strip()</w:t>
+        <w:br/>
+        <w:t xml:space="preserve">            if not line or line.startswith("#"):</w:t>
+        <w:br/>
+        <w:t xml:space="preserve">                continue</w:t>
+        <w:br/>
+        <w:t xml:space="preserve">            parts = line.split("\t")</w:t>
+        <w:br/>
+        <w:t xml:space="preserve">            if len(parts) == 2:</w:t>
+        <w:br/>
+        <w:t xml:space="preserve">                try:</w:t>
+        <w:br/>
+        <w:t xml:space="preserve">                    wn_list.append(float(parts[0]))</w:t>
+        <w:br/>
+        <w:t xml:space="preserve">                    int_list.append(float(parts[1]))</w:t>
+        <w:br/>
+        <w:t xml:space="preserve">                except ValueError:</w:t>
+        <w:br/>
+        <w:t xml:space="preserve">                    continue</w:t>
+        <w:br/>
+        <w:t xml:space="preserve">            elif len(parts) == 3:</w:t>
+        <w:br/>
+        <w:t xml:space="preserve">                try:</w:t>
+        <w:br/>
+        <w:t xml:space="preserve">                    wn_list.append(float(parts[1]))</w:t>
+        <w:br/>
+        <w:t xml:space="preserve">                    int_list.append(float(parts[2]))</w:t>
+        <w:br/>
+        <w:t xml:space="preserve">                except ValueError:</w:t>
+        <w:br/>
+        <w:t xml:space="preserve">                    continue</w:t>
+        <w:br/>
+        <w:br/>
+        <w:t xml:space="preserve">    if not wn_list:</w:t>
+        <w:br/>
+        <w:t xml:space="preserve">        raise ValueError("No numeric data found in CaF2 .txt file.")</w:t>
+        <w:br/>
+        <w:br/>
+        <w:t xml:space="preserve">    wavenumbers = np.array(wn_list, dtype=np.float64)</w:t>
+        <w:br/>
+        <w:t xml:space="preserve">    intensity   = np.array(int_list, dtype=np.float64)</w:t>
+        <w:br/>
+        <w:br/>
+        <w:t xml:space="preserve">    print(f"\n{'─'*55}")</w:t>
+        <w:br/>
+        <w:t xml:space="preserve">    print(f"  CaF2 .txt : {len(wavenumbers)} points")</w:t>
+        <w:br/>
+        <w:t xml:space="preserve">    print(f"  Range     : {wavenumbers[0]:.1f} - {wavenumbers[-1]:.1f} cm-1")</w:t>
+        <w:br/>
+        <w:t xml:space="preserve">    print(f"  Max counts: {intensity.max():.1f}")</w:t>
+        <w:br/>
+        <w:t xml:space="preserve">    print(f"{'─'*55}\n")</w:t>
+        <w:br/>
+        <w:t xml:space="preserve">    return wavenumbers, intensity</w:t>
+        <w:br/>
+        <w:br/>
+        <w:br/>
+        <w:t># ─────────────────────────────────────────────────────────────────────────────</w:t>
+        <w:br/>
+        <w:t>#  1c.  LOAD  .l6s  (single spectrum, LabSpec 6)</w:t>
+        <w:br/>
+        <w:t># ─────────────────────────────────────────────────────────────────────────────</w:t>
+        <w:br/>
         <w:t>def load_l6s(filepath):</w:t>
         <w:br/>
         <w:t xml:space="preserve">    """</w:t>
@@ -3326,9 +3548,198 @@
         <w:br/>
         <w:br/>
         <w:br/>
+        <w:t># ─────────────────────────────────────────────────────────────────────────────</w:t>
+        <w:br/>
+        <w:t>#  MAIN  (txt version — Map 2 and CaF2 exported .txt files)</w:t>
+        <w:br/>
+        <w:t># ─────────────────────────────────────────────────────────────────────────────</w:t>
+        <w:br/>
+        <w:t>def main_txt():</w:t>
+        <w:br/>
+        <w:t xml:space="preserve">    print("\n" + "="*55)</w:t>
+        <w:br/>
+        <w:t xml:space="preserve">    print("  RAMAN MAP ANALYSIS PIPELINE  v5  [TXT MODE]")</w:t>
+        <w:br/>
+        <w:t xml:space="preserve">    print("="*55)</w:t>
+        <w:br/>
+        <w:br/>
+        <w:t xml:space="preserve">    # 1. Load map from .txt</w:t>
+        <w:br/>
+        <w:t xml:space="preserve">    wn, spectra = load_txt_map(FILE_PATH_TXT)</w:t>
+        <w:br/>
+        <w:br/>
+        <w:t xml:space="preserve">    raw_spectra = np.array([spectra[i] for i in range(len(spectra))</w:t>
+        <w:br/>
+        <w:t xml:space="preserve">                            if np.isfinite(spectra[i]).all()</w:t>
+        <w:br/>
+        <w:t xml:space="preserve">                            and spectra[i].max() &lt; 1e6])</w:t>
+        <w:br/>
+        <w:t xml:space="preserve">    print(f"  Valid spectra loaded: {len(raw_spectra)}")</w:t>
+        <w:br/>
+        <w:br/>
+        <w:t xml:space="preserve">    avg_raw = np.mean(raw_spectra, axis=0)</w:t>
+        <w:br/>
+        <w:br/>
+        <w:t xml:space="preserve">    # 2. Spike removal</w:t>
+        <w:br/>
+        <w:t xml:space="preserve">    print("Step 2 - Spike removal ...")</w:t>
+        <w:br/>
+        <w:t xml:space="preserve">    cleaned_spectra = clean_all_spectra(raw_spectra, wn, threshold=5.0)</w:t>
+        <w:br/>
+        <w:t xml:space="preserve">    avg_cleaned = np.mean(cleaned_spectra, axis=0)</w:t>
+        <w:br/>
+        <w:br/>
+        <w:t xml:space="preserve">    # 3. SG smooth -&gt; ALS baseline</w:t>
+        <w:br/>
+        <w:t xml:space="preserve">    avg_sg = savgol_filter(avg_cleaned, window_length=11, polyorder=3)</w:t>
+        <w:br/>
+        <w:br/>
+        <w:t xml:space="preserve">    print("Step 3 - ALS baseline correction ...")</w:t>
+        <w:br/>
+        <w:t xml:space="preserve">    avg_bc_raw, baseline = subtract_baseline(avg_sg)</w:t>
+        <w:br/>
+        <w:br/>
+        <w:t xml:space="preserve">    # 4. Wavelet denoise</w:t>
+        <w:br/>
+        <w:t xml:space="preserve">    print("Step 4 - Wavelet denoising ...")</w:t>
+        <w:br/>
+        <w:t xml:space="preserve">    avg_denoised = wavelet_denoise(avg_bc_raw, wavelet="db8", level=5, mode="soft")</w:t>
+        <w:br/>
+        <w:t xml:space="preserve">    avg_denoised = np.clip(avg_denoised, 0, None)</w:t>
+        <w:br/>
+        <w:br/>
+        <w:t xml:space="preserve">    # 5. Normalise</w:t>
+        <w:br/>
+        <w:t xml:space="preserve">    print("Step 5 - Min-Max normalising ...")</w:t>
+        <w:br/>
+        <w:t xml:space="preserve">    avg_norm = minmax_normalize(avg_denoised)</w:t>
+        <w:br/>
+        <w:br/>
+        <w:t xml:space="preserve">    # 6. SNV</w:t>
+        <w:br/>
+        <w:t xml:space="preserve">    print("Step 6 - SNV ...")</w:t>
+        <w:br/>
+        <w:t xml:space="preserve">    avg_snv = snv(avg_norm)</w:t>
+        <w:br/>
+        <w:br/>
+        <w:t xml:space="preserve">    print(f"\n{'─'*55}")</w:t>
+        <w:br/>
+        <w:t xml:space="preserve">    print(f"  Raw avg      : max={avg_raw.max():.1f}  mean={avg_raw.mean():.1f}")</w:t>
+        <w:br/>
+        <w:t xml:space="preserve">    print(f"  After spikes : max={avg_cleaned.max():.1f}")</w:t>
+        <w:br/>
+        <w:t xml:space="preserve">    print(f"  After baseline: max={avg_bc_raw.max():.1f}")</w:t>
+        <w:br/>
+        <w:t xml:space="preserve">    print(f"  Denoised     : max={avg_denoised.max():.1f}")</w:t>
+        <w:br/>
+        <w:t xml:space="preserve">    print(f"  Normalised   : max={avg_norm.max():.4f}  min={avg_norm.min():.4f}")</w:t>
+        <w:br/>
+        <w:t xml:space="preserve">    print(f"  SNV          : mean={avg_snv.mean():.4f}  std={avg_snv.std():.4f}")</w:t>
+        <w:br/>
+        <w:t xml:space="preserve">    print(f"{'─'*55}\n")</w:t>
+        <w:br/>
+        <w:br/>
+        <w:t xml:space="preserve">    # Derive output folder from the .txt map file location</w:t>
+        <w:br/>
+        <w:t xml:space="preserve">    out_base = os.path.dirname(FILE_PATH_TXT)</w:t>
+        <w:br/>
+        <w:br/>
+        <w:t xml:space="preserve">    # Save CSV (use same folder as input)</w:t>
+        <w:br/>
+        <w:t xml:space="preserve">    csv_path = os.path.join(out_base, "map2_processed_spectrum.csv")</w:t>
+        <w:br/>
+        <w:t xml:space="preserve">    header = "wavenumber_cm-1,raw_avg,spike_removed,baseline_corrected,denoised,normalized,snv"</w:t>
+        <w:br/>
+        <w:t xml:space="preserve">    np.savetxt(csv_path,</w:t>
+        <w:br/>
+        <w:t xml:space="preserve">               np.column_stack([wn, avg_raw, avg_cleaned,</w:t>
+        <w:br/>
+        <w:t xml:space="preserve">                                avg_bc_raw, avg_denoised, avg_norm, avg_snv]),</w:t>
+        <w:br/>
+        <w:t xml:space="preserve">               delimiter=",", header=header, comments="")</w:t>
+        <w:br/>
+        <w:t xml:space="preserve">    print(f"  CSV saved -&gt; {csv_path}")</w:t>
+        <w:br/>
+        <w:br/>
+        <w:t xml:space="preserve">    # Pipeline figure + zoomed figure (reuse existing functions)</w:t>
+        <w:br/>
+        <w:t xml:space="preserve">    print("  Generating pipeline figures ...")</w:t>
+        <w:br/>
+        <w:t xml:space="preserve">    # Temporarily set savefig paths to output folder</w:t>
+        <w:br/>
+        <w:t xml:space="preserve">    old_cwd = os.getcwd()</w:t>
+        <w:br/>
+        <w:t xml:space="preserve">    os.chdir(out_base)</w:t>
+        <w:br/>
+        <w:t xml:space="preserve">    plot_full_pipeline(wn, raw_spectra, cleaned_spectra,</w:t>
+        <w:br/>
+        <w:t xml:space="preserve">                       avg_raw, avg_cleaned, baseline,</w:t>
+        <w:br/>
+        <w:t xml:space="preserve">                       avg_bc_raw, avg_denoised, avg_norm, avg_snv)</w:t>
+        <w:br/>
+        <w:t xml:space="preserve">    plot_final_zoomed(wn, avg_norm, avg_snv)</w:t>
+        <w:br/>
+        <w:t xml:space="preserve">    os.chdir(old_cwd)</w:t>
+        <w:br/>
+        <w:br/>
+        <w:t xml:space="preserve">    # Load CaF2 reference from .txt</w:t>
+        <w:br/>
+        <w:t xml:space="preserve">    print("\n" + "="*55)</w:t>
+        <w:br/>
+        <w:t xml:space="preserve">    print("  CaF2 REFERENCE (.txt)  LOADING")</w:t>
+        <w:br/>
+        <w:t xml:space="preserve">    print("="*55)</w:t>
+        <w:br/>
+        <w:t xml:space="preserve">    wn_c, sp_c = load_txt_caf2(FILE_PATH_CAF2_TXT)</w:t>
+        <w:br/>
+        <w:t xml:space="preserve">    print("  Applying preprocessing pipeline to CaF2 spectrum ...")</w:t>
+        <w:br/>
+        <w:t xml:space="preserve">    snv_c = preprocess_single(wn_c, sp_c)</w:t>
+        <w:br/>
+        <w:br/>
+        <w:t xml:space="preserve">    # SNV comparison overlay</w:t>
+        <w:br/>
+        <w:t xml:space="preserve">    print("  Generating SNV comparison figure ...")</w:t>
+        <w:br/>
+        <w:t xml:space="preserve">    os.chdir(out_base)</w:t>
+        <w:br/>
+        <w:t xml:space="preserve">    plot_comparison(wn, avg_snv, wn_c, snv_c,</w:t>
+        <w:br/>
+        <w:t xml:space="preserve">                    label_map="Map-2 average (AgSiNW, 50xLF, 0.5 s)",</w:t>
+        <w:br/>
+        <w:t xml:space="preserve">                    label_l6s="CaF2 reference (100x, 10 s)")</w:t>
+        <w:br/>
+        <w:t xml:space="preserve">    os.chdir(old_cwd)</w:t>
+        <w:br/>
+        <w:br/>
+        <w:t xml:space="preserve">    # Individual spectra vs CaF2 — zoomed 3-panel figures</w:t>
+        <w:br/>
+        <w:t xml:space="preserve">    print("\n" + "="*55)</w:t>
+        <w:br/>
+        <w:t xml:space="preserve">    print("  INDIVIDUAL SPECTRA vs CaF2  (400-1800 cm-1)")</w:t>
+        <w:br/>
+        <w:t xml:space="preserve">    print("="*55)</w:t>
+        <w:br/>
+        <w:t xml:space="preserve">    out_dir = os.path.join(out_base, "individual_spectra_map2")</w:t>
+        <w:br/>
+        <w:t xml:space="preserve">    print(f"  Output folder: {out_dir}")</w:t>
+        <w:br/>
+        <w:t xml:space="preserve">    plot_all_individual(wn, cleaned_spectra, wn_c, sp_c, out_dir)</w:t>
+        <w:br/>
+        <w:br/>
+        <w:t xml:space="preserve">    print("\n  Done.\n")</w:t>
+        <w:br/>
+        <w:br/>
+        <w:br/>
         <w:t>if __name__ == "__main__":</w:t>
         <w:br/>
-        <w:t xml:space="preserve">    main()</w:t>
+        <w:t xml:space="preserve">    if MODE == "map2":</w:t>
+        <w:br/>
+        <w:t xml:space="preserve">        main_txt()</w:t>
+        <w:br/>
+        <w:t xml:space="preserve">    else:</w:t>
+        <w:br/>
+        <w:t xml:space="preserve">        main()</w:t>
         <w:br/>
       </w:r>
     </w:p>

</xml_diff>